<commit_message>
Propuesta web basada en la cotización: infraestructura, contenido y publicidad
Co-Authored-By: Claude Opus 5.5 <noreply@anthropic.com>
Claude-Session: https://claude.ai/code/session_01GFkSYVqa8d2zDX8Qy6Lwpz
</commit_message>
<xml_diff>
--- a/Presupuesto_2027_Comunicacion_y_Web_Poliforum_Leon.docx
+++ b/Presupuesto_2027_Comunicacion_y_Web_Poliforum_Leon.docx
@@ -378,7 +378,7 @@
                 <w:sz w:val="19"/>
                 <w:szCs w:val="19"/>
               </w:rPr>
-              <w:t xml:space="preserve">ChatGPT Business, Magnific Premium+, Adobe Illustrator, Canva Pro y CapCut Pro</w:t>
+              <w:t xml:space="preserve">A · Servidor, asistente virtual y seguridad (cotización). B · ChatGPT Business, Magnific Premium+, Adobe Illustrator, Canva Pro y CapCut Pro</w:t>
             </w:r>
           </w:p>
         </w:tc>
@@ -406,7 +406,7 @@
                 <w:sz w:val="19"/>
                 <w:szCs w:val="19"/>
               </w:rPr>
-              <w:t xml:space="preserve">$26,962</w:t>
+              <w:t xml:space="preserve">$40,521</w:t>
             </w:r>
           </w:p>
         </w:tc>
@@ -777,7 +777,7 @@
             </w:tcMar>
           </w:tcPr>
           <w:p>
-            <w:hyperlink w:history="1" r:id="rIdkf9otpi63xlgy6bwhpemh">
+            <w:hyperlink w:history="1" r:id="rIdf1opnyi2diaagucarqxnq">
               <w:r>
                 <w:rPr>
                   <w:rFonts w:ascii="Arial" w:cs="Arial" w:eastAsia="Arial" w:hAnsi="Arial"/>
@@ -920,7 +920,7 @@
             </w:tcMar>
           </w:tcPr>
           <w:p>
-            <w:hyperlink w:history="1" r:id="rIdigknkid8pqstq7b2qjubu">
+            <w:hyperlink w:history="1" r:id="rId457kdm2oxan9hxexyymaw">
               <w:r>
                 <w:rPr>
                   <w:rFonts w:ascii="Arial" w:cs="Arial" w:eastAsia="Arial" w:hAnsi="Arial"/>
@@ -1063,7 +1063,7 @@
             </w:tcMar>
           </w:tcPr>
           <w:p>
-            <w:hyperlink w:history="1" r:id="rIdnqchqkfujoahatyy7odiz">
+            <w:hyperlink w:history="1" r:id="rIdvdcyxlh2dvf-7_do401tu">
               <w:r>
                 <w:rPr>
                   <w:rFonts w:ascii="Arial" w:cs="Arial" w:eastAsia="Arial" w:hAnsi="Arial"/>
@@ -3719,7 +3719,7 @@
         </w:numPr>
         <w:spacing w:after="60"/>
       </w:pPr>
-      <w:hyperlink w:history="1" r:id="rIdaovj3wg0eioxnvi3s3jvg">
+      <w:hyperlink w:history="1" r:id="rIdcqj3bx_qetetcrzsl2jam">
         <w:r>
           <w:rPr>
             <w:rFonts w:ascii="Arial" w:cs="Arial" w:eastAsia="Arial" w:hAnsi="Arial"/>
@@ -3741,7 +3741,7 @@
         </w:numPr>
         <w:spacing w:after="60"/>
       </w:pPr>
-      <w:hyperlink w:history="1" r:id="rIdwkcukwyblox5jqlqvncxv">
+      <w:hyperlink w:history="1" r:id="rIdwjrroackbm_gnn14hlzef">
         <w:r>
           <w:rPr>
             <w:rFonts w:ascii="Arial" w:cs="Arial" w:eastAsia="Arial" w:hAnsi="Arial"/>
@@ -3763,7 +3763,7 @@
         </w:numPr>
         <w:spacing w:after="60"/>
       </w:pPr>
-      <w:hyperlink w:history="1" r:id="rId8eympk665mw-_seu5ql4z">
+      <w:hyperlink w:history="1" r:id="rIdcnfptvnca9zwh70shvqjt">
         <w:r>
           <w:rPr>
             <w:rFonts w:ascii="Arial" w:cs="Arial" w:eastAsia="Arial" w:hAnsi="Arial"/>
@@ -3785,7 +3785,7 @@
         </w:numPr>
         <w:spacing w:after="60"/>
       </w:pPr>
-      <w:hyperlink w:history="1" r:id="rIdcemj8vlbdbtjn8wofb7pc">
+      <w:hyperlink w:history="1" r:id="rId2t4tnjibupam9tfmkru_2">
         <w:r>
           <w:rPr>
             <w:rFonts w:ascii="Arial" w:cs="Arial" w:eastAsia="Arial" w:hAnsi="Arial"/>
@@ -3807,7 +3807,7 @@
         </w:numPr>
         <w:spacing w:after="60"/>
       </w:pPr>
-      <w:hyperlink w:history="1" r:id="rIdqykknyooz0gynpvpyfm42">
+      <w:hyperlink w:history="1" r:id="rIdtnx_vkdi-pzipfotu7fic">
         <w:r>
           <w:rPr>
             <w:rFonts w:ascii="Arial" w:cs="Arial" w:eastAsia="Arial" w:hAnsi="Arial"/>
@@ -3829,7 +3829,7 @@
         </w:numPr>
         <w:spacing w:after="60"/>
       </w:pPr>
-      <w:hyperlink w:history="1" r:id="rId66hygz-owqpbcwiz0exwh">
+      <w:hyperlink w:history="1" r:id="rIdfwmyrc04jbselqbkcrlj6">
         <w:r>
           <w:rPr>
             <w:rFonts w:ascii="Arial" w:cs="Arial" w:eastAsia="Arial" w:hAnsi="Arial"/>
@@ -3851,7 +3851,7 @@
         </w:numPr>
         <w:spacing w:after="60"/>
       </w:pPr>
-      <w:hyperlink w:history="1" r:id="rId-varb1vvv42dfii6jdyxu">
+      <w:hyperlink w:history="1" r:id="rIdbvdg0on9c2nd21ztsd2cu">
         <w:r>
           <w:rPr>
             <w:rFonts w:ascii="Arial" w:cs="Arial" w:eastAsia="Arial" w:hAnsi="Arial"/>
@@ -3873,7 +3873,7 @@
         </w:numPr>
         <w:spacing w:after="60"/>
       </w:pPr>
-      <w:hyperlink w:history="1" r:id="rIdb04z6vmomjjwnfadkx3vb">
+      <w:hyperlink w:history="1" r:id="rIdhxyrscjttty92nz2alexh">
         <w:r>
           <w:rPr>
             <w:rFonts w:ascii="Arial" w:cs="Arial" w:eastAsia="Arial" w:hAnsi="Arial"/>
@@ -3936,13 +3936,8 @@
           <w:sz w:val="22"/>
           <w:szCs w:val="22"/>
         </w:rPr>
-        <w:t xml:space="preserve">Producción y mantenimiento del contenido del sitio (año 1): $26,962 MXN con IVA.</w:t>
-      </w:r>
-    </w:p>
-    <w:p>
-      <w:pPr>
-        <w:spacing w:after="120" w:before="0"/>
-      </w:pPr>
+        <w:t xml:space="preserve">Total primer año: $40,521 MXN con IVA. </w:t>
+      </w:r>
       <w:r>
         <w:rPr>
           <w:rFonts w:ascii="Arial" w:cs="Arial" w:eastAsia="Arial" w:hAnsi="Arial"/>
@@ -3950,7 +3945,7 @@
           <w:sz w:val="22"/>
           <w:szCs w:val="22"/>
         </w:rPr>
-        <w:t xml:space="preserve">El diseño y desarrollo del sitio cubren la estructura, pero un sitio que vende necesita imágenes, textos, planos y videos actualizados para cada evento. Con estas licencias, Comunicación y RRPP produce y mantiene ese contenido sin pagar a proveedores externos por cada cambio. Son pagos anuales con descuento, y cada herramienta tiene un entregable concreto en el sitio.</w:t>
+        <w:t xml:space="preserve">A · Infraestructura y asistente $13,559 + B · Contenido del sitio $26,962.</w:t>
       </w:r>
     </w:p>
     <w:p>
@@ -3970,7 +3965,1157 @@
           <w:sz w:val="32"/>
           <w:szCs w:val="32"/>
         </w:rPr>
-        <w:t xml:space="preserve">2.1 Licencias para el sitio</w:t>
+        <w:t xml:space="preserve">2.1 Parte A · Cotización de la web</w:t>
+      </w:r>
+    </w:p>
+    <w:p>
+      <w:pPr>
+        <w:spacing w:after="120" w:before="0"/>
+      </w:pPr>
+      <w:r>
+        <w:rPr>
+          <w:rFonts w:ascii="Arial" w:cs="Arial" w:eastAsia="Arial" w:hAnsi="Arial"/>
+          <w:color w:val="0E3A4E"/>
+          <w:sz w:val="22"/>
+          <w:szCs w:val="22"/>
+        </w:rPr>
+        <w:t xml:space="preserve">Lo que se paga para que la web esté encendida, segura y con un asistente que responde a los clientes las 24 horas. No incluye agencia: la web ya está hecha.</w:t>
+      </w:r>
+    </w:p>
+    <w:tbl>
+      <w:tblPr>
+        <w:tblW w:type="dxa" w:w="9360"/>
+        <w:tblBorders>
+          <w:top w:val="single" w:color="auto" w:sz="4"/>
+          <w:left w:val="single" w:color="auto" w:sz="4"/>
+          <w:bottom w:val="single" w:color="auto" w:sz="4"/>
+          <w:right w:val="single" w:color="auto" w:sz="4"/>
+          <w:insideH w:val="single" w:color="auto" w:sz="4"/>
+          <w:insideV w:val="single" w:color="auto" w:sz="4"/>
+        </w:tblBorders>
+      </w:tblPr>
+      <w:tblGrid>
+        <w:gridCol w:w="2900"/>
+        <w:gridCol w:w="3660"/>
+        <w:gridCol w:w="1200"/>
+        <w:gridCol w:w="1600"/>
+      </w:tblGrid>
+      <w:tr>
+        <w:trPr>
+          <w:tblHeader/>
+        </w:trPr>
+        <w:tc>
+          <w:tcPr>
+            <w:tcW w:type="dxa" w:w="2900"/>
+            <w:shd w:fill="DCE6EB" w:color="auto" w:val="clear"/>
+            <w:tcMar>
+              <w:top w:type="dxa" w:w="70"/>
+              <w:left w:type="dxa" w:w="100"/>
+              <w:bottom w:type="dxa" w:w="70"/>
+              <w:right w:type="dxa" w:w="100"/>
+            </w:tcMar>
+          </w:tcPr>
+          <w:p>
+            <w:pPr>
+              <w:jc w:val="left"/>
+            </w:pPr>
+            <w:r>
+              <w:rPr>
+                <w:rFonts w:ascii="Arial" w:cs="Arial" w:eastAsia="Arial" w:hAnsi="Arial"/>
+                <w:b/>
+                <w:bCs/>
+                <w:color w:val="0E3A4E"/>
+                <w:sz w:val="19"/>
+                <w:szCs w:val="19"/>
+              </w:rPr>
+              <w:t xml:space="preserve">Concepto</w:t>
+            </w:r>
+          </w:p>
+        </w:tc>
+        <w:tc>
+          <w:tcPr>
+            <w:tcW w:type="dxa" w:w="3660"/>
+            <w:shd w:fill="DCE6EB" w:color="auto" w:val="clear"/>
+            <w:tcMar>
+              <w:top w:type="dxa" w:w="70"/>
+              <w:left w:type="dxa" w:w="100"/>
+              <w:bottom w:type="dxa" w:w="70"/>
+              <w:right w:type="dxa" w:w="100"/>
+            </w:tcMar>
+          </w:tcPr>
+          <w:p>
+            <w:pPr>
+              <w:jc w:val="left"/>
+            </w:pPr>
+            <w:r>
+              <w:rPr>
+                <w:rFonts w:ascii="Arial" w:cs="Arial" w:eastAsia="Arial" w:hAnsi="Arial"/>
+                <w:b/>
+                <w:bCs/>
+                <w:color w:val="0E3A4E"/>
+                <w:sz w:val="19"/>
+                <w:szCs w:val="19"/>
+              </w:rPr>
+              <w:t xml:space="preserve">Para qué sirve</w:t>
+            </w:r>
+          </w:p>
+        </w:tc>
+        <w:tc>
+          <w:tcPr>
+            <w:tcW w:type="dxa" w:w="1200"/>
+            <w:shd w:fill="DCE6EB" w:color="auto" w:val="clear"/>
+            <w:tcMar>
+              <w:top w:type="dxa" w:w="70"/>
+              <w:left w:type="dxa" w:w="100"/>
+              <w:bottom w:type="dxa" w:w="70"/>
+              <w:right w:type="dxa" w:w="100"/>
+            </w:tcMar>
+          </w:tcPr>
+          <w:p>
+            <w:pPr>
+              <w:jc w:val="right"/>
+            </w:pPr>
+            <w:r>
+              <w:rPr>
+                <w:rFonts w:ascii="Arial" w:cs="Arial" w:eastAsia="Arial" w:hAnsi="Arial"/>
+                <w:b/>
+                <w:bCs/>
+                <w:color w:val="0E3A4E"/>
+                <w:sz w:val="19"/>
+                <w:szCs w:val="19"/>
+              </w:rPr>
+              <w:t xml:space="preserve">Al mes</w:t>
+            </w:r>
+          </w:p>
+        </w:tc>
+        <w:tc>
+          <w:tcPr>
+            <w:tcW w:type="dxa" w:w="1600"/>
+            <w:shd w:fill="DCE6EB" w:color="auto" w:val="clear"/>
+            <w:tcMar>
+              <w:top w:type="dxa" w:w="70"/>
+              <w:left w:type="dxa" w:w="100"/>
+              <w:bottom w:type="dxa" w:w="70"/>
+              <w:right w:type="dxa" w:w="100"/>
+            </w:tcMar>
+          </w:tcPr>
+          <w:p>
+            <w:pPr>
+              <w:jc w:val="right"/>
+            </w:pPr>
+            <w:r>
+              <w:rPr>
+                <w:rFonts w:ascii="Arial" w:cs="Arial" w:eastAsia="Arial" w:hAnsi="Arial"/>
+                <w:b/>
+                <w:bCs/>
+                <w:color w:val="0E3A4E"/>
+                <w:sz w:val="19"/>
+                <w:szCs w:val="19"/>
+              </w:rPr>
+              <w:t xml:space="preserve">Al año</w:t>
+            </w:r>
+          </w:p>
+        </w:tc>
+      </w:tr>
+      <w:tr>
+        <w:trPr>
+          <w:tblHeader w:val="false"/>
+        </w:trPr>
+        <w:tc>
+          <w:tcPr>
+            <w:tcW w:type="dxa" w:w="2900"/>
+            <w:shd w:fill="F6F9FA" w:color="auto" w:val="clear"/>
+            <w:tcMar>
+              <w:top w:type="dxa" w:w="70"/>
+              <w:left w:type="dxa" w:w="100"/>
+              <w:bottom w:type="dxa" w:w="70"/>
+              <w:right w:type="dxa" w:w="100"/>
+            </w:tcMar>
+          </w:tcPr>
+          <w:p>
+            <w:pPr>
+              <w:jc w:val="left"/>
+            </w:pPr>
+            <w:r>
+              <w:rPr>
+                <w:rFonts w:ascii="Arial" w:cs="Arial" w:eastAsia="Arial" w:hAnsi="Arial"/>
+                <w:b w:val="false"/>
+                <w:bCs w:val="false"/>
+                <w:color w:val="0E3A4E"/>
+                <w:sz w:val="19"/>
+                <w:szCs w:val="19"/>
+              </w:rPr>
+              <w:t xml:space="preserve">Servidor y respaldos · DigitalOcean</w:t>
+            </w:r>
+          </w:p>
+        </w:tc>
+        <w:tc>
+          <w:tcPr>
+            <w:tcW w:type="dxa" w:w="3660"/>
+            <w:shd w:fill="F6F9FA" w:color="auto" w:val="clear"/>
+            <w:tcMar>
+              <w:top w:type="dxa" w:w="70"/>
+              <w:left w:type="dxa" w:w="100"/>
+              <w:bottom w:type="dxa" w:w="70"/>
+              <w:right w:type="dxa" w:w="100"/>
+            </w:tcMar>
+          </w:tcPr>
+          <w:p>
+            <w:pPr>
+              <w:jc w:val="left"/>
+            </w:pPr>
+            <w:r>
+              <w:rPr>
+                <w:rFonts w:ascii="Arial" w:cs="Arial" w:eastAsia="Arial" w:hAnsi="Arial"/>
+                <w:b w:val="false"/>
+                <w:bCs w:val="false"/>
+                <w:color w:val="0E3A4E"/>
+                <w:sz w:val="19"/>
+                <w:szCs w:val="19"/>
+              </w:rPr>
+              <w:t xml:space="preserve">Donde vive la web, 24 horas, con respaldo diario</w:t>
+            </w:r>
+          </w:p>
+        </w:tc>
+        <w:tc>
+          <w:tcPr>
+            <w:tcW w:type="dxa" w:w="1200"/>
+            <w:shd w:fill="F6F9FA" w:color="auto" w:val="clear"/>
+            <w:tcMar>
+              <w:top w:type="dxa" w:w="70"/>
+              <w:left w:type="dxa" w:w="100"/>
+              <w:bottom w:type="dxa" w:w="70"/>
+              <w:right w:type="dxa" w:w="100"/>
+            </w:tcMar>
+          </w:tcPr>
+          <w:p>
+            <w:pPr>
+              <w:jc w:val="right"/>
+            </w:pPr>
+            <w:r>
+              <w:rPr>
+                <w:rFonts w:ascii="Arial" w:cs="Arial" w:eastAsia="Arial" w:hAnsi="Arial"/>
+                <w:b w:val="false"/>
+                <w:bCs w:val="false"/>
+                <w:color w:val="0E3A4E"/>
+                <w:sz w:val="19"/>
+                <w:szCs w:val="19"/>
+              </w:rPr>
+              <w:t xml:space="preserve">$284</w:t>
+            </w:r>
+          </w:p>
+        </w:tc>
+        <w:tc>
+          <w:tcPr>
+            <w:tcW w:type="dxa" w:w="1600"/>
+            <w:shd w:fill="F6F9FA" w:color="auto" w:val="clear"/>
+            <w:tcMar>
+              <w:top w:type="dxa" w:w="70"/>
+              <w:left w:type="dxa" w:w="100"/>
+              <w:bottom w:type="dxa" w:w="70"/>
+              <w:right w:type="dxa" w:w="100"/>
+            </w:tcMar>
+          </w:tcPr>
+          <w:p>
+            <w:pPr>
+              <w:jc w:val="right"/>
+            </w:pPr>
+            <w:r>
+              <w:rPr>
+                <w:rFonts w:ascii="Arial" w:cs="Arial" w:eastAsia="Arial" w:hAnsi="Arial"/>
+                <w:b w:val="false"/>
+                <w:bCs w:val="false"/>
+                <w:color w:val="0E3A4E"/>
+                <w:sz w:val="19"/>
+                <w:szCs w:val="19"/>
+              </w:rPr>
+              <w:t xml:space="preserve">$3,407</w:t>
+            </w:r>
+          </w:p>
+        </w:tc>
+      </w:tr>
+      <w:tr>
+        <w:trPr>
+          <w:tblHeader w:val="false"/>
+        </w:trPr>
+        <w:tc>
+          <w:tcPr>
+            <w:tcW w:type="dxa" w:w="2900"/>
+            <w:shd w:fill="FFFFFF" w:color="auto" w:val="clear"/>
+            <w:tcMar>
+              <w:top w:type="dxa" w:w="70"/>
+              <w:left w:type="dxa" w:w="100"/>
+              <w:bottom w:type="dxa" w:w="70"/>
+              <w:right w:type="dxa" w:w="100"/>
+            </w:tcMar>
+          </w:tcPr>
+          <w:p>
+            <w:pPr>
+              <w:jc w:val="left"/>
+            </w:pPr>
+            <w:r>
+              <w:rPr>
+                <w:rFonts w:ascii="Arial" w:cs="Arial" w:eastAsia="Arial" w:hAnsi="Arial"/>
+                <w:b w:val="false"/>
+                <w:bCs w:val="false"/>
+                <w:color w:val="0E3A4E"/>
+                <w:sz w:val="19"/>
+                <w:szCs w:val="19"/>
+              </w:rPr>
+              <w:t xml:space="preserve">Asistente virtual · Claude de Anthropic</w:t>
+            </w:r>
+          </w:p>
+        </w:tc>
+        <w:tc>
+          <w:tcPr>
+            <w:tcW w:type="dxa" w:w="3660"/>
+            <w:shd w:fill="FFFFFF" w:color="auto" w:val="clear"/>
+            <w:tcMar>
+              <w:top w:type="dxa" w:w="70"/>
+              <w:left w:type="dxa" w:w="100"/>
+              <w:bottom w:type="dxa" w:w="70"/>
+              <w:right w:type="dxa" w:w="100"/>
+            </w:tcMar>
+          </w:tcPr>
+          <w:p>
+            <w:pPr>
+              <w:jc w:val="left"/>
+            </w:pPr>
+            <w:r>
+              <w:rPr>
+                <w:rFonts w:ascii="Arial" w:cs="Arial" w:eastAsia="Arial" w:hAnsi="Arial"/>
+                <w:b w:val="false"/>
+                <w:bCs w:val="false"/>
+                <w:color w:val="0E3A4E"/>
+                <w:sz w:val="19"/>
+                <w:szCs w:val="19"/>
+              </w:rPr>
+              <w:t xml:space="preserve">Chat que responde a los clientes; con límite de gasto mensual</w:t>
+            </w:r>
+          </w:p>
+        </w:tc>
+        <w:tc>
+          <w:tcPr>
+            <w:tcW w:type="dxa" w:w="1200"/>
+            <w:shd w:fill="FFFFFF" w:color="auto" w:val="clear"/>
+            <w:tcMar>
+              <w:top w:type="dxa" w:w="70"/>
+              <w:left w:type="dxa" w:w="100"/>
+              <w:bottom w:type="dxa" w:w="70"/>
+              <w:right w:type="dxa" w:w="100"/>
+            </w:tcMar>
+          </w:tcPr>
+          <w:p>
+            <w:pPr>
+              <w:jc w:val="right"/>
+            </w:pPr>
+            <w:r>
+              <w:rPr>
+                <w:rFonts w:ascii="Arial" w:cs="Arial" w:eastAsia="Arial" w:hAnsi="Arial"/>
+                <w:b w:val="false"/>
+                <w:bCs w:val="false"/>
+                <w:color w:val="0E3A4E"/>
+                <w:sz w:val="19"/>
+                <w:szCs w:val="19"/>
+              </w:rPr>
+              <w:t xml:space="preserve">$251</w:t>
+            </w:r>
+          </w:p>
+        </w:tc>
+        <w:tc>
+          <w:tcPr>
+            <w:tcW w:type="dxa" w:w="1600"/>
+            <w:shd w:fill="FFFFFF" w:color="auto" w:val="clear"/>
+            <w:tcMar>
+              <w:top w:type="dxa" w:w="70"/>
+              <w:left w:type="dxa" w:w="100"/>
+              <w:bottom w:type="dxa" w:w="70"/>
+              <w:right w:type="dxa" w:w="100"/>
+            </w:tcMar>
+          </w:tcPr>
+          <w:p>
+            <w:pPr>
+              <w:jc w:val="right"/>
+            </w:pPr>
+            <w:r>
+              <w:rPr>
+                <w:rFonts w:ascii="Arial" w:cs="Arial" w:eastAsia="Arial" w:hAnsi="Arial"/>
+                <w:b w:val="false"/>
+                <w:bCs w:val="false"/>
+                <w:color w:val="0E3A4E"/>
+                <w:sz w:val="19"/>
+                <w:szCs w:val="19"/>
+              </w:rPr>
+              <w:t xml:space="preserve">$3,011</w:t>
+            </w:r>
+          </w:p>
+        </w:tc>
+      </w:tr>
+      <w:tr>
+        <w:trPr>
+          <w:tblHeader w:val="false"/>
+        </w:trPr>
+        <w:tc>
+          <w:tcPr>
+            <w:tcW w:type="dxa" w:w="2900"/>
+            <w:shd w:fill="F6F9FA" w:color="auto" w:val="clear"/>
+            <w:tcMar>
+              <w:top w:type="dxa" w:w="70"/>
+              <w:left w:type="dxa" w:w="100"/>
+              <w:bottom w:type="dxa" w:w="70"/>
+              <w:right w:type="dxa" w:w="100"/>
+            </w:tcMar>
+          </w:tcPr>
+          <w:p>
+            <w:pPr>
+              <w:jc w:val="left"/>
+            </w:pPr>
+            <w:r>
+              <w:rPr>
+                <w:rFonts w:ascii="Arial" w:cs="Arial" w:eastAsia="Arial" w:hAnsi="Arial"/>
+                <w:b w:val="false"/>
+                <w:bCs w:val="false"/>
+                <w:color w:val="0E3A4E"/>
+                <w:sz w:val="19"/>
+                <w:szCs w:val="19"/>
+              </w:rPr>
+              <w:t xml:space="preserve">Gestor de contraseñas · Bitwarden Teams (3)</w:t>
+            </w:r>
+          </w:p>
+        </w:tc>
+        <w:tc>
+          <w:tcPr>
+            <w:tcW w:type="dxa" w:w="3660"/>
+            <w:shd w:fill="F6F9FA" w:color="auto" w:val="clear"/>
+            <w:tcMar>
+              <w:top w:type="dxa" w:w="70"/>
+              <w:left w:type="dxa" w:w="100"/>
+              <w:bottom w:type="dxa" w:w="70"/>
+              <w:right w:type="dxa" w:w="100"/>
+            </w:tcMar>
+          </w:tcPr>
+          <w:p>
+            <w:pPr>
+              <w:jc w:val="left"/>
+            </w:pPr>
+            <w:r>
+              <w:rPr>
+                <w:rFonts w:ascii="Arial" w:cs="Arial" w:eastAsia="Arial" w:hAnsi="Arial"/>
+                <w:b w:val="false"/>
+                <w:bCs w:val="false"/>
+                <w:color w:val="0E3A4E"/>
+                <w:sz w:val="19"/>
+                <w:szCs w:val="19"/>
+              </w:rPr>
+              <w:t xml:space="preserve">Guarda las claves del servidor, dominio y servicios</w:t>
+            </w:r>
+          </w:p>
+        </w:tc>
+        <w:tc>
+          <w:tcPr>
+            <w:tcW w:type="dxa" w:w="1200"/>
+            <w:shd w:fill="F6F9FA" w:color="auto" w:val="clear"/>
+            <w:tcMar>
+              <w:top w:type="dxa" w:w="70"/>
+              <w:left w:type="dxa" w:w="100"/>
+              <w:bottom w:type="dxa" w:w="70"/>
+              <w:right w:type="dxa" w:w="100"/>
+            </w:tcMar>
+          </w:tcPr>
+          <w:p>
+            <w:pPr>
+              <w:jc w:val="right"/>
+            </w:pPr>
+            <w:r>
+              <w:rPr>
+                <w:rFonts w:ascii="Arial" w:cs="Arial" w:eastAsia="Arial" w:hAnsi="Arial"/>
+                <w:b w:val="false"/>
+                <w:bCs w:val="false"/>
+                <w:color w:val="0E3A4E"/>
+                <w:sz w:val="19"/>
+                <w:szCs w:val="19"/>
+              </w:rPr>
+              <w:t xml:space="preserve">$218</w:t>
+            </w:r>
+          </w:p>
+        </w:tc>
+        <w:tc>
+          <w:tcPr>
+            <w:tcW w:type="dxa" w:w="1600"/>
+            <w:shd w:fill="F6F9FA" w:color="auto" w:val="clear"/>
+            <w:tcMar>
+              <w:top w:type="dxa" w:w="70"/>
+              <w:left w:type="dxa" w:w="100"/>
+              <w:bottom w:type="dxa" w:w="70"/>
+              <w:right w:type="dxa" w:w="100"/>
+            </w:tcMar>
+          </w:tcPr>
+          <w:p>
+            <w:pPr>
+              <w:jc w:val="right"/>
+            </w:pPr>
+            <w:r>
+              <w:rPr>
+                <w:rFonts w:ascii="Arial" w:cs="Arial" w:eastAsia="Arial" w:hAnsi="Arial"/>
+                <w:b w:val="false"/>
+                <w:bCs w:val="false"/>
+                <w:color w:val="0E3A4E"/>
+                <w:sz w:val="19"/>
+                <w:szCs w:val="19"/>
+              </w:rPr>
+              <w:t xml:space="preserve">$2,621</w:t>
+            </w:r>
+          </w:p>
+        </w:tc>
+      </w:tr>
+      <w:tr>
+        <w:trPr>
+          <w:tblHeader w:val="false"/>
+        </w:trPr>
+        <w:tc>
+          <w:tcPr>
+            <w:tcW w:type="dxa" w:w="2900"/>
+            <w:shd w:fill="FFFFFF" w:color="auto" w:val="clear"/>
+            <w:tcMar>
+              <w:top w:type="dxa" w:w="70"/>
+              <w:left w:type="dxa" w:w="100"/>
+              <w:bottom w:type="dxa" w:w="70"/>
+              <w:right w:type="dxa" w:w="100"/>
+            </w:tcMar>
+          </w:tcPr>
+          <w:p>
+            <w:pPr>
+              <w:jc w:val="left"/>
+            </w:pPr>
+            <w:r>
+              <w:rPr>
+                <w:rFonts w:ascii="Arial" w:cs="Arial" w:eastAsia="Arial" w:hAnsi="Arial"/>
+                <w:b w:val="false"/>
+                <w:bCs w:val="false"/>
+                <w:color w:val="0E3A4E"/>
+                <w:sz w:val="19"/>
+                <w:szCs w:val="19"/>
+              </w:rPr>
+              <w:t xml:space="preserve">Dominio poliforumleon.com.mx</w:t>
+            </w:r>
+          </w:p>
+        </w:tc>
+        <w:tc>
+          <w:tcPr>
+            <w:tcW w:type="dxa" w:w="3660"/>
+            <w:shd w:fill="FFFFFF" w:color="auto" w:val="clear"/>
+            <w:tcMar>
+              <w:top w:type="dxa" w:w="70"/>
+              <w:left w:type="dxa" w:w="100"/>
+              <w:bottom w:type="dxa" w:w="70"/>
+              <w:right w:type="dxa" w:w="100"/>
+            </w:tcMar>
+          </w:tcPr>
+          <w:p>
+            <w:pPr>
+              <w:jc w:val="left"/>
+            </w:pPr>
+            <w:r>
+              <w:rPr>
+                <w:rFonts w:ascii="Arial" w:cs="Arial" w:eastAsia="Arial" w:hAnsi="Arial"/>
+                <w:b w:val="false"/>
+                <w:bCs w:val="false"/>
+                <w:color w:val="0E3A4E"/>
+                <w:sz w:val="19"/>
+                <w:szCs w:val="19"/>
+              </w:rPr>
+              <w:t xml:space="preserve">Ya se paga hoy</w:t>
+            </w:r>
+          </w:p>
+        </w:tc>
+        <w:tc>
+          <w:tcPr>
+            <w:tcW w:type="dxa" w:w="1200"/>
+            <w:shd w:fill="FFFFFF" w:color="auto" w:val="clear"/>
+            <w:tcMar>
+              <w:top w:type="dxa" w:w="70"/>
+              <w:left w:type="dxa" w:w="100"/>
+              <w:bottom w:type="dxa" w:w="70"/>
+              <w:right w:type="dxa" w:w="100"/>
+            </w:tcMar>
+          </w:tcPr>
+          <w:p>
+            <w:pPr>
+              <w:jc w:val="right"/>
+            </w:pPr>
+            <w:r>
+              <w:rPr>
+                <w:rFonts w:ascii="Arial" w:cs="Arial" w:eastAsia="Arial" w:hAnsi="Arial"/>
+                <w:b w:val="false"/>
+                <w:bCs w:val="false"/>
+                <w:color w:val="0E3A4E"/>
+                <w:sz w:val="19"/>
+                <w:szCs w:val="19"/>
+              </w:rPr>
+              <w:t xml:space="preserve">$46</w:t>
+            </w:r>
+          </w:p>
+        </w:tc>
+        <w:tc>
+          <w:tcPr>
+            <w:tcW w:type="dxa" w:w="1600"/>
+            <w:shd w:fill="FFFFFF" w:color="auto" w:val="clear"/>
+            <w:tcMar>
+              <w:top w:type="dxa" w:w="70"/>
+              <w:left w:type="dxa" w:w="100"/>
+              <w:bottom w:type="dxa" w:w="70"/>
+              <w:right w:type="dxa" w:w="100"/>
+            </w:tcMar>
+          </w:tcPr>
+          <w:p>
+            <w:pPr>
+              <w:jc w:val="right"/>
+            </w:pPr>
+            <w:r>
+              <w:rPr>
+                <w:rFonts w:ascii="Arial" w:cs="Arial" w:eastAsia="Arial" w:hAnsi="Arial"/>
+                <w:b w:val="false"/>
+                <w:bCs w:val="false"/>
+                <w:color w:val="0E3A4E"/>
+                <w:sz w:val="19"/>
+                <w:szCs w:val="19"/>
+              </w:rPr>
+              <w:t xml:space="preserve">$550</w:t>
+            </w:r>
+          </w:p>
+        </w:tc>
+      </w:tr>
+      <w:tr>
+        <w:trPr>
+          <w:tblHeader w:val="false"/>
+        </w:trPr>
+        <w:tc>
+          <w:tcPr>
+            <w:tcW w:type="dxa" w:w="2900"/>
+            <w:shd w:fill="F6F9FA" w:color="auto" w:val="clear"/>
+            <w:tcMar>
+              <w:top w:type="dxa" w:w="70"/>
+              <w:left w:type="dxa" w:w="100"/>
+              <w:bottom w:type="dxa" w:w="70"/>
+              <w:right w:type="dxa" w:w="100"/>
+            </w:tcMar>
+          </w:tcPr>
+          <w:p>
+            <w:pPr>
+              <w:jc w:val="left"/>
+            </w:pPr>
+            <w:r>
+              <w:rPr>
+                <w:rFonts w:ascii="Arial" w:cs="Arial" w:eastAsia="Arial" w:hAnsi="Arial"/>
+                <w:b w:val="false"/>
+                <w:bCs w:val="false"/>
+                <w:color w:val="0E3A4E"/>
+                <w:sz w:val="19"/>
+                <w:szCs w:val="19"/>
+              </w:rPr>
+              <w:t xml:space="preserve">Cloudflare, avisos, monitoreo y copia externa</w:t>
+            </w:r>
+          </w:p>
+        </w:tc>
+        <w:tc>
+          <w:tcPr>
+            <w:tcW w:type="dxa" w:w="3660"/>
+            <w:shd w:fill="F6F9FA" w:color="auto" w:val="clear"/>
+            <w:tcMar>
+              <w:top w:type="dxa" w:w="70"/>
+              <w:left w:type="dxa" w:w="100"/>
+              <w:bottom w:type="dxa" w:w="70"/>
+              <w:right w:type="dxa" w:w="100"/>
+            </w:tcMar>
+          </w:tcPr>
+          <w:p>
+            <w:pPr>
+              <w:jc w:val="left"/>
+            </w:pPr>
+            <w:r>
+              <w:rPr>
+                <w:rFonts w:ascii="Arial" w:cs="Arial" w:eastAsia="Arial" w:hAnsi="Arial"/>
+                <w:b w:val="false"/>
+                <w:bCs w:val="false"/>
+                <w:color w:val="0E3A4E"/>
+                <w:sz w:val="19"/>
+                <w:szCs w:val="19"/>
+              </w:rPr>
+              <w:t xml:space="preserve">Protección, aviso al ejecutivo, aviso si se cae, respaldo fuera (gratis)</w:t>
+            </w:r>
+          </w:p>
+        </w:tc>
+        <w:tc>
+          <w:tcPr>
+            <w:tcW w:type="dxa" w:w="1200"/>
+            <w:shd w:fill="F6F9FA" w:color="auto" w:val="clear"/>
+            <w:tcMar>
+              <w:top w:type="dxa" w:w="70"/>
+              <w:left w:type="dxa" w:w="100"/>
+              <w:bottom w:type="dxa" w:w="70"/>
+              <w:right w:type="dxa" w:w="100"/>
+            </w:tcMar>
+          </w:tcPr>
+          <w:p>
+            <w:pPr>
+              <w:jc w:val="right"/>
+            </w:pPr>
+            <w:r>
+              <w:rPr>
+                <w:rFonts w:ascii="Arial" w:cs="Arial" w:eastAsia="Arial" w:hAnsi="Arial"/>
+                <w:b w:val="false"/>
+                <w:bCs w:val="false"/>
+                <w:color w:val="0E3A4E"/>
+                <w:sz w:val="19"/>
+                <w:szCs w:val="19"/>
+              </w:rPr>
+              <w:t xml:space="preserve">$0</w:t>
+            </w:r>
+          </w:p>
+        </w:tc>
+        <w:tc>
+          <w:tcPr>
+            <w:tcW w:type="dxa" w:w="1600"/>
+            <w:shd w:fill="F6F9FA" w:color="auto" w:val="clear"/>
+            <w:tcMar>
+              <w:top w:type="dxa" w:w="70"/>
+              <w:left w:type="dxa" w:w="100"/>
+              <w:bottom w:type="dxa" w:w="70"/>
+              <w:right w:type="dxa" w:w="100"/>
+            </w:tcMar>
+          </w:tcPr>
+          <w:p>
+            <w:pPr>
+              <w:jc w:val="right"/>
+            </w:pPr>
+            <w:r>
+              <w:rPr>
+                <w:rFonts w:ascii="Arial" w:cs="Arial" w:eastAsia="Arial" w:hAnsi="Arial"/>
+                <w:b w:val="false"/>
+                <w:bCs w:val="false"/>
+                <w:color w:val="0E3A4E"/>
+                <w:sz w:val="19"/>
+                <w:szCs w:val="19"/>
+              </w:rPr>
+              <w:t xml:space="preserve">$0</w:t>
+            </w:r>
+          </w:p>
+        </w:tc>
+      </w:tr>
+      <w:tr>
+        <w:trPr>
+          <w:tblHeader w:val="false"/>
+        </w:trPr>
+        <w:tc>
+          <w:tcPr>
+            <w:tcW w:type="dxa" w:w="2900"/>
+            <w:shd w:fill="FFFFFF" w:color="auto" w:val="clear"/>
+            <w:tcMar>
+              <w:top w:type="dxa" w:w="70"/>
+              <w:left w:type="dxa" w:w="100"/>
+              <w:bottom w:type="dxa" w:w="70"/>
+              <w:right w:type="dxa" w:w="100"/>
+            </w:tcMar>
+          </w:tcPr>
+          <w:p>
+            <w:pPr>
+              <w:jc w:val="left"/>
+            </w:pPr>
+            <w:r>
+              <w:rPr>
+                <w:rFonts w:ascii="Arial" w:cs="Arial" w:eastAsia="Arial" w:hAnsi="Arial"/>
+                <w:b w:val="false"/>
+                <w:bCs w:val="false"/>
+                <w:color w:val="0E3A4E"/>
+                <w:sz w:val="19"/>
+                <w:szCs w:val="19"/>
+              </w:rPr>
+              <w:t xml:space="preserve">Total recurrente</w:t>
+            </w:r>
+          </w:p>
+        </w:tc>
+        <w:tc>
+          <w:tcPr>
+            <w:tcW w:type="dxa" w:w="3660"/>
+            <w:shd w:fill="FFFFFF" w:color="auto" w:val="clear"/>
+            <w:tcMar>
+              <w:top w:type="dxa" w:w="70"/>
+              <w:left w:type="dxa" w:w="100"/>
+              <w:bottom w:type="dxa" w:w="70"/>
+              <w:right w:type="dxa" w:w="100"/>
+            </w:tcMar>
+          </w:tcPr>
+          <w:p>
+            <w:pPr>
+              <w:jc w:val="left"/>
+            </w:pPr>
+            <w:r>
+              <w:rPr>
+                <w:rFonts w:ascii="Arial" w:cs="Arial" w:eastAsia="Arial" w:hAnsi="Arial"/>
+                <w:b w:val="false"/>
+                <w:bCs w:val="false"/>
+                <w:color w:val="0E3A4E"/>
+                <w:sz w:val="19"/>
+                <w:szCs w:val="19"/>
+              </w:rPr>
+              <w:t xml:space="preserve"/>
+            </w:r>
+          </w:p>
+        </w:tc>
+        <w:tc>
+          <w:tcPr>
+            <w:tcW w:type="dxa" w:w="1200"/>
+            <w:shd w:fill="FFFFFF" w:color="auto" w:val="clear"/>
+            <w:tcMar>
+              <w:top w:type="dxa" w:w="70"/>
+              <w:left w:type="dxa" w:w="100"/>
+              <w:bottom w:type="dxa" w:w="70"/>
+              <w:right w:type="dxa" w:w="100"/>
+            </w:tcMar>
+          </w:tcPr>
+          <w:p>
+            <w:pPr>
+              <w:jc w:val="right"/>
+            </w:pPr>
+            <w:r>
+              <w:rPr>
+                <w:rFonts w:ascii="Arial" w:cs="Arial" w:eastAsia="Arial" w:hAnsi="Arial"/>
+                <w:b w:val="false"/>
+                <w:bCs w:val="false"/>
+                <w:color w:val="0E3A4E"/>
+                <w:sz w:val="19"/>
+                <w:szCs w:val="19"/>
+              </w:rPr>
+              <w:t xml:space="preserve">$799</w:t>
+            </w:r>
+          </w:p>
+        </w:tc>
+        <w:tc>
+          <w:tcPr>
+            <w:tcW w:type="dxa" w:w="1600"/>
+            <w:shd w:fill="FFFFFF" w:color="auto" w:val="clear"/>
+            <w:tcMar>
+              <w:top w:type="dxa" w:w="70"/>
+              <w:left w:type="dxa" w:w="100"/>
+              <w:bottom w:type="dxa" w:w="70"/>
+              <w:right w:type="dxa" w:w="100"/>
+            </w:tcMar>
+          </w:tcPr>
+          <w:p>
+            <w:pPr>
+              <w:jc w:val="right"/>
+            </w:pPr>
+            <w:r>
+              <w:rPr>
+                <w:rFonts w:ascii="Arial" w:cs="Arial" w:eastAsia="Arial" w:hAnsi="Arial"/>
+                <w:b w:val="false"/>
+                <w:bCs w:val="false"/>
+                <w:color w:val="0E3A4E"/>
+                <w:sz w:val="19"/>
+                <w:szCs w:val="19"/>
+              </w:rPr>
+              <w:t xml:space="preserve">$9,589</w:t>
+            </w:r>
+          </w:p>
+        </w:tc>
+      </w:tr>
+      <w:tr>
+        <w:trPr>
+          <w:tblHeader w:val="false"/>
+        </w:trPr>
+        <w:tc>
+          <w:tcPr>
+            <w:tcW w:type="dxa" w:w="2900"/>
+            <w:shd w:fill="F6F9FA" w:color="auto" w:val="clear"/>
+            <w:tcMar>
+              <w:top w:type="dxa" w:w="70"/>
+              <w:left w:type="dxa" w:w="100"/>
+              <w:bottom w:type="dxa" w:w="70"/>
+              <w:right w:type="dxa" w:w="100"/>
+            </w:tcMar>
+          </w:tcPr>
+          <w:p>
+            <w:pPr>
+              <w:jc w:val="left"/>
+            </w:pPr>
+            <w:r>
+              <w:rPr>
+                <w:rFonts w:ascii="Arial" w:cs="Arial" w:eastAsia="Arial" w:hAnsi="Arial"/>
+                <w:b w:val="false"/>
+                <w:bCs w:val="false"/>
+                <w:color w:val="0E3A4E"/>
+                <w:sz w:val="19"/>
+                <w:szCs w:val="19"/>
+              </w:rPr>
+              <w:t xml:space="preserve">4 llaves físicas Yubico (un solo pago)</w:t>
+            </w:r>
+          </w:p>
+        </w:tc>
+        <w:tc>
+          <w:tcPr>
+            <w:tcW w:type="dxa" w:w="3660"/>
+            <w:shd w:fill="F6F9FA" w:color="auto" w:val="clear"/>
+            <w:tcMar>
+              <w:top w:type="dxa" w:w="70"/>
+              <w:left w:type="dxa" w:w="100"/>
+              <w:bottom w:type="dxa" w:w="70"/>
+              <w:right w:type="dxa" w:w="100"/>
+            </w:tcMar>
+          </w:tcPr>
+          <w:p>
+            <w:pPr>
+              <w:jc w:val="left"/>
+            </w:pPr>
+            <w:r>
+              <w:rPr>
+                <w:rFonts w:ascii="Arial" w:cs="Arial" w:eastAsia="Arial" w:hAnsi="Arial"/>
+                <w:b w:val="false"/>
+                <w:bCs w:val="false"/>
+                <w:color w:val="0E3A4E"/>
+                <w:sz w:val="19"/>
+                <w:szCs w:val="19"/>
+              </w:rPr>
+              <w:t xml:space="preserve">Nadie entra a las cuentas aunque roben la contraseña</w:t>
+            </w:r>
+          </w:p>
+        </w:tc>
+        <w:tc>
+          <w:tcPr>
+            <w:tcW w:type="dxa" w:w="1200"/>
+            <w:shd w:fill="F6F9FA" w:color="auto" w:val="clear"/>
+            <w:tcMar>
+              <w:top w:type="dxa" w:w="70"/>
+              <w:left w:type="dxa" w:w="100"/>
+              <w:bottom w:type="dxa" w:w="70"/>
+              <w:right w:type="dxa" w:w="100"/>
+            </w:tcMar>
+          </w:tcPr>
+          <w:p>
+            <w:pPr>
+              <w:jc w:val="right"/>
+            </w:pPr>
+            <w:r>
+              <w:rPr>
+                <w:rFonts w:ascii="Arial" w:cs="Arial" w:eastAsia="Arial" w:hAnsi="Arial"/>
+                <w:b w:val="false"/>
+                <w:bCs w:val="false"/>
+                <w:color w:val="0E3A4E"/>
+                <w:sz w:val="19"/>
+                <w:szCs w:val="19"/>
+              </w:rPr>
+              <w:t xml:space="preserve"/>
+            </w:r>
+          </w:p>
+        </w:tc>
+        <w:tc>
+          <w:tcPr>
+            <w:tcW w:type="dxa" w:w="1600"/>
+            <w:shd w:fill="F6F9FA" w:color="auto" w:val="clear"/>
+            <w:tcMar>
+              <w:top w:type="dxa" w:w="70"/>
+              <w:left w:type="dxa" w:w="100"/>
+              <w:bottom w:type="dxa" w:w="70"/>
+              <w:right w:type="dxa" w:w="100"/>
+            </w:tcMar>
+          </w:tcPr>
+          <w:p>
+            <w:pPr>
+              <w:jc w:val="right"/>
+            </w:pPr>
+            <w:r>
+              <w:rPr>
+                <w:rFonts w:ascii="Arial" w:cs="Arial" w:eastAsia="Arial" w:hAnsi="Arial"/>
+                <w:b w:val="false"/>
+                <w:bCs w:val="false"/>
+                <w:color w:val="0E3A4E"/>
+                <w:sz w:val="19"/>
+                <w:szCs w:val="19"/>
+              </w:rPr>
+              <w:t xml:space="preserve">$2,100</w:t>
+            </w:r>
+          </w:p>
+        </w:tc>
+      </w:tr>
+      <w:tr>
+        <w:trPr>
+          <w:tblHeader w:val="false"/>
+        </w:trPr>
+        <w:tc>
+          <w:tcPr>
+            <w:tcW w:type="dxa" w:w="2900"/>
+            <w:shd w:fill="175772" w:color="auto" w:val="clear"/>
+            <w:tcMar>
+              <w:top w:type="dxa" w:w="70"/>
+              <w:left w:type="dxa" w:w="100"/>
+              <w:bottom w:type="dxa" w:w="70"/>
+              <w:right w:type="dxa" w:w="100"/>
+            </w:tcMar>
+          </w:tcPr>
+          <w:p>
+            <w:pPr>
+              <w:jc w:val="left"/>
+            </w:pPr>
+            <w:r>
+              <w:rPr>
+                <w:rFonts w:ascii="Arial" w:cs="Arial" w:eastAsia="Arial" w:hAnsi="Arial"/>
+                <w:b/>
+                <w:bCs/>
+                <w:color w:val="FFFFFF"/>
+                <w:sz w:val="19"/>
+                <w:szCs w:val="19"/>
+              </w:rPr>
+              <w:t xml:space="preserve">Primer año (sin IVA)</w:t>
+            </w:r>
+          </w:p>
+        </w:tc>
+        <w:tc>
+          <w:tcPr>
+            <w:tcW w:type="dxa" w:w="3660"/>
+            <w:shd w:fill="175772" w:color="auto" w:val="clear"/>
+            <w:tcMar>
+              <w:top w:type="dxa" w:w="70"/>
+              <w:left w:type="dxa" w:w="100"/>
+              <w:bottom w:type="dxa" w:w="70"/>
+              <w:right w:type="dxa" w:w="100"/>
+            </w:tcMar>
+          </w:tcPr>
+          <w:p>
+            <w:pPr>
+              <w:jc w:val="left"/>
+            </w:pPr>
+            <w:r>
+              <w:rPr>
+                <w:rFonts w:ascii="Arial" w:cs="Arial" w:eastAsia="Arial" w:hAnsi="Arial"/>
+                <w:b/>
+                <w:bCs/>
+                <w:color w:val="FFFFFF"/>
+                <w:sz w:val="19"/>
+                <w:szCs w:val="19"/>
+              </w:rPr>
+              <w:t xml:space="preserve"/>
+            </w:r>
+          </w:p>
+        </w:tc>
+        <w:tc>
+          <w:tcPr>
+            <w:tcW w:type="dxa" w:w="1200"/>
+            <w:shd w:fill="175772" w:color="auto" w:val="clear"/>
+            <w:tcMar>
+              <w:top w:type="dxa" w:w="70"/>
+              <w:left w:type="dxa" w:w="100"/>
+              <w:bottom w:type="dxa" w:w="70"/>
+              <w:right w:type="dxa" w:w="100"/>
+            </w:tcMar>
+          </w:tcPr>
+          <w:p>
+            <w:pPr>
+              <w:jc w:val="right"/>
+            </w:pPr>
+            <w:r>
+              <w:rPr>
+                <w:rFonts w:ascii="Arial" w:cs="Arial" w:eastAsia="Arial" w:hAnsi="Arial"/>
+                <w:b/>
+                <w:bCs/>
+                <w:color w:val="A8C243"/>
+                <w:sz w:val="19"/>
+                <w:szCs w:val="19"/>
+              </w:rPr>
+              <w:t xml:space="preserve"/>
+            </w:r>
+          </w:p>
+        </w:tc>
+        <w:tc>
+          <w:tcPr>
+            <w:tcW w:type="dxa" w:w="1600"/>
+            <w:shd w:fill="175772" w:color="auto" w:val="clear"/>
+            <w:tcMar>
+              <w:top w:type="dxa" w:w="70"/>
+              <w:left w:type="dxa" w:w="100"/>
+              <w:bottom w:type="dxa" w:w="70"/>
+              <w:right w:type="dxa" w:w="100"/>
+            </w:tcMar>
+          </w:tcPr>
+          <w:p>
+            <w:pPr>
+              <w:jc w:val="right"/>
+            </w:pPr>
+            <w:r>
+              <w:rPr>
+                <w:rFonts w:ascii="Arial" w:cs="Arial" w:eastAsia="Arial" w:hAnsi="Arial"/>
+                <w:b/>
+                <w:bCs/>
+                <w:color w:val="A8C243"/>
+                <w:sz w:val="19"/>
+                <w:szCs w:val="19"/>
+              </w:rPr>
+              <w:t xml:space="preserve">$11,689</w:t>
+            </w:r>
+          </w:p>
+        </w:tc>
+      </w:tr>
+    </w:tbl>
+    <w:p>
+      <w:pPr>
+        <w:spacing w:after="120" w:before="80"/>
+      </w:pPr>
+      <w:r>
+        <w:rPr>
+          <w:rFonts w:ascii="Arial" w:cs="Arial" w:eastAsia="Arial" w:hAnsi="Arial"/>
+          <w:i/>
+          <w:iCs/>
+          <w:color w:val="3D5866"/>
+          <w:sz w:val="19"/>
+          <w:szCs w:val="19"/>
+        </w:rPr>
+        <w:t xml:space="preserve">Precios de la cotización al 9 de octubre de 2026, a $18.20 por dólar, sin IVA. Con IVA: $13,559 el primer año. El asistente cobra por conversación (~270 al mes con 9,000 visitantes) y tiene límite de gasto mensual. La cotización no incluye sesión de fotos ni herramientas de diseño o de IA del equipo: eso es la Parte B.</w:t>
+      </w:r>
+    </w:p>
+    <w:p>
+      <w:pPr>
+        <w:spacing w:after="120" w:before="0"/>
+      </w:pPr>
+      <w:r>
+        <w:rPr>
+          <w:rFonts w:ascii="Arial" w:cs="Arial" w:eastAsia="Arial" w:hAnsi="Arial"/>
+          <w:color w:val="0E3A4E"/>
+          <w:sz w:val="22"/>
+          <w:szCs w:val="22"/>
+        </w:rPr>
+        <w:t xml:space="preserve">El diseño y desarrollo del sitio cubren la estructura, pero un sitio que vende necesita imágenes, textos, planos y videos actualizados para cada evento. Con estas licencias, Comunicación y RRPP produce y mantiene ese contenido sin pagar a proveedores externos por cada cambio. Son pagos anuales con descuento, y cada herramienta tiene un entregable concreto en el sitio.</w:t>
+      </w:r>
+    </w:p>
+    <w:p>
+      <w:pPr>
+        <w:pStyle w:val="Heading1"/>
+        <w:pBdr>
+          <w:bottom w:val="single" w:color="A8C243" w:sz="12" w:space="4"/>
+        </w:pBdr>
+        <w:spacing w:after="120" w:before="240"/>
+      </w:pPr>
+      <w:r>
+        <w:rPr>
+          <w:rFonts w:ascii="Arial" w:cs="Arial" w:eastAsia="Arial" w:hAnsi="Arial"/>
+          <w:b/>
+          <w:bCs/>
+          <w:color w:val="175772"/>
+          <w:sz w:val="32"/>
+          <w:szCs w:val="32"/>
+        </w:rPr>
+        <w:t xml:space="preserve">2.2 Parte B · Contenido del sitio (lo que la cotización no incluye)</w:t>
+      </w:r>
+    </w:p>
+    <w:p>
+      <w:pPr>
+        <w:spacing w:after="120" w:before="0"/>
+      </w:pPr>
+      <w:r>
+        <w:rPr>
+          <w:rFonts w:ascii="Arial" w:cs="Arial" w:eastAsia="Arial" w:hAnsi="Arial"/>
+          <w:color w:val="0E3A4E"/>
+          <w:sz w:val="22"/>
+          <w:szCs w:val="22"/>
+        </w:rPr>
+        <w:t xml:space="preserve">La web nueva la actualiza el equipo desde su propio portal, sin agencia. Para publicar eventos, anuncios y noticias necesita con qué producirlos.</w:t>
       </w:r>
     </w:p>
     <w:tbl>
@@ -4265,7 +5410,7 @@
             </w:tcMar>
           </w:tcPr>
           <w:p>
-            <w:hyperlink w:history="1" r:id="rId-m6okci7tmpztv-jswmgb">
+            <w:hyperlink w:history="1" r:id="rId5dnt6idjrthq3_7gilqcz">
               <w:r>
                 <w:rPr>
                   <w:rFonts w:ascii="Arial" w:cs="Arial" w:eastAsia="Arial" w:hAnsi="Arial"/>
@@ -4408,7 +5553,7 @@
             </w:tcMar>
           </w:tcPr>
           <w:p>
-            <w:hyperlink w:history="1" r:id="rIdj8zully88nhnjyatvhnsq">
+            <w:hyperlink w:history="1" r:id="rIdfwvxc3udempky-o8fdq2h">
               <w:r>
                 <w:rPr>
                   <w:rFonts w:ascii="Arial" w:cs="Arial" w:eastAsia="Arial" w:hAnsi="Arial"/>
@@ -4551,7 +5696,7 @@
             </w:tcMar>
           </w:tcPr>
           <w:p>
-            <w:hyperlink w:history="1" r:id="rIdgp9cycasjmyazd81f1zzi">
+            <w:hyperlink w:history="1" r:id="rIdq8ljoycskaw-3bjp-duqq">
               <w:r>
                 <w:rPr>
                   <w:rFonts w:ascii="Arial" w:cs="Arial" w:eastAsia="Arial" w:hAnsi="Arial"/>
@@ -4694,7 +5839,7 @@
             </w:tcMar>
           </w:tcPr>
           <w:p>
-            <w:hyperlink w:history="1" r:id="rIdosil7m3k1ka0fldkjxqs6">
+            <w:hyperlink w:history="1" r:id="rIdvbeu-wiyf87y6ckmak9ko">
               <w:r>
                 <w:rPr>
                   <w:rFonts w:ascii="Arial" w:cs="Arial" w:eastAsia="Arial" w:hAnsi="Arial"/>
@@ -4837,7 +5982,7 @@
             </w:tcMar>
           </w:tcPr>
           <w:p>
-            <w:hyperlink w:history="1" r:id="rId3uevxnyaegz3bt3_lrv3u">
+            <w:hyperlink w:history="1" r:id="rIdr7vdbznw4sia4uz2semzw">
               <w:r>
                 <w:rPr>
                   <w:rFonts w:ascii="Arial" w:cs="Arial" w:eastAsia="Arial" w:hAnsi="Arial"/>
@@ -5031,7 +6176,1532 @@
           <w:sz w:val="32"/>
           <w:szCs w:val="32"/>
         </w:rPr>
-        <w:t xml:space="preserve">2.2 Por qué cada herramienta y qué entrega</w:t>
+        <w:t xml:space="preserve">2.3 Total y publicidad: la web se paga sola</w:t>
+      </w:r>
+    </w:p>
+    <w:tbl>
+      <w:tblPr>
+        <w:tblW w:type="dxa" w:w="9360"/>
+        <w:tblBorders>
+          <w:top w:val="single" w:color="auto" w:sz="4"/>
+          <w:left w:val="single" w:color="auto" w:sz="4"/>
+          <w:bottom w:val="single" w:color="auto" w:sz="4"/>
+          <w:right w:val="single" w:color="auto" w:sz="4"/>
+          <w:insideH w:val="single" w:color="auto" w:sz="4"/>
+          <w:insideV w:val="single" w:color="auto" w:sz="4"/>
+        </w:tblBorders>
+      </w:tblPr>
+      <w:tblGrid>
+        <w:gridCol w:w="4680"/>
+        <w:gridCol w:w="4680"/>
+      </w:tblGrid>
+      <w:tr>
+        <w:trPr>
+          <w:tblHeader/>
+        </w:trPr>
+        <w:tc>
+          <w:tcPr>
+            <w:tcW w:type="dxa" w:w="4680"/>
+            <w:shd w:fill="DCE6EB" w:color="auto" w:val="clear"/>
+            <w:tcMar>
+              <w:top w:type="dxa" w:w="70"/>
+              <w:left w:type="dxa" w:w="100"/>
+              <w:bottom w:type="dxa" w:w="70"/>
+              <w:right w:type="dxa" w:w="100"/>
+            </w:tcMar>
+          </w:tcPr>
+          <w:p>
+            <w:pPr>
+              <w:jc w:val="left"/>
+            </w:pPr>
+            <w:r>
+              <w:rPr>
+                <w:rFonts w:ascii="Arial" w:cs="Arial" w:eastAsia="Arial" w:hAnsi="Arial"/>
+                <w:b/>
+                <w:bCs/>
+                <w:color w:val="0E3A4E"/>
+                <w:sz w:val="19"/>
+                <w:szCs w:val="19"/>
+              </w:rPr>
+              <w:t xml:space="preserve">Concepto</w:t>
+            </w:r>
+          </w:p>
+        </w:tc>
+        <w:tc>
+          <w:tcPr>
+            <w:tcW w:type="dxa" w:w="4680"/>
+            <w:shd w:fill="DCE6EB" w:color="auto" w:val="clear"/>
+            <w:tcMar>
+              <w:top w:type="dxa" w:w="70"/>
+              <w:left w:type="dxa" w:w="100"/>
+              <w:bottom w:type="dxa" w:w="70"/>
+              <w:right w:type="dxa" w:w="100"/>
+            </w:tcMar>
+          </w:tcPr>
+          <w:p>
+            <w:pPr>
+              <w:jc w:val="right"/>
+            </w:pPr>
+            <w:r>
+              <w:rPr>
+                <w:rFonts w:ascii="Arial" w:cs="Arial" w:eastAsia="Arial" w:hAnsi="Arial"/>
+                <w:b/>
+                <w:bCs/>
+                <w:color w:val="0E3A4E"/>
+                <w:sz w:val="19"/>
+                <w:szCs w:val="19"/>
+              </w:rPr>
+              <w:t xml:space="preserve">Primer año</w:t>
+            </w:r>
+          </w:p>
+        </w:tc>
+      </w:tr>
+      <w:tr>
+        <w:trPr>
+          <w:tblHeader w:val="false"/>
+        </w:trPr>
+        <w:tc>
+          <w:tcPr>
+            <w:tcW w:type="dxa" w:w="4680"/>
+            <w:shd w:fill="F6F9FA" w:color="auto" w:val="clear"/>
+            <w:tcMar>
+              <w:top w:type="dxa" w:w="70"/>
+              <w:left w:type="dxa" w:w="100"/>
+              <w:bottom w:type="dxa" w:w="70"/>
+              <w:right w:type="dxa" w:w="100"/>
+            </w:tcMar>
+          </w:tcPr>
+          <w:p>
+            <w:pPr>
+              <w:jc w:val="left"/>
+            </w:pPr>
+            <w:r>
+              <w:rPr>
+                <w:rFonts w:ascii="Arial" w:cs="Arial" w:eastAsia="Arial" w:hAnsi="Arial"/>
+                <w:b w:val="false"/>
+                <w:bCs w:val="false"/>
+                <w:color w:val="0E3A4E"/>
+                <w:sz w:val="19"/>
+                <w:szCs w:val="19"/>
+              </w:rPr>
+              <w:t xml:space="preserve">A · Infraestructura y asistente (con IVA)</w:t>
+            </w:r>
+          </w:p>
+        </w:tc>
+        <w:tc>
+          <w:tcPr>
+            <w:tcW w:type="dxa" w:w="4680"/>
+            <w:shd w:fill="F6F9FA" w:color="auto" w:val="clear"/>
+            <w:tcMar>
+              <w:top w:type="dxa" w:w="70"/>
+              <w:left w:type="dxa" w:w="100"/>
+              <w:bottom w:type="dxa" w:w="70"/>
+              <w:right w:type="dxa" w:w="100"/>
+            </w:tcMar>
+          </w:tcPr>
+          <w:p>
+            <w:pPr>
+              <w:jc w:val="right"/>
+            </w:pPr>
+            <w:r>
+              <w:rPr>
+                <w:rFonts w:ascii="Arial" w:cs="Arial" w:eastAsia="Arial" w:hAnsi="Arial"/>
+                <w:b w:val="false"/>
+                <w:bCs w:val="false"/>
+                <w:color w:val="0E3A4E"/>
+                <w:sz w:val="19"/>
+                <w:szCs w:val="19"/>
+              </w:rPr>
+              <w:t xml:space="preserve">$13,559</w:t>
+            </w:r>
+          </w:p>
+        </w:tc>
+      </w:tr>
+      <w:tr>
+        <w:trPr>
+          <w:tblHeader w:val="false"/>
+        </w:trPr>
+        <w:tc>
+          <w:tcPr>
+            <w:tcW w:type="dxa" w:w="4680"/>
+            <w:shd w:fill="FFFFFF" w:color="auto" w:val="clear"/>
+            <w:tcMar>
+              <w:top w:type="dxa" w:w="70"/>
+              <w:left w:type="dxa" w:w="100"/>
+              <w:bottom w:type="dxa" w:w="70"/>
+              <w:right w:type="dxa" w:w="100"/>
+            </w:tcMar>
+          </w:tcPr>
+          <w:p>
+            <w:pPr>
+              <w:jc w:val="left"/>
+            </w:pPr>
+            <w:r>
+              <w:rPr>
+                <w:rFonts w:ascii="Arial" w:cs="Arial" w:eastAsia="Arial" w:hAnsi="Arial"/>
+                <w:b w:val="false"/>
+                <w:bCs w:val="false"/>
+                <w:color w:val="0E3A4E"/>
+                <w:sz w:val="19"/>
+                <w:szCs w:val="19"/>
+              </w:rPr>
+              <w:t xml:space="preserve">B · Contenido del sitio (con IVA)</w:t>
+            </w:r>
+          </w:p>
+        </w:tc>
+        <w:tc>
+          <w:tcPr>
+            <w:tcW w:type="dxa" w:w="4680"/>
+            <w:shd w:fill="FFFFFF" w:color="auto" w:val="clear"/>
+            <w:tcMar>
+              <w:top w:type="dxa" w:w="70"/>
+              <w:left w:type="dxa" w:w="100"/>
+              <w:bottom w:type="dxa" w:w="70"/>
+              <w:right w:type="dxa" w:w="100"/>
+            </w:tcMar>
+          </w:tcPr>
+          <w:p>
+            <w:pPr>
+              <w:jc w:val="right"/>
+            </w:pPr>
+            <w:r>
+              <w:rPr>
+                <w:rFonts w:ascii="Arial" w:cs="Arial" w:eastAsia="Arial" w:hAnsi="Arial"/>
+                <w:b w:val="false"/>
+                <w:bCs w:val="false"/>
+                <w:color w:val="0E3A4E"/>
+                <w:sz w:val="19"/>
+                <w:szCs w:val="19"/>
+              </w:rPr>
+              <w:t xml:space="preserve">$26,962</w:t>
+            </w:r>
+          </w:p>
+        </w:tc>
+      </w:tr>
+      <w:tr>
+        <w:trPr>
+          <w:tblHeader w:val="false"/>
+        </w:trPr>
+        <w:tc>
+          <w:tcPr>
+            <w:tcW w:type="dxa" w:w="4680"/>
+            <w:shd w:fill="175772" w:color="auto" w:val="clear"/>
+            <w:tcMar>
+              <w:top w:type="dxa" w:w="70"/>
+              <w:left w:type="dxa" w:w="100"/>
+              <w:bottom w:type="dxa" w:w="70"/>
+              <w:right w:type="dxa" w:w="100"/>
+            </w:tcMar>
+          </w:tcPr>
+          <w:p>
+            <w:pPr>
+              <w:jc w:val="left"/>
+            </w:pPr>
+            <w:r>
+              <w:rPr>
+                <w:rFonts w:ascii="Arial" w:cs="Arial" w:eastAsia="Arial" w:hAnsi="Arial"/>
+                <w:b/>
+                <w:bCs/>
+                <w:color w:val="FFFFFF"/>
+                <w:sz w:val="19"/>
+                <w:szCs w:val="19"/>
+              </w:rPr>
+              <w:t xml:space="preserve">Total Propuesta 2</w:t>
+            </w:r>
+          </w:p>
+        </w:tc>
+        <w:tc>
+          <w:tcPr>
+            <w:tcW w:type="dxa" w:w="4680"/>
+            <w:shd w:fill="175772" w:color="auto" w:val="clear"/>
+            <w:tcMar>
+              <w:top w:type="dxa" w:w="70"/>
+              <w:left w:type="dxa" w:w="100"/>
+              <w:bottom w:type="dxa" w:w="70"/>
+              <w:right w:type="dxa" w:w="100"/>
+            </w:tcMar>
+          </w:tcPr>
+          <w:p>
+            <w:pPr>
+              <w:jc w:val="right"/>
+            </w:pPr>
+            <w:r>
+              <w:rPr>
+                <w:rFonts w:ascii="Arial" w:cs="Arial" w:eastAsia="Arial" w:hAnsi="Arial"/>
+                <w:b/>
+                <w:bCs/>
+                <w:color w:val="FFFFFF"/>
+                <w:sz w:val="19"/>
+                <w:szCs w:val="19"/>
+              </w:rPr>
+              <w:t xml:space="preserve">$40,521</w:t>
+            </w:r>
+          </w:p>
+        </w:tc>
+      </w:tr>
+    </w:tbl>
+    <w:p>
+      <w:pPr>
+        <w:spacing w:after="120" w:before="120"/>
+      </w:pPr>
+      <w:r>
+        <w:rPr>
+          <w:rFonts w:ascii="Arial" w:cs="Arial" w:eastAsia="Arial" w:hAnsi="Arial"/>
+          <w:color w:val="0E3A4E"/>
+          <w:sz w:val="22"/>
+          <w:szCs w:val="22"/>
+        </w:rPr>
+        <w:t xml:space="preserve">La web nueva trae 8 espacios para anuncios que el equipo administra desde el portal. Precios de la cotización, con base en el tráfico real (reporte de Quimaira, enero a octubre de 2026):</w:t>
+      </w:r>
+    </w:p>
+    <w:tbl>
+      <w:tblPr>
+        <w:tblW w:type="dxa" w:w="9360"/>
+        <w:tblBorders>
+          <w:top w:val="single" w:color="auto" w:sz="4"/>
+          <w:left w:val="single" w:color="auto" w:sz="4"/>
+          <w:bottom w:val="single" w:color="auto" w:sz="4"/>
+          <w:right w:val="single" w:color="auto" w:sz="4"/>
+          <w:insideH w:val="single" w:color="auto" w:sz="4"/>
+          <w:insideV w:val="single" w:color="auto" w:sz="4"/>
+        </w:tblBorders>
+      </w:tblPr>
+      <w:tblGrid>
+        <w:gridCol w:w="4200"/>
+        <w:gridCol w:w="1700"/>
+        <w:gridCol w:w="1700"/>
+        <w:gridCol w:w="1760"/>
+      </w:tblGrid>
+      <w:tr>
+        <w:trPr>
+          <w:tblHeader/>
+        </w:trPr>
+        <w:tc>
+          <w:tcPr>
+            <w:tcW w:type="dxa" w:w="4200"/>
+            <w:shd w:fill="DCE6EB" w:color="auto" w:val="clear"/>
+            <w:tcMar>
+              <w:top w:type="dxa" w:w="70"/>
+              <w:left w:type="dxa" w:w="100"/>
+              <w:bottom w:type="dxa" w:w="70"/>
+              <w:right w:type="dxa" w:w="100"/>
+            </w:tcMar>
+          </w:tcPr>
+          <w:p>
+            <w:pPr>
+              <w:jc w:val="left"/>
+            </w:pPr>
+            <w:r>
+              <w:rPr>
+                <w:rFonts w:ascii="Arial" w:cs="Arial" w:eastAsia="Arial" w:hAnsi="Arial"/>
+                <w:b/>
+                <w:bCs/>
+                <w:color w:val="0E3A4E"/>
+                <w:sz w:val="19"/>
+                <w:szCs w:val="19"/>
+              </w:rPr>
+              <w:t xml:space="preserve">Espacio</w:t>
+            </w:r>
+          </w:p>
+        </w:tc>
+        <w:tc>
+          <w:tcPr>
+            <w:tcW w:type="dxa" w:w="1700"/>
+            <w:shd w:fill="DCE6EB" w:color="auto" w:val="clear"/>
+            <w:tcMar>
+              <w:top w:type="dxa" w:w="70"/>
+              <w:left w:type="dxa" w:w="100"/>
+              <w:bottom w:type="dxa" w:w="70"/>
+              <w:right w:type="dxa" w:w="100"/>
+            </w:tcMar>
+          </w:tcPr>
+          <w:p>
+            <w:pPr>
+              <w:jc w:val="right"/>
+            </w:pPr>
+            <w:r>
+              <w:rPr>
+                <w:rFonts w:ascii="Arial" w:cs="Arial" w:eastAsia="Arial" w:hAnsi="Arial"/>
+                <w:b/>
+                <w:bCs/>
+                <w:color w:val="0E3A4E"/>
+                <w:sz w:val="19"/>
+                <w:szCs w:val="19"/>
+              </w:rPr>
+              <w:t xml:space="preserve">Por mes</w:t>
+            </w:r>
+          </w:p>
+        </w:tc>
+        <w:tc>
+          <w:tcPr>
+            <w:tcW w:type="dxa" w:w="1700"/>
+            <w:shd w:fill="DCE6EB" w:color="auto" w:val="clear"/>
+            <w:tcMar>
+              <w:top w:type="dxa" w:w="70"/>
+              <w:left w:type="dxa" w:w="100"/>
+              <w:bottom w:type="dxa" w:w="70"/>
+              <w:right w:type="dxa" w:w="100"/>
+            </w:tcMar>
+          </w:tcPr>
+          <w:p>
+            <w:pPr>
+              <w:jc w:val="right"/>
+            </w:pPr>
+            <w:r>
+              <w:rPr>
+                <w:rFonts w:ascii="Arial" w:cs="Arial" w:eastAsia="Arial" w:hAnsi="Arial"/>
+                <w:b/>
+                <w:bCs/>
+                <w:color w:val="0E3A4E"/>
+                <w:sz w:val="19"/>
+                <w:szCs w:val="19"/>
+              </w:rPr>
+              <w:t xml:space="preserve">12 meses (−20%)</w:t>
+            </w:r>
+          </w:p>
+        </w:tc>
+        <w:tc>
+          <w:tcPr>
+            <w:tcW w:type="dxa" w:w="1760"/>
+            <w:shd w:fill="DCE6EB" w:color="auto" w:val="clear"/>
+            <w:tcMar>
+              <w:top w:type="dxa" w:w="70"/>
+              <w:left w:type="dxa" w:w="100"/>
+              <w:bottom w:type="dxa" w:w="70"/>
+              <w:right w:type="dxa" w:w="100"/>
+            </w:tcMar>
+          </w:tcPr>
+          <w:p>
+            <w:pPr>
+              <w:jc w:val="right"/>
+            </w:pPr>
+            <w:r>
+              <w:rPr>
+                <w:rFonts w:ascii="Arial" w:cs="Arial" w:eastAsia="Arial" w:hAnsi="Arial"/>
+                <w:b/>
+                <w:bCs/>
+                <w:color w:val="0E3A4E"/>
+                <w:sz w:val="19"/>
+                <w:szCs w:val="19"/>
+              </w:rPr>
+              <w:t xml:space="preserve">Vistas al mes</w:t>
+            </w:r>
+          </w:p>
+        </w:tc>
+      </w:tr>
+      <w:tr>
+        <w:trPr>
+          <w:tblHeader w:val="false"/>
+        </w:trPr>
+        <w:tc>
+          <w:tcPr>
+            <w:tcW w:type="dxa" w:w="4200"/>
+            <w:shd w:fill="F6F9FA" w:color="auto" w:val="clear"/>
+            <w:tcMar>
+              <w:top w:type="dxa" w:w="70"/>
+              <w:left w:type="dxa" w:w="100"/>
+              <w:bottom w:type="dxa" w:w="70"/>
+              <w:right w:type="dxa" w:w="100"/>
+            </w:tcMar>
+          </w:tcPr>
+          <w:p>
+            <w:pPr>
+              <w:jc w:val="left"/>
+            </w:pPr>
+            <w:r>
+              <w:rPr>
+                <w:rFonts w:ascii="Arial" w:cs="Arial" w:eastAsia="Arial" w:hAnsi="Arial"/>
+                <w:b w:val="false"/>
+                <w:bCs w:val="false"/>
+                <w:color w:val="0E3A4E"/>
+                <w:sz w:val="19"/>
+                <w:szCs w:val="19"/>
+              </w:rPr>
+              <w:t xml:space="preserve">Ventana al entrar</w:t>
+            </w:r>
+          </w:p>
+        </w:tc>
+        <w:tc>
+          <w:tcPr>
+            <w:tcW w:type="dxa" w:w="1700"/>
+            <w:shd w:fill="F6F9FA" w:color="auto" w:val="clear"/>
+            <w:tcMar>
+              <w:top w:type="dxa" w:w="70"/>
+              <w:left w:type="dxa" w:w="100"/>
+              <w:bottom w:type="dxa" w:w="70"/>
+              <w:right w:type="dxa" w:w="100"/>
+            </w:tcMar>
+          </w:tcPr>
+          <w:p>
+            <w:pPr>
+              <w:jc w:val="right"/>
+            </w:pPr>
+            <w:r>
+              <w:rPr>
+                <w:rFonts w:ascii="Arial" w:cs="Arial" w:eastAsia="Arial" w:hAnsi="Arial"/>
+                <w:b w:val="false"/>
+                <w:bCs w:val="false"/>
+                <w:color w:val="0E3A4E"/>
+                <w:sz w:val="19"/>
+                <w:szCs w:val="19"/>
+              </w:rPr>
+              <w:t xml:space="preserve">$3,000</w:t>
+            </w:r>
+          </w:p>
+        </w:tc>
+        <w:tc>
+          <w:tcPr>
+            <w:tcW w:type="dxa" w:w="1700"/>
+            <w:shd w:fill="F6F9FA" w:color="auto" w:val="clear"/>
+            <w:tcMar>
+              <w:top w:type="dxa" w:w="70"/>
+              <w:left w:type="dxa" w:w="100"/>
+              <w:bottom w:type="dxa" w:w="70"/>
+              <w:right w:type="dxa" w:w="100"/>
+            </w:tcMar>
+          </w:tcPr>
+          <w:p>
+            <w:pPr>
+              <w:jc w:val="right"/>
+            </w:pPr>
+            <w:r>
+              <w:rPr>
+                <w:rFonts w:ascii="Arial" w:cs="Arial" w:eastAsia="Arial" w:hAnsi="Arial"/>
+                <w:b w:val="false"/>
+                <w:bCs w:val="false"/>
+                <w:color w:val="0E3A4E"/>
+                <w:sz w:val="19"/>
+                <w:szCs w:val="19"/>
+              </w:rPr>
+              <w:t xml:space="preserve">$28,800</w:t>
+            </w:r>
+          </w:p>
+        </w:tc>
+        <w:tc>
+          <w:tcPr>
+            <w:tcW w:type="dxa" w:w="1760"/>
+            <w:shd w:fill="F6F9FA" w:color="auto" w:val="clear"/>
+            <w:tcMar>
+              <w:top w:type="dxa" w:w="70"/>
+              <w:left w:type="dxa" w:w="100"/>
+              <w:bottom w:type="dxa" w:w="70"/>
+              <w:right w:type="dxa" w:w="100"/>
+            </w:tcMar>
+          </w:tcPr>
+          <w:p>
+            <w:pPr>
+              <w:jc w:val="right"/>
+            </w:pPr>
+            <w:r>
+              <w:rPr>
+                <w:rFonts w:ascii="Arial" w:cs="Arial" w:eastAsia="Arial" w:hAnsi="Arial"/>
+                <w:b w:val="false"/>
+                <w:bCs w:val="false"/>
+                <w:color w:val="0E3A4E"/>
+                <w:sz w:val="19"/>
+                <w:szCs w:val="19"/>
+              </w:rPr>
+              <w:t xml:space="preserve">~9,000</w:t>
+            </w:r>
+          </w:p>
+        </w:tc>
+      </w:tr>
+      <w:tr>
+        <w:trPr>
+          <w:tblHeader w:val="false"/>
+        </w:trPr>
+        <w:tc>
+          <w:tcPr>
+            <w:tcW w:type="dxa" w:w="4200"/>
+            <w:shd w:fill="FFFFFF" w:color="auto" w:val="clear"/>
+            <w:tcMar>
+              <w:top w:type="dxa" w:w="70"/>
+              <w:left w:type="dxa" w:w="100"/>
+              <w:bottom w:type="dxa" w:w="70"/>
+              <w:right w:type="dxa" w:w="100"/>
+            </w:tcMar>
+          </w:tcPr>
+          <w:p>
+            <w:pPr>
+              <w:jc w:val="left"/>
+            </w:pPr>
+            <w:r>
+              <w:rPr>
+                <w:rFonts w:ascii="Arial" w:cs="Arial" w:eastAsia="Arial" w:hAnsi="Arial"/>
+                <w:b w:val="false"/>
+                <w:bCs w:val="false"/>
+                <w:color w:val="0E3A4E"/>
+                <w:sz w:val="19"/>
+                <w:szCs w:val="19"/>
+              </w:rPr>
+              <w:t xml:space="preserve">Calendario · banner arriba y abajo</w:t>
+            </w:r>
+          </w:p>
+        </w:tc>
+        <w:tc>
+          <w:tcPr>
+            <w:tcW w:type="dxa" w:w="1700"/>
+            <w:shd w:fill="FFFFFF" w:color="auto" w:val="clear"/>
+            <w:tcMar>
+              <w:top w:type="dxa" w:w="70"/>
+              <w:left w:type="dxa" w:w="100"/>
+              <w:bottom w:type="dxa" w:w="70"/>
+              <w:right w:type="dxa" w:w="100"/>
+            </w:tcMar>
+          </w:tcPr>
+          <w:p>
+            <w:pPr>
+              <w:jc w:val="right"/>
+            </w:pPr>
+            <w:r>
+              <w:rPr>
+                <w:rFonts w:ascii="Arial" w:cs="Arial" w:eastAsia="Arial" w:hAnsi="Arial"/>
+                <w:b w:val="false"/>
+                <w:bCs w:val="false"/>
+                <w:color w:val="0E3A4E"/>
+                <w:sz w:val="19"/>
+                <w:szCs w:val="19"/>
+              </w:rPr>
+              <w:t xml:space="preserve">$1,800</w:t>
+            </w:r>
+          </w:p>
+        </w:tc>
+        <w:tc>
+          <w:tcPr>
+            <w:tcW w:type="dxa" w:w="1700"/>
+            <w:shd w:fill="FFFFFF" w:color="auto" w:val="clear"/>
+            <w:tcMar>
+              <w:top w:type="dxa" w:w="70"/>
+              <w:left w:type="dxa" w:w="100"/>
+              <w:bottom w:type="dxa" w:w="70"/>
+              <w:right w:type="dxa" w:w="100"/>
+            </w:tcMar>
+          </w:tcPr>
+          <w:p>
+            <w:pPr>
+              <w:jc w:val="right"/>
+            </w:pPr>
+            <w:r>
+              <w:rPr>
+                <w:rFonts w:ascii="Arial" w:cs="Arial" w:eastAsia="Arial" w:hAnsi="Arial"/>
+                <w:b w:val="false"/>
+                <w:bCs w:val="false"/>
+                <w:color w:val="0E3A4E"/>
+                <w:sz w:val="19"/>
+                <w:szCs w:val="19"/>
+              </w:rPr>
+              <w:t xml:space="preserve">$17,280</w:t>
+            </w:r>
+          </w:p>
+        </w:tc>
+        <w:tc>
+          <w:tcPr>
+            <w:tcW w:type="dxa" w:w="1760"/>
+            <w:shd w:fill="FFFFFF" w:color="auto" w:val="clear"/>
+            <w:tcMar>
+              <w:top w:type="dxa" w:w="70"/>
+              <w:left w:type="dxa" w:w="100"/>
+              <w:bottom w:type="dxa" w:w="70"/>
+              <w:right w:type="dxa" w:w="100"/>
+            </w:tcMar>
+          </w:tcPr>
+          <w:p>
+            <w:pPr>
+              <w:jc w:val="right"/>
+            </w:pPr>
+            <w:r>
+              <w:rPr>
+                <w:rFonts w:ascii="Arial" w:cs="Arial" w:eastAsia="Arial" w:hAnsi="Arial"/>
+                <w:b w:val="false"/>
+                <w:bCs w:val="false"/>
+                <w:color w:val="0E3A4E"/>
+                <w:sz w:val="19"/>
+                <w:szCs w:val="19"/>
+              </w:rPr>
+              <w:t xml:space="preserve">~7,150</w:t>
+            </w:r>
+          </w:p>
+        </w:tc>
+      </w:tr>
+      <w:tr>
+        <w:trPr>
+          <w:tblHeader w:val="false"/>
+        </w:trPr>
+        <w:tc>
+          <w:tcPr>
+            <w:tcW w:type="dxa" w:w="4200"/>
+            <w:shd w:fill="F6F9FA" w:color="auto" w:val="clear"/>
+            <w:tcMar>
+              <w:top w:type="dxa" w:w="70"/>
+              <w:left w:type="dxa" w:w="100"/>
+              <w:bottom w:type="dxa" w:w="70"/>
+              <w:right w:type="dxa" w:w="100"/>
+            </w:tcMar>
+          </w:tcPr>
+          <w:p>
+            <w:pPr>
+              <w:jc w:val="left"/>
+            </w:pPr>
+            <w:r>
+              <w:rPr>
+                <w:rFonts w:ascii="Arial" w:cs="Arial" w:eastAsia="Arial" w:hAnsi="Arial"/>
+                <w:b w:val="false"/>
+                <w:bCs w:val="false"/>
+                <w:color w:val="0E3A4E"/>
+                <w:sz w:val="19"/>
+                <w:szCs w:val="19"/>
+              </w:rPr>
+              <w:t xml:space="preserve">Calendario · tarjeta entre eventos</w:t>
+            </w:r>
+          </w:p>
+        </w:tc>
+        <w:tc>
+          <w:tcPr>
+            <w:tcW w:type="dxa" w:w="1700"/>
+            <w:shd w:fill="F6F9FA" w:color="auto" w:val="clear"/>
+            <w:tcMar>
+              <w:top w:type="dxa" w:w="70"/>
+              <w:left w:type="dxa" w:w="100"/>
+              <w:bottom w:type="dxa" w:w="70"/>
+              <w:right w:type="dxa" w:w="100"/>
+            </w:tcMar>
+          </w:tcPr>
+          <w:p>
+            <w:pPr>
+              <w:jc w:val="right"/>
+            </w:pPr>
+            <w:r>
+              <w:rPr>
+                <w:rFonts w:ascii="Arial" w:cs="Arial" w:eastAsia="Arial" w:hAnsi="Arial"/>
+                <w:b w:val="false"/>
+                <w:bCs w:val="false"/>
+                <w:color w:val="0E3A4E"/>
+                <w:sz w:val="19"/>
+                <w:szCs w:val="19"/>
+              </w:rPr>
+              <w:t xml:space="preserve">$1,400</w:t>
+            </w:r>
+          </w:p>
+        </w:tc>
+        <w:tc>
+          <w:tcPr>
+            <w:tcW w:type="dxa" w:w="1700"/>
+            <w:shd w:fill="F6F9FA" w:color="auto" w:val="clear"/>
+            <w:tcMar>
+              <w:top w:type="dxa" w:w="70"/>
+              <w:left w:type="dxa" w:w="100"/>
+              <w:bottom w:type="dxa" w:w="70"/>
+              <w:right w:type="dxa" w:w="100"/>
+            </w:tcMar>
+          </w:tcPr>
+          <w:p>
+            <w:pPr>
+              <w:jc w:val="right"/>
+            </w:pPr>
+            <w:r>
+              <w:rPr>
+                <w:rFonts w:ascii="Arial" w:cs="Arial" w:eastAsia="Arial" w:hAnsi="Arial"/>
+                <w:b w:val="false"/>
+                <w:bCs w:val="false"/>
+                <w:color w:val="0E3A4E"/>
+                <w:sz w:val="19"/>
+                <w:szCs w:val="19"/>
+              </w:rPr>
+              <w:t xml:space="preserve">$13,440</w:t>
+            </w:r>
+          </w:p>
+        </w:tc>
+        <w:tc>
+          <w:tcPr>
+            <w:tcW w:type="dxa" w:w="1760"/>
+            <w:shd w:fill="F6F9FA" w:color="auto" w:val="clear"/>
+            <w:tcMar>
+              <w:top w:type="dxa" w:w="70"/>
+              <w:left w:type="dxa" w:w="100"/>
+              <w:bottom w:type="dxa" w:w="70"/>
+              <w:right w:type="dxa" w:w="100"/>
+            </w:tcMar>
+          </w:tcPr>
+          <w:p>
+            <w:pPr>
+              <w:jc w:val="right"/>
+            </w:pPr>
+            <w:r>
+              <w:rPr>
+                <w:rFonts w:ascii="Arial" w:cs="Arial" w:eastAsia="Arial" w:hAnsi="Arial"/>
+                <w:b w:val="false"/>
+                <w:bCs w:val="false"/>
+                <w:color w:val="0E3A4E"/>
+                <w:sz w:val="19"/>
+                <w:szCs w:val="19"/>
+              </w:rPr>
+              <w:t xml:space="preserve">~7,150</w:t>
+            </w:r>
+          </w:p>
+        </w:tc>
+      </w:tr>
+      <w:tr>
+        <w:trPr>
+          <w:tblHeader w:val="false"/>
+        </w:trPr>
+        <w:tc>
+          <w:tcPr>
+            <w:tcW w:type="dxa" w:w="4200"/>
+            <w:shd w:fill="FFFFFF" w:color="auto" w:val="clear"/>
+            <w:tcMar>
+              <w:top w:type="dxa" w:w="70"/>
+              <w:left w:type="dxa" w:w="100"/>
+              <w:bottom w:type="dxa" w:w="70"/>
+              <w:right w:type="dxa" w:w="100"/>
+            </w:tcMar>
+          </w:tcPr>
+          <w:p>
+            <w:pPr>
+              <w:jc w:val="left"/>
+            </w:pPr>
+            <w:r>
+              <w:rPr>
+                <w:rFonts w:ascii="Arial" w:cs="Arial" w:eastAsia="Arial" w:hAnsi="Arial"/>
+                <w:b w:val="false"/>
+                <w:bCs w:val="false"/>
+                <w:color w:val="0E3A4E"/>
+                <w:sz w:val="19"/>
+                <w:szCs w:val="19"/>
+              </w:rPr>
+              <w:t xml:space="preserve">Página principal · banner</w:t>
+            </w:r>
+          </w:p>
+        </w:tc>
+        <w:tc>
+          <w:tcPr>
+            <w:tcW w:type="dxa" w:w="1700"/>
+            <w:shd w:fill="FFFFFF" w:color="auto" w:val="clear"/>
+            <w:tcMar>
+              <w:top w:type="dxa" w:w="70"/>
+              <w:left w:type="dxa" w:w="100"/>
+              <w:bottom w:type="dxa" w:w="70"/>
+              <w:right w:type="dxa" w:w="100"/>
+            </w:tcMar>
+          </w:tcPr>
+          <w:p>
+            <w:pPr>
+              <w:jc w:val="right"/>
+            </w:pPr>
+            <w:r>
+              <w:rPr>
+                <w:rFonts w:ascii="Arial" w:cs="Arial" w:eastAsia="Arial" w:hAnsi="Arial"/>
+                <w:b w:val="false"/>
+                <w:bCs w:val="false"/>
+                <w:color w:val="0E3A4E"/>
+                <w:sz w:val="19"/>
+                <w:szCs w:val="19"/>
+              </w:rPr>
+              <w:t xml:space="preserve">$1,500</w:t>
+            </w:r>
+          </w:p>
+        </w:tc>
+        <w:tc>
+          <w:tcPr>
+            <w:tcW w:type="dxa" w:w="1700"/>
+            <w:shd w:fill="FFFFFF" w:color="auto" w:val="clear"/>
+            <w:tcMar>
+              <w:top w:type="dxa" w:w="70"/>
+              <w:left w:type="dxa" w:w="100"/>
+              <w:bottom w:type="dxa" w:w="70"/>
+              <w:right w:type="dxa" w:w="100"/>
+            </w:tcMar>
+          </w:tcPr>
+          <w:p>
+            <w:pPr>
+              <w:jc w:val="right"/>
+            </w:pPr>
+            <w:r>
+              <w:rPr>
+                <w:rFonts w:ascii="Arial" w:cs="Arial" w:eastAsia="Arial" w:hAnsi="Arial"/>
+                <w:b w:val="false"/>
+                <w:bCs w:val="false"/>
+                <w:color w:val="0E3A4E"/>
+                <w:sz w:val="19"/>
+                <w:szCs w:val="19"/>
+              </w:rPr>
+              <w:t xml:space="preserve">$14,400</w:t>
+            </w:r>
+          </w:p>
+        </w:tc>
+        <w:tc>
+          <w:tcPr>
+            <w:tcW w:type="dxa" w:w="1760"/>
+            <w:shd w:fill="FFFFFF" w:color="auto" w:val="clear"/>
+            <w:tcMar>
+              <w:top w:type="dxa" w:w="70"/>
+              <w:left w:type="dxa" w:w="100"/>
+              <w:bottom w:type="dxa" w:w="70"/>
+              <w:right w:type="dxa" w:w="100"/>
+            </w:tcMar>
+          </w:tcPr>
+          <w:p>
+            <w:pPr>
+              <w:jc w:val="right"/>
+            </w:pPr>
+            <w:r>
+              <w:rPr>
+                <w:rFonts w:ascii="Arial" w:cs="Arial" w:eastAsia="Arial" w:hAnsi="Arial"/>
+                <w:b w:val="false"/>
+                <w:bCs w:val="false"/>
+                <w:color w:val="0E3A4E"/>
+                <w:sz w:val="19"/>
+                <w:szCs w:val="19"/>
+              </w:rPr>
+              <w:t xml:space="preserve">~5,730</w:t>
+            </w:r>
+          </w:p>
+        </w:tc>
+      </w:tr>
+      <w:tr>
+        <w:trPr>
+          <w:tblHeader w:val="false"/>
+        </w:trPr>
+        <w:tc>
+          <w:tcPr>
+            <w:tcW w:type="dxa" w:w="4200"/>
+            <w:shd w:fill="F6F9FA" w:color="auto" w:val="clear"/>
+            <w:tcMar>
+              <w:top w:type="dxa" w:w="70"/>
+              <w:left w:type="dxa" w:w="100"/>
+              <w:bottom w:type="dxa" w:w="70"/>
+              <w:right w:type="dxa" w:w="100"/>
+            </w:tcMar>
+          </w:tcPr>
+          <w:p>
+            <w:pPr>
+              <w:jc w:val="left"/>
+            </w:pPr>
+            <w:r>
+              <w:rPr>
+                <w:rFonts w:ascii="Arial" w:cs="Arial" w:eastAsia="Arial" w:hAnsi="Arial"/>
+                <w:b w:val="false"/>
+                <w:bCs w:val="false"/>
+                <w:color w:val="0E3A4E"/>
+                <w:sz w:val="19"/>
+                <w:szCs w:val="19"/>
+              </w:rPr>
+              <w:t xml:space="preserve">Cada evento · banner</w:t>
+            </w:r>
+          </w:p>
+        </w:tc>
+        <w:tc>
+          <w:tcPr>
+            <w:tcW w:type="dxa" w:w="1700"/>
+            <w:shd w:fill="F6F9FA" w:color="auto" w:val="clear"/>
+            <w:tcMar>
+              <w:top w:type="dxa" w:w="70"/>
+              <w:left w:type="dxa" w:w="100"/>
+              <w:bottom w:type="dxa" w:w="70"/>
+              <w:right w:type="dxa" w:w="100"/>
+            </w:tcMar>
+          </w:tcPr>
+          <w:p>
+            <w:pPr>
+              <w:jc w:val="right"/>
+            </w:pPr>
+            <w:r>
+              <w:rPr>
+                <w:rFonts w:ascii="Arial" w:cs="Arial" w:eastAsia="Arial" w:hAnsi="Arial"/>
+                <w:b w:val="false"/>
+                <w:bCs w:val="false"/>
+                <w:color w:val="0E3A4E"/>
+                <w:sz w:val="19"/>
+                <w:szCs w:val="19"/>
+              </w:rPr>
+              <w:t xml:space="preserve">$800</w:t>
+            </w:r>
+          </w:p>
+        </w:tc>
+        <w:tc>
+          <w:tcPr>
+            <w:tcW w:type="dxa" w:w="1700"/>
+            <w:shd w:fill="F6F9FA" w:color="auto" w:val="clear"/>
+            <w:tcMar>
+              <w:top w:type="dxa" w:w="70"/>
+              <w:left w:type="dxa" w:w="100"/>
+              <w:bottom w:type="dxa" w:w="70"/>
+              <w:right w:type="dxa" w:w="100"/>
+            </w:tcMar>
+          </w:tcPr>
+          <w:p>
+            <w:pPr>
+              <w:jc w:val="right"/>
+            </w:pPr>
+            <w:r>
+              <w:rPr>
+                <w:rFonts w:ascii="Arial" w:cs="Arial" w:eastAsia="Arial" w:hAnsi="Arial"/>
+                <w:b w:val="false"/>
+                <w:bCs w:val="false"/>
+                <w:color w:val="0E3A4E"/>
+                <w:sz w:val="19"/>
+                <w:szCs w:val="19"/>
+              </w:rPr>
+              <w:t xml:space="preserve">$7,680</w:t>
+            </w:r>
+          </w:p>
+        </w:tc>
+        <w:tc>
+          <w:tcPr>
+            <w:tcW w:type="dxa" w:w="1760"/>
+            <w:shd w:fill="F6F9FA" w:color="auto" w:val="clear"/>
+            <w:tcMar>
+              <w:top w:type="dxa" w:w="70"/>
+              <w:left w:type="dxa" w:w="100"/>
+              <w:bottom w:type="dxa" w:w="70"/>
+              <w:right w:type="dxa" w:w="100"/>
+            </w:tcMar>
+          </w:tcPr>
+          <w:p>
+            <w:pPr>
+              <w:jc w:val="right"/>
+            </w:pPr>
+            <w:r>
+              <w:rPr>
+                <w:rFonts w:ascii="Arial" w:cs="Arial" w:eastAsia="Arial" w:hAnsi="Arial"/>
+                <w:b w:val="false"/>
+                <w:bCs w:val="false"/>
+                <w:color w:val="0E3A4E"/>
+                <w:sz w:val="19"/>
+                <w:szCs w:val="19"/>
+              </w:rPr>
+              <w:t xml:space="preserve">~2,900</w:t>
+            </w:r>
+          </w:p>
+        </w:tc>
+      </w:tr>
+      <w:tr>
+        <w:trPr>
+          <w:tblHeader w:val="false"/>
+        </w:trPr>
+        <w:tc>
+          <w:tcPr>
+            <w:tcW w:type="dxa" w:w="4200"/>
+            <w:shd w:fill="FFFFFF" w:color="auto" w:val="clear"/>
+            <w:tcMar>
+              <w:top w:type="dxa" w:w="70"/>
+              <w:left w:type="dxa" w:w="100"/>
+              <w:bottom w:type="dxa" w:w="70"/>
+              <w:right w:type="dxa" w:w="100"/>
+            </w:tcMar>
+          </w:tcPr>
+          <w:p>
+            <w:pPr>
+              <w:jc w:val="left"/>
+            </w:pPr>
+            <w:r>
+              <w:rPr>
+                <w:rFonts w:ascii="Arial" w:cs="Arial" w:eastAsia="Arial" w:hAnsi="Arial"/>
+                <w:b w:val="false"/>
+                <w:bCs w:val="false"/>
+                <w:color w:val="0E3A4E"/>
+                <w:sz w:val="19"/>
+                <w:szCs w:val="19"/>
+              </w:rPr>
+              <w:t xml:space="preserve">Cada evento · cuadro lateral</w:t>
+            </w:r>
+          </w:p>
+        </w:tc>
+        <w:tc>
+          <w:tcPr>
+            <w:tcW w:type="dxa" w:w="1700"/>
+            <w:shd w:fill="FFFFFF" w:color="auto" w:val="clear"/>
+            <w:tcMar>
+              <w:top w:type="dxa" w:w="70"/>
+              <w:left w:type="dxa" w:w="100"/>
+              <w:bottom w:type="dxa" w:w="70"/>
+              <w:right w:type="dxa" w:w="100"/>
+            </w:tcMar>
+          </w:tcPr>
+          <w:p>
+            <w:pPr>
+              <w:jc w:val="right"/>
+            </w:pPr>
+            <w:r>
+              <w:rPr>
+                <w:rFonts w:ascii="Arial" w:cs="Arial" w:eastAsia="Arial" w:hAnsi="Arial"/>
+                <w:b w:val="false"/>
+                <w:bCs w:val="false"/>
+                <w:color w:val="0E3A4E"/>
+                <w:sz w:val="19"/>
+                <w:szCs w:val="19"/>
+              </w:rPr>
+              <w:t xml:space="preserve">$800</w:t>
+            </w:r>
+          </w:p>
+        </w:tc>
+        <w:tc>
+          <w:tcPr>
+            <w:tcW w:type="dxa" w:w="1700"/>
+            <w:shd w:fill="FFFFFF" w:color="auto" w:val="clear"/>
+            <w:tcMar>
+              <w:top w:type="dxa" w:w="70"/>
+              <w:left w:type="dxa" w:w="100"/>
+              <w:bottom w:type="dxa" w:w="70"/>
+              <w:right w:type="dxa" w:w="100"/>
+            </w:tcMar>
+          </w:tcPr>
+          <w:p>
+            <w:pPr>
+              <w:jc w:val="right"/>
+            </w:pPr>
+            <w:r>
+              <w:rPr>
+                <w:rFonts w:ascii="Arial" w:cs="Arial" w:eastAsia="Arial" w:hAnsi="Arial"/>
+                <w:b w:val="false"/>
+                <w:bCs w:val="false"/>
+                <w:color w:val="0E3A4E"/>
+                <w:sz w:val="19"/>
+                <w:szCs w:val="19"/>
+              </w:rPr>
+              <w:t xml:space="preserve">$7,680</w:t>
+            </w:r>
+          </w:p>
+        </w:tc>
+        <w:tc>
+          <w:tcPr>
+            <w:tcW w:type="dxa" w:w="1760"/>
+            <w:shd w:fill="FFFFFF" w:color="auto" w:val="clear"/>
+            <w:tcMar>
+              <w:top w:type="dxa" w:w="70"/>
+              <w:left w:type="dxa" w:w="100"/>
+              <w:bottom w:type="dxa" w:w="70"/>
+              <w:right w:type="dxa" w:w="100"/>
+            </w:tcMar>
+          </w:tcPr>
+          <w:p>
+            <w:pPr>
+              <w:jc w:val="right"/>
+            </w:pPr>
+            <w:r>
+              <w:rPr>
+                <w:rFonts w:ascii="Arial" w:cs="Arial" w:eastAsia="Arial" w:hAnsi="Arial"/>
+                <w:b w:val="false"/>
+                <w:bCs w:val="false"/>
+                <w:color w:val="0E3A4E"/>
+                <w:sz w:val="19"/>
+                <w:szCs w:val="19"/>
+              </w:rPr>
+              <w:t xml:space="preserve">~2,900</w:t>
+            </w:r>
+          </w:p>
+        </w:tc>
+      </w:tr>
+      <w:tr>
+        <w:trPr>
+          <w:tblHeader w:val="false"/>
+        </w:trPr>
+        <w:tc>
+          <w:tcPr>
+            <w:tcW w:type="dxa" w:w="4200"/>
+            <w:shd w:fill="F6F9FA" w:color="auto" w:val="clear"/>
+            <w:tcMar>
+              <w:top w:type="dxa" w:w="70"/>
+              <w:left w:type="dxa" w:w="100"/>
+              <w:bottom w:type="dxa" w:w="70"/>
+              <w:right w:type="dxa" w:w="100"/>
+            </w:tcMar>
+          </w:tcPr>
+          <w:p>
+            <w:pPr>
+              <w:jc w:val="left"/>
+            </w:pPr>
+            <w:r>
+              <w:rPr>
+                <w:rFonts w:ascii="Arial" w:cs="Arial" w:eastAsia="Arial" w:hAnsi="Arial"/>
+                <w:b w:val="false"/>
+                <w:bCs w:val="false"/>
+                <w:color w:val="0E3A4E"/>
+                <w:sz w:val="19"/>
+                <w:szCs w:val="19"/>
+              </w:rPr>
+              <w:t xml:space="preserve">Espacios y salas · banner</w:t>
+            </w:r>
+          </w:p>
+        </w:tc>
+        <w:tc>
+          <w:tcPr>
+            <w:tcW w:type="dxa" w:w="1700"/>
+            <w:shd w:fill="F6F9FA" w:color="auto" w:val="clear"/>
+            <w:tcMar>
+              <w:top w:type="dxa" w:w="70"/>
+              <w:left w:type="dxa" w:w="100"/>
+              <w:bottom w:type="dxa" w:w="70"/>
+              <w:right w:type="dxa" w:w="100"/>
+            </w:tcMar>
+          </w:tcPr>
+          <w:p>
+            <w:pPr>
+              <w:jc w:val="right"/>
+            </w:pPr>
+            <w:r>
+              <w:rPr>
+                <w:rFonts w:ascii="Arial" w:cs="Arial" w:eastAsia="Arial" w:hAnsi="Arial"/>
+                <w:b w:val="false"/>
+                <w:bCs w:val="false"/>
+                <w:color w:val="0E3A4E"/>
+                <w:sz w:val="19"/>
+                <w:szCs w:val="19"/>
+              </w:rPr>
+              <w:t xml:space="preserve">$500</w:t>
+            </w:r>
+          </w:p>
+        </w:tc>
+        <w:tc>
+          <w:tcPr>
+            <w:tcW w:type="dxa" w:w="1700"/>
+            <w:shd w:fill="F6F9FA" w:color="auto" w:val="clear"/>
+            <w:tcMar>
+              <w:top w:type="dxa" w:w="70"/>
+              <w:left w:type="dxa" w:w="100"/>
+              <w:bottom w:type="dxa" w:w="70"/>
+              <w:right w:type="dxa" w:w="100"/>
+            </w:tcMar>
+          </w:tcPr>
+          <w:p>
+            <w:pPr>
+              <w:jc w:val="right"/>
+            </w:pPr>
+            <w:r>
+              <w:rPr>
+                <w:rFonts w:ascii="Arial" w:cs="Arial" w:eastAsia="Arial" w:hAnsi="Arial"/>
+                <w:b w:val="false"/>
+                <w:bCs w:val="false"/>
+                <w:color w:val="0E3A4E"/>
+                <w:sz w:val="19"/>
+                <w:szCs w:val="19"/>
+              </w:rPr>
+              <w:t xml:space="preserve">$4,800</w:t>
+            </w:r>
+          </w:p>
+        </w:tc>
+        <w:tc>
+          <w:tcPr>
+            <w:tcW w:type="dxa" w:w="1760"/>
+            <w:shd w:fill="F6F9FA" w:color="auto" w:val="clear"/>
+            <w:tcMar>
+              <w:top w:type="dxa" w:w="70"/>
+              <w:left w:type="dxa" w:w="100"/>
+              <w:bottom w:type="dxa" w:w="70"/>
+              <w:right w:type="dxa" w:w="100"/>
+            </w:tcMar>
+          </w:tcPr>
+          <w:p>
+            <w:pPr>
+              <w:jc w:val="right"/>
+            </w:pPr>
+            <w:r>
+              <w:rPr>
+                <w:rFonts w:ascii="Arial" w:cs="Arial" w:eastAsia="Arial" w:hAnsi="Arial"/>
+                <w:b w:val="false"/>
+                <w:bCs w:val="false"/>
+                <w:color w:val="0E3A4E"/>
+                <w:sz w:val="19"/>
+                <w:szCs w:val="19"/>
+              </w:rPr>
+              <w:t xml:space="preserve">~460</w:t>
+            </w:r>
+          </w:p>
+        </w:tc>
+      </w:tr>
+      <w:tr>
+        <w:trPr>
+          <w:tblHeader w:val="false"/>
+        </w:trPr>
+        <w:tc>
+          <w:tcPr>
+            <w:tcW w:type="dxa" w:w="4200"/>
+            <w:shd w:fill="FFFFFF" w:color="auto" w:val="clear"/>
+            <w:tcMar>
+              <w:top w:type="dxa" w:w="70"/>
+              <w:left w:type="dxa" w:w="100"/>
+              <w:bottom w:type="dxa" w:w="70"/>
+              <w:right w:type="dxa" w:w="100"/>
+            </w:tcMar>
+          </w:tcPr>
+          <w:p>
+            <w:pPr>
+              <w:jc w:val="left"/>
+            </w:pPr>
+            <w:r>
+              <w:rPr>
+                <w:rFonts w:ascii="Arial" w:cs="Arial" w:eastAsia="Arial" w:hAnsi="Arial"/>
+                <w:b w:val="false"/>
+                <w:bCs w:val="false"/>
+                <w:color w:val="0E3A4E"/>
+                <w:sz w:val="19"/>
+                <w:szCs w:val="19"/>
+              </w:rPr>
+              <w:t xml:space="preserve">Noticias y blog · banner</w:t>
+            </w:r>
+          </w:p>
+        </w:tc>
+        <w:tc>
+          <w:tcPr>
+            <w:tcW w:type="dxa" w:w="1700"/>
+            <w:shd w:fill="FFFFFF" w:color="auto" w:val="clear"/>
+            <w:tcMar>
+              <w:top w:type="dxa" w:w="70"/>
+              <w:left w:type="dxa" w:w="100"/>
+              <w:bottom w:type="dxa" w:w="70"/>
+              <w:right w:type="dxa" w:w="100"/>
+            </w:tcMar>
+          </w:tcPr>
+          <w:p>
+            <w:pPr>
+              <w:jc w:val="right"/>
+            </w:pPr>
+            <w:r>
+              <w:rPr>
+                <w:rFonts w:ascii="Arial" w:cs="Arial" w:eastAsia="Arial" w:hAnsi="Arial"/>
+                <w:b w:val="false"/>
+                <w:bCs w:val="false"/>
+                <w:color w:val="0E3A4E"/>
+                <w:sz w:val="19"/>
+                <w:szCs w:val="19"/>
+              </w:rPr>
+              <w:t xml:space="preserve">$500</w:t>
+            </w:r>
+          </w:p>
+        </w:tc>
+        <w:tc>
+          <w:tcPr>
+            <w:tcW w:type="dxa" w:w="1700"/>
+            <w:shd w:fill="FFFFFF" w:color="auto" w:val="clear"/>
+            <w:tcMar>
+              <w:top w:type="dxa" w:w="70"/>
+              <w:left w:type="dxa" w:w="100"/>
+              <w:bottom w:type="dxa" w:w="70"/>
+              <w:right w:type="dxa" w:w="100"/>
+            </w:tcMar>
+          </w:tcPr>
+          <w:p>
+            <w:pPr>
+              <w:jc w:val="right"/>
+            </w:pPr>
+            <w:r>
+              <w:rPr>
+                <w:rFonts w:ascii="Arial" w:cs="Arial" w:eastAsia="Arial" w:hAnsi="Arial"/>
+                <w:b w:val="false"/>
+                <w:bCs w:val="false"/>
+                <w:color w:val="0E3A4E"/>
+                <w:sz w:val="19"/>
+                <w:szCs w:val="19"/>
+              </w:rPr>
+              <w:t xml:space="preserve">$4,800</w:t>
+            </w:r>
+          </w:p>
+        </w:tc>
+        <w:tc>
+          <w:tcPr>
+            <w:tcW w:type="dxa" w:w="1760"/>
+            <w:shd w:fill="FFFFFF" w:color="auto" w:val="clear"/>
+            <w:tcMar>
+              <w:top w:type="dxa" w:w="70"/>
+              <w:left w:type="dxa" w:w="100"/>
+              <w:bottom w:type="dxa" w:w="70"/>
+              <w:right w:type="dxa" w:w="100"/>
+            </w:tcMar>
+          </w:tcPr>
+          <w:p>
+            <w:pPr>
+              <w:jc w:val="right"/>
+            </w:pPr>
+            <w:r>
+              <w:rPr>
+                <w:rFonts w:ascii="Arial" w:cs="Arial" w:eastAsia="Arial" w:hAnsi="Arial"/>
+                <w:b w:val="false"/>
+                <w:bCs w:val="false"/>
+                <w:color w:val="0E3A4E"/>
+                <w:sz w:val="19"/>
+                <w:szCs w:val="19"/>
+              </w:rPr>
+              <w:t xml:space="preserve">por medir</w:t>
+            </w:r>
+          </w:p>
+        </w:tc>
+      </w:tr>
+      <w:tr>
+        <w:trPr>
+          <w:tblHeader w:val="false"/>
+        </w:trPr>
+        <w:tc>
+          <w:tcPr>
+            <w:tcW w:type="dxa" w:w="4200"/>
+            <w:shd w:fill="175772" w:color="auto" w:val="clear"/>
+            <w:tcMar>
+              <w:top w:type="dxa" w:w="70"/>
+              <w:left w:type="dxa" w:w="100"/>
+              <w:bottom w:type="dxa" w:w="70"/>
+              <w:right w:type="dxa" w:w="100"/>
+            </w:tcMar>
+          </w:tcPr>
+          <w:p>
+            <w:pPr>
+              <w:jc w:val="left"/>
+            </w:pPr>
+            <w:r>
+              <w:rPr>
+                <w:rFonts w:ascii="Arial" w:cs="Arial" w:eastAsia="Arial" w:hAnsi="Arial"/>
+                <w:b/>
+                <w:bCs/>
+                <w:color w:val="FFFFFF"/>
+                <w:sz w:val="19"/>
+                <w:szCs w:val="19"/>
+              </w:rPr>
+              <w:t xml:space="preserve">Todos vendidos</w:t>
+            </w:r>
+          </w:p>
+        </w:tc>
+        <w:tc>
+          <w:tcPr>
+            <w:tcW w:type="dxa" w:w="1700"/>
+            <w:shd w:fill="175772" w:color="auto" w:val="clear"/>
+            <w:tcMar>
+              <w:top w:type="dxa" w:w="70"/>
+              <w:left w:type="dxa" w:w="100"/>
+              <w:bottom w:type="dxa" w:w="70"/>
+              <w:right w:type="dxa" w:w="100"/>
+            </w:tcMar>
+          </w:tcPr>
+          <w:p>
+            <w:pPr>
+              <w:jc w:val="right"/>
+            </w:pPr>
+            <w:r>
+              <w:rPr>
+                <w:rFonts w:ascii="Arial" w:cs="Arial" w:eastAsia="Arial" w:hAnsi="Arial"/>
+                <w:b/>
+                <w:bCs/>
+                <w:color w:val="FFFFFF"/>
+                <w:sz w:val="19"/>
+                <w:szCs w:val="19"/>
+              </w:rPr>
+              <w:t xml:space="preserve">$10,300</w:t>
+            </w:r>
+          </w:p>
+        </w:tc>
+        <w:tc>
+          <w:tcPr>
+            <w:tcW w:type="dxa" w:w="1700"/>
+            <w:shd w:fill="175772" w:color="auto" w:val="clear"/>
+            <w:tcMar>
+              <w:top w:type="dxa" w:w="70"/>
+              <w:left w:type="dxa" w:w="100"/>
+              <w:bottom w:type="dxa" w:w="70"/>
+              <w:right w:type="dxa" w:w="100"/>
+            </w:tcMar>
+          </w:tcPr>
+          <w:p>
+            <w:pPr>
+              <w:jc w:val="right"/>
+            </w:pPr>
+            <w:r>
+              <w:rPr>
+                <w:rFonts w:ascii="Arial" w:cs="Arial" w:eastAsia="Arial" w:hAnsi="Arial"/>
+                <w:b/>
+                <w:bCs/>
+                <w:color w:val="A8C243"/>
+                <w:sz w:val="19"/>
+                <w:szCs w:val="19"/>
+              </w:rPr>
+              <w:t xml:space="preserve">$98,880</w:t>
+            </w:r>
+          </w:p>
+        </w:tc>
+        <w:tc>
+          <w:tcPr>
+            <w:tcW w:type="dxa" w:w="1760"/>
+            <w:shd w:fill="175772" w:color="auto" w:val="clear"/>
+            <w:tcMar>
+              <w:top w:type="dxa" w:w="70"/>
+              <w:left w:type="dxa" w:w="100"/>
+              <w:bottom w:type="dxa" w:w="70"/>
+              <w:right w:type="dxa" w:w="100"/>
+            </w:tcMar>
+          </w:tcPr>
+          <w:p>
+            <w:pPr>
+              <w:jc w:val="right"/>
+            </w:pPr>
+            <w:r>
+              <w:rPr>
+                <w:rFonts w:ascii="Arial" w:cs="Arial" w:eastAsia="Arial" w:hAnsi="Arial"/>
+                <w:b/>
+                <w:bCs/>
+                <w:color w:val="A8C243"/>
+                <w:sz w:val="19"/>
+                <w:szCs w:val="19"/>
+              </w:rPr>
+              <w:t xml:space="preserve"/>
+            </w:r>
+          </w:p>
+        </w:tc>
+      </w:tr>
+    </w:tbl>
+    <w:p>
+      <w:pPr>
+        <w:spacing w:after="120" w:before="80"/>
+      </w:pPr>
+      <w:r>
+        <w:rPr>
+          <w:rFonts w:ascii="Arial" w:cs="Arial" w:eastAsia="Arial" w:hAnsi="Arial"/>
+          <w:b/>
+          <w:bCs/>
+          <w:color w:val="0E3A4E"/>
+          <w:sz w:val="22"/>
+          <w:szCs w:val="22"/>
+        </w:rPr>
+        <w:t xml:space="preserve">Con la mitad de los espacios vendidos en contratos anuales (~$49,000 al año), la publicidad cubre toda la Propuesta 2, contenido incluido. </w:t>
+      </w:r>
+      <w:r>
+        <w:rPr>
+          <w:rFonts w:ascii="Arial" w:cs="Arial" w:eastAsia="Arial" w:hAnsi="Arial"/>
+          <w:color w:val="0E3A4E"/>
+          <w:sz w:val="22"/>
+          <w:szCs w:val="22"/>
+        </w:rPr>
+        <w:t xml:space="preserve">Y cada anuncio necesita su banner, que sale de la Parte B.</w:t>
+      </w:r>
+    </w:p>
+    <w:p>
+      <w:pPr>
+        <w:spacing w:after="120" w:before="80"/>
+      </w:pPr>
+      <w:r>
+        <w:rPr>
+          <w:rFonts w:ascii="Arial" w:cs="Arial" w:eastAsia="Arial" w:hAnsi="Arial"/>
+          <w:i/>
+          <w:iCs/>
+          <w:color w:val="3D5866"/>
+          <w:sz w:val="19"/>
+          <w:szCs w:val="19"/>
+        </w:rPr>
+        <w:t xml:space="preserve">Precios de anuncios sin IVA; revisarlos a los tres meses con las impresiones y clics reales del portal.</w:t>
+      </w:r>
+    </w:p>
+    <w:p>
+      <w:pPr>
+        <w:pStyle w:val="Heading1"/>
+        <w:pBdr>
+          <w:bottom w:val="single" w:color="A8C243" w:sz="12" w:space="4"/>
+        </w:pBdr>
+        <w:spacing w:after="120" w:before="240"/>
+      </w:pPr>
+      <w:r>
+        <w:rPr>
+          <w:rFonts w:ascii="Arial" w:cs="Arial" w:eastAsia="Arial" w:hAnsi="Arial"/>
+          <w:b/>
+          <w:bCs/>
+          <w:color w:val="175772"/>
+          <w:sz w:val="32"/>
+          <w:szCs w:val="32"/>
+        </w:rPr>
+        <w:t xml:space="preserve">2.4 Por qué cada herramienta y qué entrega</w:t>
       </w:r>
     </w:p>
     <w:p>
@@ -5391,7 +8061,7 @@
           <w:sz w:val="32"/>
           <w:szCs w:val="32"/>
         </w:rPr>
-        <w:t xml:space="preserve">2.3 Comparativa IA de texto: costo y privacidad</w:t>
+        <w:t xml:space="preserve">2.5 Comparativa IA de texto: costo y privacidad</w:t>
       </w:r>
     </w:p>
     <w:tbl>
@@ -5988,7 +8658,7 @@
           <w:sz w:val="32"/>
           <w:szCs w:val="32"/>
         </w:rPr>
-        <w:t xml:space="preserve">2.4 Comparativa IA de imagen y video</w:t>
+        <w:t xml:space="preserve">2.6 Comparativa IA de imagen y video</w:t>
       </w:r>
     </w:p>
     <w:tbl>
@@ -6752,7 +9422,7 @@
         </w:numPr>
         <w:spacing w:after="60"/>
       </w:pPr>
-      <w:hyperlink w:history="1" r:id="rIds_qqxv_b_7lphqfaauwvv">
+      <w:hyperlink w:history="1" r:id="rId2hh4qwovtkrhl1ka1z3gz">
         <w:r>
           <w:rPr>
             <w:rFonts w:ascii="Arial" w:cs="Arial" w:eastAsia="Arial" w:hAnsi="Arial"/>
@@ -6774,7 +9444,7 @@
         </w:numPr>
         <w:spacing w:after="60"/>
       </w:pPr>
-      <w:hyperlink w:history="1" r:id="rIdoj9etzccahpoj_lnsg1ch">
+      <w:hyperlink w:history="1" r:id="rIdfkuvgwqfsek_sk1si-kmz">
         <w:r>
           <w:rPr>
             <w:rFonts w:ascii="Arial" w:cs="Arial" w:eastAsia="Arial" w:hAnsi="Arial"/>
@@ -6796,7 +9466,7 @@
         </w:numPr>
         <w:spacing w:after="60"/>
       </w:pPr>
-      <w:hyperlink w:history="1" r:id="rIdglvbmdqwnbvwg_9fvov9e">
+      <w:hyperlink w:history="1" r:id="rIdqcfntvk4exbi88dzdqx7q">
         <w:r>
           <w:rPr>
             <w:rFonts w:ascii="Arial" w:cs="Arial" w:eastAsia="Arial" w:hAnsi="Arial"/>
@@ -6818,7 +9488,7 @@
         </w:numPr>
         <w:spacing w:after="60"/>
       </w:pPr>
-      <w:hyperlink w:history="1" r:id="rIdyvmby8-ifsfbvzqmbnp5w">
+      <w:hyperlink w:history="1" r:id="rIdct2lhrc0at6_pglwgzbt9">
         <w:r>
           <w:rPr>
             <w:rFonts w:ascii="Arial" w:cs="Arial" w:eastAsia="Arial" w:hAnsi="Arial"/>
@@ -6840,7 +9510,7 @@
         </w:numPr>
         <w:spacing w:after="60"/>
       </w:pPr>
-      <w:hyperlink w:history="1" r:id="rIdjyjprhyon8bewwdn3d2t3">
+      <w:hyperlink w:history="1" r:id="rId6wlg4ssnneeoelhj54tdh">
         <w:r>
           <w:rPr>
             <w:rFonts w:ascii="Arial" w:cs="Arial" w:eastAsia="Arial" w:hAnsi="Arial"/>
@@ -6855,6 +9525,94 @@
     </w:p>
     <w:p>
       <w:pPr>
+        <w:pStyle w:val="ListParagraph"/>
+        <w:numPr>
+          <w:ilvl w:val="0"/>
+          <w:numId w:val="2"/>
+        </w:numPr>
+        <w:spacing w:after="60"/>
+      </w:pPr>
+      <w:hyperlink w:history="1" r:id="rIds7cj84hxeou2loeb21p1c">
+        <w:r>
+          <w:rPr>
+            <w:rFonts w:ascii="Arial" w:cs="Arial" w:eastAsia="Arial" w:hAnsi="Arial"/>
+            <w:color w:val="039AD1"/>
+            <w:sz w:val="20"/>
+            <w:szCs w:val="20"/>
+            <w:u w:val="single"/>
+          </w:rPr>
+          <w:t xml:space="preserve">Servidor · DigitalOcean</w:t>
+        </w:r>
+      </w:hyperlink>
+    </w:p>
+    <w:p>
+      <w:pPr>
+        <w:pStyle w:val="ListParagraph"/>
+        <w:numPr>
+          <w:ilvl w:val="0"/>
+          <w:numId w:val="2"/>
+        </w:numPr>
+        <w:spacing w:after="60"/>
+      </w:pPr>
+      <w:hyperlink w:history="1" r:id="rIdfv786fz1mz4r73qikzsug">
+        <w:r>
+          <w:rPr>
+            <w:rFonts w:ascii="Arial" w:cs="Arial" w:eastAsia="Arial" w:hAnsi="Arial"/>
+            <w:color w:val="039AD1"/>
+            <w:sz w:val="20"/>
+            <w:szCs w:val="20"/>
+            <w:u w:val="single"/>
+          </w:rPr>
+          <w:t xml:space="preserve">Asistente · console.anthropic.com</w:t>
+        </w:r>
+      </w:hyperlink>
+    </w:p>
+    <w:p>
+      <w:pPr>
+        <w:pStyle w:val="ListParagraph"/>
+        <w:numPr>
+          <w:ilvl w:val="0"/>
+          <w:numId w:val="2"/>
+        </w:numPr>
+        <w:spacing w:after="60"/>
+      </w:pPr>
+      <w:hyperlink w:history="1" r:id="rId0jgtd8snvmdfwxeok61ft">
+        <w:r>
+          <w:rPr>
+            <w:rFonts w:ascii="Arial" w:cs="Arial" w:eastAsia="Arial" w:hAnsi="Arial"/>
+            <w:color w:val="039AD1"/>
+            <w:sz w:val="20"/>
+            <w:szCs w:val="20"/>
+            <w:u w:val="single"/>
+          </w:rPr>
+          <w:t xml:space="preserve">Bitwarden Teams</w:t>
+        </w:r>
+      </w:hyperlink>
+    </w:p>
+    <w:p>
+      <w:pPr>
+        <w:pStyle w:val="ListParagraph"/>
+        <w:numPr>
+          <w:ilvl w:val="0"/>
+          <w:numId w:val="2"/>
+        </w:numPr>
+        <w:spacing w:after="60"/>
+      </w:pPr>
+      <w:hyperlink w:history="1" r:id="rIdl-prfacevrykpp7uvwfjt">
+        <w:r>
+          <w:rPr>
+            <w:rFonts w:ascii="Arial" w:cs="Arial" w:eastAsia="Arial" w:hAnsi="Arial"/>
+            <w:color w:val="039AD1"/>
+            <w:sz w:val="20"/>
+            <w:szCs w:val="20"/>
+            <w:u w:val="single"/>
+          </w:rPr>
+          <w:t xml:space="preserve">Llaves Yubico</w:t>
+        </w:r>
+      </w:hyperlink>
+    </w:p>
+    <w:p>
+      <w:pPr>
         <w:pStyle w:val="Heading1"/>
         <w:pBdr>
           <w:bottom w:val="single" w:color="A8C243" w:sz="12" w:space="4"/>
@@ -6928,6 +9686,25 @@
           <w:szCs w:val="22"/>
         </w:rPr>
         <w:t xml:space="preserve">ManyChat, Metricool e Illustrator: precio en dólares convertido a $19.00 por dólar + 16% de IVA (Illustrator: 5,988 pesos + IVA).</w:t>
+      </w:r>
+    </w:p>
+    <w:p>
+      <w:pPr>
+        <w:pStyle w:val="ListParagraph"/>
+        <w:numPr>
+          <w:ilvl w:val="0"/>
+          <w:numId w:val="2"/>
+        </w:numPr>
+        <w:spacing w:after="60"/>
+      </w:pPr>
+      <w:r>
+        <w:rPr>
+          <w:rFonts w:ascii="Arial" w:cs="Arial" w:eastAsia="Arial" w:hAnsi="Arial"/>
+          <w:color w:val="0E3A4E"/>
+          <w:sz w:val="22"/>
+          <w:szCs w:val="22"/>
+        </w:rPr>
+        <w:t xml:space="preserve">Parte A de la web: precios de la cotización a $18.20 por dólar, sin IVA; aquí se suma el 16% para comparar con lo demás.</w:t>
       </w:r>
     </w:p>
     <w:p>

</xml_diff>

<commit_message>
Presupuesto 2027 en pago anual con costo de año 1 y año 2
Co-Authored-By: Claude Opus 5.5 <noreply@anthropic.com>
Claude-Session: https://claude.ai/code/session_01GFkSYVqa8d2zDX8Qy6Lwpz
</commit_message>
<xml_diff>
--- a/Presupuesto_2027_Comunicacion_y_Web_Poliforum_Leon.docx
+++ b/Presupuesto_2027_Comunicacion_y_Web_Poliforum_Leon.docx
@@ -127,6 +127,20 @@
         <w:t xml:space="preserve">Resumen</w:t>
       </w:r>
     </w:p>
+    <w:p>
+      <w:pPr>
+        <w:spacing w:after="120" w:before="0"/>
+      </w:pPr>
+      <w:r>
+        <w:rPr>
+          <w:rFonts w:ascii="Arial" w:cs="Arial" w:eastAsia="Arial" w:hAnsi="Arial"/>
+          <w:color w:val="0E3A4E"/>
+          <w:sz w:val="22"/>
+          <w:szCs w:val="22"/>
+        </w:rPr>
+        <w:t xml:space="preserve">Todo en pago anual. Cuánto cuesta cada propuesta el primer año (2027) y cada año siguiente.</w:t>
+      </w:r>
+    </w:p>
     <w:tbl>
       <w:tblPr>
         <w:tblW w:type="dxa" w:w="9360"/>
@@ -140,9 +154,9 @@
         </w:tblBorders>
       </w:tblPr>
       <w:tblGrid>
-        <w:gridCol w:w="3120"/>
-        <w:gridCol w:w="4040"/>
-        <w:gridCol w:w="2200"/>
+        <w:gridCol w:w="3600"/>
+        <w:gridCol w:w="2880"/>
+        <w:gridCol w:w="2880"/>
       </w:tblGrid>
       <w:tr>
         <w:trPr>
@@ -150,7 +164,7 @@
         </w:trPr>
         <w:tc>
           <w:tcPr>
-            <w:tcW w:type="dxa" w:w="3120"/>
+            <w:tcW w:type="dxa" w:w="3600"/>
             <w:shd w:fill="DCE6EB" w:color="auto" w:val="clear"/>
             <w:tcMar>
               <w:top w:type="dxa" w:w="70"/>
@@ -178,7 +192,7 @@
         </w:tc>
         <w:tc>
           <w:tcPr>
-            <w:tcW w:type="dxa" w:w="4040"/>
+            <w:tcW w:type="dxa" w:w="2880"/>
             <w:shd w:fill="DCE6EB" w:color="auto" w:val="clear"/>
             <w:tcMar>
               <w:top w:type="dxa" w:w="70"/>
@@ -189,7 +203,7 @@
           </w:tcPr>
           <w:p>
             <w:pPr>
-              <w:jc w:val="left"/>
+              <w:jc w:val="right"/>
             </w:pPr>
             <w:r>
               <w:rPr>
@@ -200,13 +214,13 @@
                 <w:sz w:val="19"/>
                 <w:szCs w:val="19"/>
               </w:rPr>
-              <w:t xml:space="preserve">Qué incluye</w:t>
-            </w:r>
-          </w:p>
-        </w:tc>
-        <w:tc>
-          <w:tcPr>
-            <w:tcW w:type="dxa" w:w="2200"/>
+              <w:t xml:space="preserve">Año 1 · 2027</w:t>
+            </w:r>
+          </w:p>
+        </w:tc>
+        <w:tc>
+          <w:tcPr>
+            <w:tcW w:type="dxa" w:w="2880"/>
             <w:shd w:fill="DCE6EB" w:color="auto" w:val="clear"/>
             <w:tcMar>
               <w:top w:type="dxa" w:w="70"/>
@@ -228,7 +242,7 @@
                 <w:sz w:val="19"/>
                 <w:szCs w:val="19"/>
               </w:rPr>
-              <w:t xml:space="preserve">Total 2027</w:t>
+              <w:t xml:space="preserve">Año 2 en adelante</w:t>
             </w:r>
           </w:p>
         </w:tc>
@@ -239,63 +253,35 @@
         </w:trPr>
         <w:tc>
           <w:tcPr>
-            <w:tcW w:type="dxa" w:w="3120"/>
-            <w:shd w:fill="F6F9FA" w:color="auto" w:val="clear"/>
-            <w:tcMar>
-              <w:top w:type="dxa" w:w="70"/>
-              <w:left w:type="dxa" w:w="100"/>
-              <w:bottom w:type="dxa" w:w="70"/>
-              <w:right w:type="dxa" w:w="100"/>
-            </w:tcMar>
-          </w:tcPr>
-          <w:p>
-            <w:pPr>
-              <w:jc w:val="left"/>
-            </w:pPr>
-            <w:r>
-              <w:rPr>
-                <w:rFonts w:ascii="Arial" w:cs="Arial" w:eastAsia="Arial" w:hAnsi="Arial"/>
-                <w:b w:val="false"/>
-                <w:bCs w:val="false"/>
-                <w:color w:val="0E3A4E"/>
-                <w:sz w:val="19"/>
-                <w:szCs w:val="19"/>
-              </w:rPr>
-              <w:t xml:space="preserve">1 · Comunicación y RRPP</w:t>
-            </w:r>
-          </w:p>
-        </w:tc>
-        <w:tc>
-          <w:tcPr>
-            <w:tcW w:type="dxa" w:w="4040"/>
-            <w:shd w:fill="F6F9FA" w:color="auto" w:val="clear"/>
-            <w:tcMar>
-              <w:top w:type="dxa" w:w="70"/>
-              <w:left w:type="dxa" w:w="100"/>
-              <w:bottom w:type="dxa" w:w="70"/>
-              <w:right w:type="dxa" w:w="100"/>
-            </w:tcMar>
-          </w:tcPr>
-          <w:p>
-            <w:pPr>
-              <w:jc w:val="left"/>
-            </w:pPr>
-            <w:r>
-              <w:rPr>
-                <w:rFonts w:ascii="Arial" w:cs="Arial" w:eastAsia="Arial" w:hAnsi="Arial"/>
-                <w:b w:val="false"/>
-                <w:bCs w:val="false"/>
-                <w:color w:val="0E3A4E"/>
-                <w:sz w:val="19"/>
-                <w:szCs w:val="19"/>
-              </w:rPr>
-              <w:t xml:space="preserve">ManyChat Pro, Metricool Starter, X Premium y cámara de video</w:t>
-            </w:r>
-          </w:p>
-        </w:tc>
-        <w:tc>
-          <w:tcPr>
-            <w:tcW w:type="dxa" w:w="2200"/>
+            <w:tcW w:type="dxa" w:w="3600"/>
+            <w:shd w:fill="F6F9FA" w:color="auto" w:val="clear"/>
+            <w:tcMar>
+              <w:top w:type="dxa" w:w="70"/>
+              <w:left w:type="dxa" w:w="100"/>
+              <w:bottom w:type="dxa" w:w="70"/>
+              <w:right w:type="dxa" w:w="100"/>
+            </w:tcMar>
+          </w:tcPr>
+          <w:p>
+            <w:pPr>
+              <w:jc w:val="left"/>
+            </w:pPr>
+            <w:r>
+              <w:rPr>
+                <w:rFonts w:ascii="Arial" w:cs="Arial" w:eastAsia="Arial" w:hAnsi="Arial"/>
+                <w:b w:val="false"/>
+                <w:bCs w:val="false"/>
+                <w:color w:val="0E3A4E"/>
+                <w:sz w:val="19"/>
+                <w:szCs w:val="19"/>
+              </w:rPr>
+              <w:t xml:space="preserve">1 · Comunicación y RRPP · Plan A (Osmo Pocket 4P)</w:t>
+            </w:r>
+          </w:p>
+        </w:tc>
+        <w:tc>
+          <w:tcPr>
+            <w:tcW w:type="dxa" w:w="2880"/>
             <w:shd w:fill="F6F9FA" w:color="auto" w:val="clear"/>
             <w:tcMar>
               <w:top w:type="dxa" w:w="70"/>
@@ -317,7 +303,35 @@
                 <w:sz w:val="19"/>
                 <w:szCs w:val="19"/>
               </w:rPr>
-              <w:t xml:space="preserve">$27,680–49,980</w:t>
+              <w:t xml:space="preserve">$27,680–28,880</w:t>
+            </w:r>
+          </w:p>
+        </w:tc>
+        <w:tc>
+          <w:tcPr>
+            <w:tcW w:type="dxa" w:w="2880"/>
+            <w:shd w:fill="F6F9FA" w:color="auto" w:val="clear"/>
+            <w:tcMar>
+              <w:top w:type="dxa" w:w="70"/>
+              <w:left w:type="dxa" w:w="100"/>
+              <w:bottom w:type="dxa" w:w="70"/>
+              <w:right w:type="dxa" w:w="100"/>
+            </w:tcMar>
+          </w:tcPr>
+          <w:p>
+            <w:pPr>
+              <w:jc w:val="right"/>
+            </w:pPr>
+            <w:r>
+              <w:rPr>
+                <w:rFonts w:ascii="Arial" w:cs="Arial" w:eastAsia="Arial" w:hAnsi="Arial"/>
+                <w:b/>
+                <w:bCs/>
+                <w:color w:val="0E3A4E"/>
+                <w:sz w:val="19"/>
+                <w:szCs w:val="19"/>
+              </w:rPr>
+              <w:t xml:space="preserve">$14,480</w:t>
             </w:r>
           </w:p>
         </w:tc>
@@ -328,7 +342,7 @@
         </w:trPr>
         <w:tc>
           <w:tcPr>
-            <w:tcW w:type="dxa" w:w="3120"/>
+            <w:tcW w:type="dxa" w:w="3600"/>
             <w:shd w:fill="FFFFFF" w:color="auto" w:val="clear"/>
             <w:tcMar>
               <w:top w:type="dxa" w:w="70"/>
@@ -350,41 +364,13 @@
                 <w:sz w:val="19"/>
                 <w:szCs w:val="19"/>
               </w:rPr>
-              <w:t xml:space="preserve">2 · Página web</w:t>
-            </w:r>
-          </w:p>
-        </w:tc>
-        <w:tc>
-          <w:tcPr>
-            <w:tcW w:type="dxa" w:w="4040"/>
-            <w:shd w:fill="FFFFFF" w:color="auto" w:val="clear"/>
-            <w:tcMar>
-              <w:top w:type="dxa" w:w="70"/>
-              <w:left w:type="dxa" w:w="100"/>
-              <w:bottom w:type="dxa" w:w="70"/>
-              <w:right w:type="dxa" w:w="100"/>
-            </w:tcMar>
-          </w:tcPr>
-          <w:p>
-            <w:pPr>
-              <w:jc w:val="left"/>
-            </w:pPr>
-            <w:r>
-              <w:rPr>
-                <w:rFonts w:ascii="Arial" w:cs="Arial" w:eastAsia="Arial" w:hAnsi="Arial"/>
-                <w:b w:val="false"/>
-                <w:bCs w:val="false"/>
-                <w:color w:val="0E3A4E"/>
-                <w:sz w:val="19"/>
-                <w:szCs w:val="19"/>
-              </w:rPr>
-              <w:t xml:space="preserve">A · Servidor, asistente virtual y seguridad (cotización). B · ChatGPT Business, Magnific Premium+, Adobe Illustrator, Canva Pro y CapCut Pro</w:t>
-            </w:r>
-          </w:p>
-        </w:tc>
-        <w:tc>
-          <w:tcPr>
-            <w:tcW w:type="dxa" w:w="2200"/>
+              <w:t xml:space="preserve">1 · Comunicación y RRPP · Plan B (Sony ZV-E10)</w:t>
+            </w:r>
+          </w:p>
+        </w:tc>
+        <w:tc>
+          <w:tcPr>
+            <w:tcW w:type="dxa" w:w="2880"/>
             <w:shd w:fill="FFFFFF" w:color="auto" w:val="clear"/>
             <w:tcMar>
               <w:top w:type="dxa" w:w="70"/>
@@ -406,7 +392,213 @@
                 <w:sz w:val="19"/>
                 <w:szCs w:val="19"/>
               </w:rPr>
+              <w:t xml:space="preserve">$35,180–39,980</w:t>
+            </w:r>
+          </w:p>
+        </w:tc>
+        <w:tc>
+          <w:tcPr>
+            <w:tcW w:type="dxa" w:w="2880"/>
+            <w:shd w:fill="FFFFFF" w:color="auto" w:val="clear"/>
+            <w:tcMar>
+              <w:top w:type="dxa" w:w="70"/>
+              <w:left w:type="dxa" w:w="100"/>
+              <w:bottom w:type="dxa" w:w="70"/>
+              <w:right w:type="dxa" w:w="100"/>
+            </w:tcMar>
+          </w:tcPr>
+          <w:p>
+            <w:pPr>
+              <w:jc w:val="right"/>
+            </w:pPr>
+            <w:r>
+              <w:rPr>
+                <w:rFonts w:ascii="Arial" w:cs="Arial" w:eastAsia="Arial" w:hAnsi="Arial"/>
+                <w:b/>
+                <w:bCs/>
+                <w:color w:val="0E3A4E"/>
+                <w:sz w:val="19"/>
+                <w:szCs w:val="19"/>
+              </w:rPr>
+              <w:t xml:space="preserve">$14,480</w:t>
+            </w:r>
+          </w:p>
+        </w:tc>
+      </w:tr>
+      <w:tr>
+        <w:trPr>
+          <w:tblHeader w:val="false"/>
+        </w:trPr>
+        <w:tc>
+          <w:tcPr>
+            <w:tcW w:type="dxa" w:w="3600"/>
+            <w:shd w:fill="F6F9FA" w:color="auto" w:val="clear"/>
+            <w:tcMar>
+              <w:top w:type="dxa" w:w="70"/>
+              <w:left w:type="dxa" w:w="100"/>
+              <w:bottom w:type="dxa" w:w="70"/>
+              <w:right w:type="dxa" w:w="100"/>
+            </w:tcMar>
+          </w:tcPr>
+          <w:p>
+            <w:pPr>
+              <w:jc w:val="left"/>
+            </w:pPr>
+            <w:r>
+              <w:rPr>
+                <w:rFonts w:ascii="Arial" w:cs="Arial" w:eastAsia="Arial" w:hAnsi="Arial"/>
+                <w:b w:val="false"/>
+                <w:bCs w:val="false"/>
+                <w:color w:val="0E3A4E"/>
+                <w:sz w:val="19"/>
+                <w:szCs w:val="19"/>
+              </w:rPr>
+              <w:t xml:space="preserve">1 · Comunicación y RRPP · Plan C (Sony ZV-E10 II)</w:t>
+            </w:r>
+          </w:p>
+        </w:tc>
+        <w:tc>
+          <w:tcPr>
+            <w:tcW w:type="dxa" w:w="2880"/>
+            <w:shd w:fill="F6F9FA" w:color="auto" w:val="clear"/>
+            <w:tcMar>
+              <w:top w:type="dxa" w:w="70"/>
+              <w:left w:type="dxa" w:w="100"/>
+              <w:bottom w:type="dxa" w:w="70"/>
+              <w:right w:type="dxa" w:w="100"/>
+            </w:tcMar>
+          </w:tcPr>
+          <w:p>
+            <w:pPr>
+              <w:jc w:val="right"/>
+            </w:pPr>
+            <w:r>
+              <w:rPr>
+                <w:rFonts w:ascii="Arial" w:cs="Arial" w:eastAsia="Arial" w:hAnsi="Arial"/>
+                <w:b/>
+                <w:bCs/>
+                <w:color w:val="0E3A4E"/>
+                <w:sz w:val="19"/>
+                <w:szCs w:val="19"/>
+              </w:rPr>
+              <w:t xml:space="preserve">$46,680–49,980</w:t>
+            </w:r>
+          </w:p>
+        </w:tc>
+        <w:tc>
+          <w:tcPr>
+            <w:tcW w:type="dxa" w:w="2880"/>
+            <w:shd w:fill="F6F9FA" w:color="auto" w:val="clear"/>
+            <w:tcMar>
+              <w:top w:type="dxa" w:w="70"/>
+              <w:left w:type="dxa" w:w="100"/>
+              <w:bottom w:type="dxa" w:w="70"/>
+              <w:right w:type="dxa" w:w="100"/>
+            </w:tcMar>
+          </w:tcPr>
+          <w:p>
+            <w:pPr>
+              <w:jc w:val="right"/>
+            </w:pPr>
+            <w:r>
+              <w:rPr>
+                <w:rFonts w:ascii="Arial" w:cs="Arial" w:eastAsia="Arial" w:hAnsi="Arial"/>
+                <w:b/>
+                <w:bCs/>
+                <w:color w:val="0E3A4E"/>
+                <w:sz w:val="19"/>
+                <w:szCs w:val="19"/>
+              </w:rPr>
+              <w:t xml:space="preserve">$14,480</w:t>
+            </w:r>
+          </w:p>
+        </w:tc>
+      </w:tr>
+      <w:tr>
+        <w:trPr>
+          <w:tblHeader w:val="false"/>
+        </w:trPr>
+        <w:tc>
+          <w:tcPr>
+            <w:tcW w:type="dxa" w:w="3600"/>
+            <w:shd w:fill="FFFFFF" w:color="auto" w:val="clear"/>
+            <w:tcMar>
+              <w:top w:type="dxa" w:w="70"/>
+              <w:left w:type="dxa" w:w="100"/>
+              <w:bottom w:type="dxa" w:w="70"/>
+              <w:right w:type="dxa" w:w="100"/>
+            </w:tcMar>
+          </w:tcPr>
+          <w:p>
+            <w:pPr>
+              <w:jc w:val="left"/>
+            </w:pPr>
+            <w:r>
+              <w:rPr>
+                <w:rFonts w:ascii="Arial" w:cs="Arial" w:eastAsia="Arial" w:hAnsi="Arial"/>
+                <w:b w:val="false"/>
+                <w:bCs w:val="false"/>
+                <w:color w:val="0E3A4E"/>
+                <w:sz w:val="19"/>
+                <w:szCs w:val="19"/>
+              </w:rPr>
+              <w:t xml:space="preserve">2 · Página web</w:t>
+            </w:r>
+          </w:p>
+        </w:tc>
+        <w:tc>
+          <w:tcPr>
+            <w:tcW w:type="dxa" w:w="2880"/>
+            <w:shd w:fill="FFFFFF" w:color="auto" w:val="clear"/>
+            <w:tcMar>
+              <w:top w:type="dxa" w:w="70"/>
+              <w:left w:type="dxa" w:w="100"/>
+              <w:bottom w:type="dxa" w:w="70"/>
+              <w:right w:type="dxa" w:w="100"/>
+            </w:tcMar>
+          </w:tcPr>
+          <w:p>
+            <w:pPr>
+              <w:jc w:val="right"/>
+            </w:pPr>
+            <w:r>
+              <w:rPr>
+                <w:rFonts w:ascii="Arial" w:cs="Arial" w:eastAsia="Arial" w:hAnsi="Arial"/>
+                <w:b/>
+                <w:bCs/>
+                <w:color w:val="0E3A4E"/>
+                <w:sz w:val="19"/>
+                <w:szCs w:val="19"/>
+              </w:rPr>
               <w:t xml:space="preserve">$40,521</w:t>
+            </w:r>
+          </w:p>
+        </w:tc>
+        <w:tc>
+          <w:tcPr>
+            <w:tcW w:type="dxa" w:w="2880"/>
+            <w:shd w:fill="FFFFFF" w:color="auto" w:val="clear"/>
+            <w:tcMar>
+              <w:top w:type="dxa" w:w="70"/>
+              <w:left w:type="dxa" w:w="100"/>
+              <w:bottom w:type="dxa" w:w="70"/>
+              <w:right w:type="dxa" w:w="100"/>
+            </w:tcMar>
+          </w:tcPr>
+          <w:p>
+            <w:pPr>
+              <w:jc w:val="right"/>
+            </w:pPr>
+            <w:r>
+              <w:rPr>
+                <w:rFonts w:ascii="Arial" w:cs="Arial" w:eastAsia="Arial" w:hAnsi="Arial"/>
+                <w:b/>
+                <w:bCs/>
+                <w:color w:val="0E3A4E"/>
+                <w:sz w:val="19"/>
+                <w:szCs w:val="19"/>
+              </w:rPr>
+              <w:t xml:space="preserve">$38,685</w:t>
             </w:r>
           </w:p>
         </w:tc>
@@ -425,7 +617,7 @@
           <w:sz w:val="19"/>
           <w:szCs w:val="19"/>
         </w:rPr>
-        <w:t xml:space="preserve">MXN con IVA. El total de Comunicación depende del plan de cámara (A, B o C). El software se renueva cada año; la cámara se compra una sola vez.</w:t>
+        <w:t xml:space="preserve">MXN con IVA. Comunicación: ManyChat Pro, Metricool Starter y X Premium cada año; la cámara solo el año 1. Página web: servidor, asistente y seguridad (cotización) más ChatGPT, Magnific, Illustrator, Canva y CapCut; las llaves Yubico solo el año 1 y CapCut sube a $2,999 al renovar.</w:t>
       </w:r>
     </w:p>
     <w:p>
@@ -777,7 +969,7 @@
             </w:tcMar>
           </w:tcPr>
           <w:p>
-            <w:hyperlink w:history="1" r:id="rIdf1opnyi2diaagucarqxnq">
+            <w:hyperlink w:history="1" r:id="rIdhflwqqsvha2fs0abi2jcm">
               <w:r>
                 <w:rPr>
                   <w:rFonts w:ascii="Arial" w:cs="Arial" w:eastAsia="Arial" w:hAnsi="Arial"/>
@@ -920,7 +1112,7 @@
             </w:tcMar>
           </w:tcPr>
           <w:p>
-            <w:hyperlink w:history="1" r:id="rId457kdm2oxan9hxexyymaw">
+            <w:hyperlink w:history="1" r:id="rId98mb2h0yj17grtlailo5i">
               <w:r>
                 <w:rPr>
                   <w:rFonts w:ascii="Arial" w:cs="Arial" w:eastAsia="Arial" w:hAnsi="Arial"/>
@@ -1063,7 +1255,7 @@
             </w:tcMar>
           </w:tcPr>
           <w:p>
-            <w:hyperlink w:history="1" r:id="rIdvdcyxlh2dvf-7_do401tu">
+            <w:hyperlink w:history="1" r:id="rIdjgokqwxcpqrcuutoytoxb">
               <w:r>
                 <w:rPr>
                   <w:rFonts w:ascii="Arial" w:cs="Arial" w:eastAsia="Arial" w:hAnsi="Arial"/>
@@ -3603,7 +3795,7 @@
                 <w:sz w:val="19"/>
                 <w:szCs w:val="19"/>
               </w:rPr>
-              <w:t xml:space="preserve">Total</w:t>
+              <w:t xml:space="preserve">Total año 1 · 2027</w:t>
             </w:r>
           </w:p>
         </w:tc>
@@ -3693,6 +3885,31 @@
         </w:tc>
       </w:tr>
     </w:tbl>
+    <w:p>
+      <w:pPr>
+        <w:spacing w:after="120" w:before="80"/>
+      </w:pPr>
+      <w:r>
+        <w:rPr>
+          <w:rFonts w:ascii="Arial" w:cs="Arial" w:eastAsia="Arial" w:hAnsi="Arial"/>
+          <w:b/>
+          <w:bCs/>
+          <w:color w:val="0E3A4E"/>
+          <w:sz w:val="22"/>
+          <w:szCs w:val="22"/>
+        </w:rPr>
+        <w:t xml:space="preserve">Año 2 en adelante: $14,480 al año en los tres planes </w:t>
+      </w:r>
+      <w:r>
+        <w:rPr>
+          <w:rFonts w:ascii="Arial" w:cs="Arial" w:eastAsia="Arial" w:hAnsi="Arial"/>
+          <w:color w:val="0E3A4E"/>
+          <w:sz w:val="22"/>
+          <w:szCs w:val="22"/>
+        </w:rPr>
+        <w:t xml:space="preserve">(solo el software; la cámara ya está comprada).</w:t>
+      </w:r>
+    </w:p>
     <w:p>
       <w:pPr>
         <w:pStyle w:val="Heading2"/>
@@ -3719,7 +3936,7 @@
         </w:numPr>
         <w:spacing w:after="60"/>
       </w:pPr>
-      <w:hyperlink w:history="1" r:id="rIdcqj3bx_qetetcrzsl2jam">
+      <w:hyperlink w:history="1" r:id="rIdun7sbmb-gungcbvejvdfo">
         <w:r>
           <w:rPr>
             <w:rFonts w:ascii="Arial" w:cs="Arial" w:eastAsia="Arial" w:hAnsi="Arial"/>
@@ -3741,7 +3958,7 @@
         </w:numPr>
         <w:spacing w:after="60"/>
       </w:pPr>
-      <w:hyperlink w:history="1" r:id="rIdwjrroackbm_gnn14hlzef">
+      <w:hyperlink w:history="1" r:id="rIdfyfgzhtfn1tr97tnlxjcn">
         <w:r>
           <w:rPr>
             <w:rFonts w:ascii="Arial" w:cs="Arial" w:eastAsia="Arial" w:hAnsi="Arial"/>
@@ -3763,7 +3980,7 @@
         </w:numPr>
         <w:spacing w:after="60"/>
       </w:pPr>
-      <w:hyperlink w:history="1" r:id="rIdcnfptvnca9zwh70shvqjt">
+      <w:hyperlink w:history="1" r:id="rIdp1aruxuulyiwkyxlkx1t8">
         <w:r>
           <w:rPr>
             <w:rFonts w:ascii="Arial" w:cs="Arial" w:eastAsia="Arial" w:hAnsi="Arial"/>
@@ -3785,7 +4002,7 @@
         </w:numPr>
         <w:spacing w:after="60"/>
       </w:pPr>
-      <w:hyperlink w:history="1" r:id="rId2t4tnjibupam9tfmkru_2">
+      <w:hyperlink w:history="1" r:id="rIdajdzjua5x5bwjaa6zl7rj">
         <w:r>
           <w:rPr>
             <w:rFonts w:ascii="Arial" w:cs="Arial" w:eastAsia="Arial" w:hAnsi="Arial"/>
@@ -3807,7 +4024,7 @@
         </w:numPr>
         <w:spacing w:after="60"/>
       </w:pPr>
-      <w:hyperlink w:history="1" r:id="rIdtnx_vkdi-pzipfotu7fic">
+      <w:hyperlink w:history="1" r:id="rIdvuhijc6qf63wyhe4b2mxg">
         <w:r>
           <w:rPr>
             <w:rFonts w:ascii="Arial" w:cs="Arial" w:eastAsia="Arial" w:hAnsi="Arial"/>
@@ -3829,7 +4046,7 @@
         </w:numPr>
         <w:spacing w:after="60"/>
       </w:pPr>
-      <w:hyperlink w:history="1" r:id="rIdfwmyrc04jbselqbkcrlj6">
+      <w:hyperlink w:history="1" r:id="rIdaeceeclgyxpfpvynq1hb7">
         <w:r>
           <w:rPr>
             <w:rFonts w:ascii="Arial" w:cs="Arial" w:eastAsia="Arial" w:hAnsi="Arial"/>
@@ -3851,7 +4068,7 @@
         </w:numPr>
         <w:spacing w:after="60"/>
       </w:pPr>
-      <w:hyperlink w:history="1" r:id="rIdbvdg0on9c2nd21ztsd2cu">
+      <w:hyperlink w:history="1" r:id="rIdizjiwjyo0f1edyprebne7">
         <w:r>
           <w:rPr>
             <w:rFonts w:ascii="Arial" w:cs="Arial" w:eastAsia="Arial" w:hAnsi="Arial"/>
@@ -3873,7 +4090,7 @@
         </w:numPr>
         <w:spacing w:after="60"/>
       </w:pPr>
-      <w:hyperlink w:history="1" r:id="rIdhxyrscjttty92nz2alexh">
+      <w:hyperlink w:history="1" r:id="rIdw8oal1qppx1yif0_hembf">
         <w:r>
           <w:rPr>
             <w:rFonts w:ascii="Arial" w:cs="Arial" w:eastAsia="Arial" w:hAnsi="Arial"/>
@@ -3936,7 +4153,7 @@
           <w:sz w:val="22"/>
           <w:szCs w:val="22"/>
         </w:rPr>
-        <w:t xml:space="preserve">Total primer año: $40,521 MXN con IVA. </w:t>
+        <w:t xml:space="preserve">Año 1: $40,521 · Año 2 en adelante: $38,685 (MXN con IVA). </w:t>
       </w:r>
       <w:r>
         <w:rPr>
@@ -3945,7 +4162,7 @@
           <w:sz w:val="22"/>
           <w:szCs w:val="22"/>
         </w:rPr>
-        <w:t xml:space="preserve">A · Infraestructura y asistente $13,559 + B · Contenido del sitio $26,962.</w:t>
+        <w:t xml:space="preserve">A · Infraestructura y asistente + B · Contenido del sitio.</w:t>
       </w:r>
     </w:p>
     <w:p>
@@ -3995,10 +4212,10 @@
         </w:tblBorders>
       </w:tblPr>
       <w:tblGrid>
-        <w:gridCol w:w="2900"/>
-        <w:gridCol w:w="3660"/>
-        <w:gridCol w:w="1200"/>
-        <w:gridCol w:w="1600"/>
+        <w:gridCol w:w="3000"/>
+        <w:gridCol w:w="3360"/>
+        <w:gridCol w:w="1500"/>
+        <w:gridCol w:w="1500"/>
       </w:tblGrid>
       <w:tr>
         <w:trPr>
@@ -4006,7 +4223,7 @@
         </w:trPr>
         <w:tc>
           <w:tcPr>
-            <w:tcW w:type="dxa" w:w="2900"/>
+            <w:tcW w:type="dxa" w:w="3000"/>
             <w:shd w:fill="DCE6EB" w:color="auto" w:val="clear"/>
             <w:tcMar>
               <w:top w:type="dxa" w:w="70"/>
@@ -4034,7 +4251,7 @@
         </w:tc>
         <w:tc>
           <w:tcPr>
-            <w:tcW w:type="dxa" w:w="3660"/>
+            <w:tcW w:type="dxa" w:w="3360"/>
             <w:shd w:fill="DCE6EB" w:color="auto" w:val="clear"/>
             <w:tcMar>
               <w:top w:type="dxa" w:w="70"/>
@@ -4062,7 +4279,7 @@
         </w:tc>
         <w:tc>
           <w:tcPr>
-            <w:tcW w:type="dxa" w:w="1200"/>
+            <w:tcW w:type="dxa" w:w="1500"/>
             <w:shd w:fill="DCE6EB" w:color="auto" w:val="clear"/>
             <w:tcMar>
               <w:top w:type="dxa" w:w="70"/>
@@ -4084,13 +4301,13 @@
                 <w:sz w:val="19"/>
                 <w:szCs w:val="19"/>
               </w:rPr>
-              <w:t xml:space="preserve">Al mes</w:t>
-            </w:r>
-          </w:p>
-        </w:tc>
-        <w:tc>
-          <w:tcPr>
-            <w:tcW w:type="dxa" w:w="1600"/>
+              <w:t xml:space="preserve">Año 1</w:t>
+            </w:r>
+          </w:p>
+        </w:tc>
+        <w:tc>
+          <w:tcPr>
+            <w:tcW w:type="dxa" w:w="1500"/>
             <w:shd w:fill="DCE6EB" w:color="auto" w:val="clear"/>
             <w:tcMar>
               <w:top w:type="dxa" w:w="70"/>
@@ -4112,7 +4329,7 @@
                 <w:sz w:val="19"/>
                 <w:szCs w:val="19"/>
               </w:rPr>
-              <w:t xml:space="preserve">Al año</w:t>
+              <w:t xml:space="preserve">Año 2 en adelante</w:t>
             </w:r>
           </w:p>
         </w:tc>
@@ -4123,7 +4340,7 @@
         </w:trPr>
         <w:tc>
           <w:tcPr>
-            <w:tcW w:type="dxa" w:w="2900"/>
+            <w:tcW w:type="dxa" w:w="3000"/>
             <w:shd w:fill="F6F9FA" w:color="auto" w:val="clear"/>
             <w:tcMar>
               <w:top w:type="dxa" w:w="70"/>
@@ -4151,7 +4368,7 @@
         </w:tc>
         <w:tc>
           <w:tcPr>
-            <w:tcW w:type="dxa" w:w="3660"/>
+            <w:tcW w:type="dxa" w:w="3360"/>
             <w:shd w:fill="F6F9FA" w:color="auto" w:val="clear"/>
             <w:tcMar>
               <w:top w:type="dxa" w:w="70"/>
@@ -4179,7 +4396,7 @@
         </w:tc>
         <w:tc>
           <w:tcPr>
-            <w:tcW w:type="dxa" w:w="1200"/>
+            <w:tcW w:type="dxa" w:w="1500"/>
             <w:shd w:fill="F6F9FA" w:color="auto" w:val="clear"/>
             <w:tcMar>
               <w:top w:type="dxa" w:w="70"/>
@@ -4201,13 +4418,13 @@
                 <w:sz w:val="19"/>
                 <w:szCs w:val="19"/>
               </w:rPr>
-              <w:t xml:space="preserve">$284</w:t>
-            </w:r>
-          </w:p>
-        </w:tc>
-        <w:tc>
-          <w:tcPr>
-            <w:tcW w:type="dxa" w:w="1600"/>
+              <w:t xml:space="preserve">$3,952</w:t>
+            </w:r>
+          </w:p>
+        </w:tc>
+        <w:tc>
+          <w:tcPr>
+            <w:tcW w:type="dxa" w:w="1500"/>
             <w:shd w:fill="F6F9FA" w:color="auto" w:val="clear"/>
             <w:tcMar>
               <w:top w:type="dxa" w:w="70"/>
@@ -4229,7 +4446,7 @@
                 <w:sz w:val="19"/>
                 <w:szCs w:val="19"/>
               </w:rPr>
-              <w:t xml:space="preserve">$3,407</w:t>
+              <w:t xml:space="preserve">$3,952</w:t>
             </w:r>
           </w:p>
         </w:tc>
@@ -4240,7 +4457,7 @@
         </w:trPr>
         <w:tc>
           <w:tcPr>
-            <w:tcW w:type="dxa" w:w="2900"/>
+            <w:tcW w:type="dxa" w:w="3000"/>
             <w:shd w:fill="FFFFFF" w:color="auto" w:val="clear"/>
             <w:tcMar>
               <w:top w:type="dxa" w:w="70"/>
@@ -4268,7 +4485,7 @@
         </w:tc>
         <w:tc>
           <w:tcPr>
-            <w:tcW w:type="dxa" w:w="3660"/>
+            <w:tcW w:type="dxa" w:w="3360"/>
             <w:shd w:fill="FFFFFF" w:color="auto" w:val="clear"/>
             <w:tcMar>
               <w:top w:type="dxa" w:w="70"/>
@@ -4290,13 +4507,13 @@
                 <w:sz w:val="19"/>
                 <w:szCs w:val="19"/>
               </w:rPr>
-              <w:t xml:space="preserve">Chat que responde a los clientes; con límite de gasto mensual</w:t>
-            </w:r>
-          </w:p>
-        </w:tc>
-        <w:tc>
-          <w:tcPr>
-            <w:tcW w:type="dxa" w:w="1200"/>
+              <w:t xml:space="preserve">Chat que responde a los clientes; con límite de gasto</w:t>
+            </w:r>
+          </w:p>
+        </w:tc>
+        <w:tc>
+          <w:tcPr>
+            <w:tcW w:type="dxa" w:w="1500"/>
             <w:shd w:fill="FFFFFF" w:color="auto" w:val="clear"/>
             <w:tcMar>
               <w:top w:type="dxa" w:w="70"/>
@@ -4318,13 +4535,13 @@
                 <w:sz w:val="19"/>
                 <w:szCs w:val="19"/>
               </w:rPr>
-              <w:t xml:space="preserve">$251</w:t>
-            </w:r>
-          </w:p>
-        </w:tc>
-        <w:tc>
-          <w:tcPr>
-            <w:tcW w:type="dxa" w:w="1600"/>
+              <w:t xml:space="preserve">$3,493</w:t>
+            </w:r>
+          </w:p>
+        </w:tc>
+        <w:tc>
+          <w:tcPr>
+            <w:tcW w:type="dxa" w:w="1500"/>
             <w:shd w:fill="FFFFFF" w:color="auto" w:val="clear"/>
             <w:tcMar>
               <w:top w:type="dxa" w:w="70"/>
@@ -4346,7 +4563,7 @@
                 <w:sz w:val="19"/>
                 <w:szCs w:val="19"/>
               </w:rPr>
-              <w:t xml:space="preserve">$3,011</w:t>
+              <w:t xml:space="preserve">$3,493</w:t>
             </w:r>
           </w:p>
         </w:tc>
@@ -4357,7 +4574,7 @@
         </w:trPr>
         <w:tc>
           <w:tcPr>
-            <w:tcW w:type="dxa" w:w="2900"/>
+            <w:tcW w:type="dxa" w:w="3000"/>
             <w:shd w:fill="F6F9FA" w:color="auto" w:val="clear"/>
             <w:tcMar>
               <w:top w:type="dxa" w:w="70"/>
@@ -4385,7 +4602,7 @@
         </w:tc>
         <w:tc>
           <w:tcPr>
-            <w:tcW w:type="dxa" w:w="3660"/>
+            <w:tcW w:type="dxa" w:w="3360"/>
             <w:shd w:fill="F6F9FA" w:color="auto" w:val="clear"/>
             <w:tcMar>
               <w:top w:type="dxa" w:w="70"/>
@@ -4413,7 +4630,7 @@
         </w:tc>
         <w:tc>
           <w:tcPr>
-            <w:tcW w:type="dxa" w:w="1200"/>
+            <w:tcW w:type="dxa" w:w="1500"/>
             <w:shd w:fill="F6F9FA" w:color="auto" w:val="clear"/>
             <w:tcMar>
               <w:top w:type="dxa" w:w="70"/>
@@ -4435,13 +4652,13 @@
                 <w:sz w:val="19"/>
                 <w:szCs w:val="19"/>
               </w:rPr>
-              <w:t xml:space="preserve">$218</w:t>
-            </w:r>
-          </w:p>
-        </w:tc>
-        <w:tc>
-          <w:tcPr>
-            <w:tcW w:type="dxa" w:w="1600"/>
+              <w:t xml:space="preserve">$3,040</w:t>
+            </w:r>
+          </w:p>
+        </w:tc>
+        <w:tc>
+          <w:tcPr>
+            <w:tcW w:type="dxa" w:w="1500"/>
             <w:shd w:fill="F6F9FA" w:color="auto" w:val="clear"/>
             <w:tcMar>
               <w:top w:type="dxa" w:w="70"/>
@@ -4463,7 +4680,7 @@
                 <w:sz w:val="19"/>
                 <w:szCs w:val="19"/>
               </w:rPr>
-              <w:t xml:space="preserve">$2,621</w:t>
+              <w:t xml:space="preserve">$3,040</w:t>
             </w:r>
           </w:p>
         </w:tc>
@@ -4474,7 +4691,7 @@
         </w:trPr>
         <w:tc>
           <w:tcPr>
-            <w:tcW w:type="dxa" w:w="2900"/>
+            <w:tcW w:type="dxa" w:w="3000"/>
             <w:shd w:fill="FFFFFF" w:color="auto" w:val="clear"/>
             <w:tcMar>
               <w:top w:type="dxa" w:w="70"/>
@@ -4502,7 +4719,7 @@
         </w:tc>
         <w:tc>
           <w:tcPr>
-            <w:tcW w:type="dxa" w:w="3660"/>
+            <w:tcW w:type="dxa" w:w="3360"/>
             <w:shd w:fill="FFFFFF" w:color="auto" w:val="clear"/>
             <w:tcMar>
               <w:top w:type="dxa" w:w="70"/>
@@ -4530,7 +4747,7 @@
         </w:tc>
         <w:tc>
           <w:tcPr>
-            <w:tcW w:type="dxa" w:w="1200"/>
+            <w:tcW w:type="dxa" w:w="1500"/>
             <w:shd w:fill="FFFFFF" w:color="auto" w:val="clear"/>
             <w:tcMar>
               <w:top w:type="dxa" w:w="70"/>
@@ -4552,13 +4769,13 @@
                 <w:sz w:val="19"/>
                 <w:szCs w:val="19"/>
               </w:rPr>
-              <w:t xml:space="preserve">$46</w:t>
-            </w:r>
-          </w:p>
-        </w:tc>
-        <w:tc>
-          <w:tcPr>
-            <w:tcW w:type="dxa" w:w="1600"/>
+              <w:t xml:space="preserve">$638</w:t>
+            </w:r>
+          </w:p>
+        </w:tc>
+        <w:tc>
+          <w:tcPr>
+            <w:tcW w:type="dxa" w:w="1500"/>
             <w:shd w:fill="FFFFFF" w:color="auto" w:val="clear"/>
             <w:tcMar>
               <w:top w:type="dxa" w:w="70"/>
@@ -4580,7 +4797,7 @@
                 <w:sz w:val="19"/>
                 <w:szCs w:val="19"/>
               </w:rPr>
-              <w:t xml:space="preserve">$550</w:t>
+              <w:t xml:space="preserve">$638</w:t>
             </w:r>
           </w:p>
         </w:tc>
@@ -4591,7 +4808,7 @@
         </w:trPr>
         <w:tc>
           <w:tcPr>
-            <w:tcW w:type="dxa" w:w="2900"/>
+            <w:tcW w:type="dxa" w:w="3000"/>
             <w:shd w:fill="F6F9FA" w:color="auto" w:val="clear"/>
             <w:tcMar>
               <w:top w:type="dxa" w:w="70"/>
@@ -4619,7 +4836,7 @@
         </w:tc>
         <w:tc>
           <w:tcPr>
-            <w:tcW w:type="dxa" w:w="3660"/>
+            <w:tcW w:type="dxa" w:w="3360"/>
             <w:shd w:fill="F6F9FA" w:color="auto" w:val="clear"/>
             <w:tcMar>
               <w:top w:type="dxa" w:w="70"/>
@@ -4647,7 +4864,7 @@
         </w:tc>
         <w:tc>
           <w:tcPr>
-            <w:tcW w:type="dxa" w:w="1200"/>
+            <w:tcW w:type="dxa" w:w="1500"/>
             <w:shd w:fill="F6F9FA" w:color="auto" w:val="clear"/>
             <w:tcMar>
               <w:top w:type="dxa" w:w="70"/>
@@ -4675,7 +4892,7 @@
         </w:tc>
         <w:tc>
           <w:tcPr>
-            <w:tcW w:type="dxa" w:w="1600"/>
+            <w:tcW w:type="dxa" w:w="1500"/>
             <w:shd w:fill="F6F9FA" w:color="auto" w:val="clear"/>
             <w:tcMar>
               <w:top w:type="dxa" w:w="70"/>
@@ -4708,7 +4925,7 @@
         </w:trPr>
         <w:tc>
           <w:tcPr>
-            <w:tcW w:type="dxa" w:w="2900"/>
+            <w:tcW w:type="dxa" w:w="3000"/>
             <w:shd w:fill="FFFFFF" w:color="auto" w:val="clear"/>
             <w:tcMar>
               <w:top w:type="dxa" w:w="70"/>
@@ -4730,13 +4947,13 @@
                 <w:sz w:val="19"/>
                 <w:szCs w:val="19"/>
               </w:rPr>
-              <w:t xml:space="preserve">Total recurrente</w:t>
-            </w:r>
-          </w:p>
-        </w:tc>
-        <w:tc>
-          <w:tcPr>
-            <w:tcW w:type="dxa" w:w="3660"/>
+              <w:t xml:space="preserve">4 llaves físicas Yubico</w:t>
+            </w:r>
+          </w:p>
+        </w:tc>
+        <w:tc>
+          <w:tcPr>
+            <w:tcW w:type="dxa" w:w="3360"/>
             <w:shd w:fill="FFFFFF" w:color="auto" w:val="clear"/>
             <w:tcMar>
               <w:top w:type="dxa" w:w="70"/>
@@ -4758,13 +4975,13 @@
                 <w:sz w:val="19"/>
                 <w:szCs w:val="19"/>
               </w:rPr>
-              <w:t xml:space="preserve"/>
-            </w:r>
-          </w:p>
-        </w:tc>
-        <w:tc>
-          <w:tcPr>
-            <w:tcW w:type="dxa" w:w="1200"/>
+              <w:t xml:space="preserve">Nadie entra a las cuentas aunque roben la contraseña; se compran una vez</w:t>
+            </w:r>
+          </w:p>
+        </w:tc>
+        <w:tc>
+          <w:tcPr>
+            <w:tcW w:type="dxa" w:w="1500"/>
             <w:shd w:fill="FFFFFF" w:color="auto" w:val="clear"/>
             <w:tcMar>
               <w:top w:type="dxa" w:w="70"/>
@@ -4786,13 +5003,13 @@
                 <w:sz w:val="19"/>
                 <w:szCs w:val="19"/>
               </w:rPr>
-              <w:t xml:space="preserve">$799</w:t>
-            </w:r>
-          </w:p>
-        </w:tc>
-        <w:tc>
-          <w:tcPr>
-            <w:tcW w:type="dxa" w:w="1600"/>
+              <w:t xml:space="preserve">$2,436</w:t>
+            </w:r>
+          </w:p>
+        </w:tc>
+        <w:tc>
+          <w:tcPr>
+            <w:tcW w:type="dxa" w:w="1500"/>
             <w:shd w:fill="FFFFFF" w:color="auto" w:val="clear"/>
             <w:tcMar>
               <w:top w:type="dxa" w:w="70"/>
@@ -4814,7 +5031,7 @@
                 <w:sz w:val="19"/>
                 <w:szCs w:val="19"/>
               </w:rPr>
-              <w:t xml:space="preserve">$9,589</w:t>
+              <w:t xml:space="preserve">—</w:t>
             </w:r>
           </w:p>
         </w:tc>
@@ -4825,124 +5042,7 @@
         </w:trPr>
         <w:tc>
           <w:tcPr>
-            <w:tcW w:type="dxa" w:w="2900"/>
-            <w:shd w:fill="F6F9FA" w:color="auto" w:val="clear"/>
-            <w:tcMar>
-              <w:top w:type="dxa" w:w="70"/>
-              <w:left w:type="dxa" w:w="100"/>
-              <w:bottom w:type="dxa" w:w="70"/>
-              <w:right w:type="dxa" w:w="100"/>
-            </w:tcMar>
-          </w:tcPr>
-          <w:p>
-            <w:pPr>
-              <w:jc w:val="left"/>
-            </w:pPr>
-            <w:r>
-              <w:rPr>
-                <w:rFonts w:ascii="Arial" w:cs="Arial" w:eastAsia="Arial" w:hAnsi="Arial"/>
-                <w:b w:val="false"/>
-                <w:bCs w:val="false"/>
-                <w:color w:val="0E3A4E"/>
-                <w:sz w:val="19"/>
-                <w:szCs w:val="19"/>
-              </w:rPr>
-              <w:t xml:space="preserve">4 llaves físicas Yubico (un solo pago)</w:t>
-            </w:r>
-          </w:p>
-        </w:tc>
-        <w:tc>
-          <w:tcPr>
-            <w:tcW w:type="dxa" w:w="3660"/>
-            <w:shd w:fill="F6F9FA" w:color="auto" w:val="clear"/>
-            <w:tcMar>
-              <w:top w:type="dxa" w:w="70"/>
-              <w:left w:type="dxa" w:w="100"/>
-              <w:bottom w:type="dxa" w:w="70"/>
-              <w:right w:type="dxa" w:w="100"/>
-            </w:tcMar>
-          </w:tcPr>
-          <w:p>
-            <w:pPr>
-              <w:jc w:val="left"/>
-            </w:pPr>
-            <w:r>
-              <w:rPr>
-                <w:rFonts w:ascii="Arial" w:cs="Arial" w:eastAsia="Arial" w:hAnsi="Arial"/>
-                <w:b w:val="false"/>
-                <w:bCs w:val="false"/>
-                <w:color w:val="0E3A4E"/>
-                <w:sz w:val="19"/>
-                <w:szCs w:val="19"/>
-              </w:rPr>
-              <w:t xml:space="preserve">Nadie entra a las cuentas aunque roben la contraseña</w:t>
-            </w:r>
-          </w:p>
-        </w:tc>
-        <w:tc>
-          <w:tcPr>
-            <w:tcW w:type="dxa" w:w="1200"/>
-            <w:shd w:fill="F6F9FA" w:color="auto" w:val="clear"/>
-            <w:tcMar>
-              <w:top w:type="dxa" w:w="70"/>
-              <w:left w:type="dxa" w:w="100"/>
-              <w:bottom w:type="dxa" w:w="70"/>
-              <w:right w:type="dxa" w:w="100"/>
-            </w:tcMar>
-          </w:tcPr>
-          <w:p>
-            <w:pPr>
-              <w:jc w:val="right"/>
-            </w:pPr>
-            <w:r>
-              <w:rPr>
-                <w:rFonts w:ascii="Arial" w:cs="Arial" w:eastAsia="Arial" w:hAnsi="Arial"/>
-                <w:b w:val="false"/>
-                <w:bCs w:val="false"/>
-                <w:color w:val="0E3A4E"/>
-                <w:sz w:val="19"/>
-                <w:szCs w:val="19"/>
-              </w:rPr>
-              <w:t xml:space="preserve"/>
-            </w:r>
-          </w:p>
-        </w:tc>
-        <w:tc>
-          <w:tcPr>
-            <w:tcW w:type="dxa" w:w="1600"/>
-            <w:shd w:fill="F6F9FA" w:color="auto" w:val="clear"/>
-            <w:tcMar>
-              <w:top w:type="dxa" w:w="70"/>
-              <w:left w:type="dxa" w:w="100"/>
-              <w:bottom w:type="dxa" w:w="70"/>
-              <w:right w:type="dxa" w:w="100"/>
-            </w:tcMar>
-          </w:tcPr>
-          <w:p>
-            <w:pPr>
-              <w:jc w:val="right"/>
-            </w:pPr>
-            <w:r>
-              <w:rPr>
-                <w:rFonts w:ascii="Arial" w:cs="Arial" w:eastAsia="Arial" w:hAnsi="Arial"/>
-                <w:b w:val="false"/>
-                <w:bCs w:val="false"/>
-                <w:color w:val="0E3A4E"/>
-                <w:sz w:val="19"/>
-                <w:szCs w:val="19"/>
-              </w:rPr>
-              <w:t xml:space="preserve">$2,100</w:t>
-            </w:r>
-          </w:p>
-        </w:tc>
-      </w:tr>
-      <w:tr>
-        <w:trPr>
-          <w:tblHeader w:val="false"/>
-        </w:trPr>
-        <w:tc>
-          <w:tcPr>
-            <w:tcW w:type="dxa" w:w="2900"/>
+            <w:tcW w:type="dxa" w:w="3000"/>
             <w:shd w:fill="175772" w:color="auto" w:val="clear"/>
             <w:tcMar>
               <w:top w:type="dxa" w:w="70"/>
@@ -4964,13 +5064,13 @@
                 <w:sz w:val="19"/>
                 <w:szCs w:val="19"/>
               </w:rPr>
-              <w:t xml:space="preserve">Primer año (sin IVA)</w:t>
-            </w:r>
-          </w:p>
-        </w:tc>
-        <w:tc>
-          <w:tcPr>
-            <w:tcW w:type="dxa" w:w="3660"/>
+              <w:t xml:space="preserve">Total Parte A</w:t>
+            </w:r>
+          </w:p>
+        </w:tc>
+        <w:tc>
+          <w:tcPr>
+            <w:tcW w:type="dxa" w:w="3360"/>
             <w:shd w:fill="175772" w:color="auto" w:val="clear"/>
             <w:tcMar>
               <w:top w:type="dxa" w:w="70"/>
@@ -4998,7 +5098,7 @@
         </w:tc>
         <w:tc>
           <w:tcPr>
-            <w:tcW w:type="dxa" w:w="1200"/>
+            <w:tcW w:type="dxa" w:w="1500"/>
             <w:shd w:fill="175772" w:color="auto" w:val="clear"/>
             <w:tcMar>
               <w:top w:type="dxa" w:w="70"/>
@@ -5020,13 +5120,13 @@
                 <w:sz w:val="19"/>
                 <w:szCs w:val="19"/>
               </w:rPr>
-              <w:t xml:space="preserve"/>
-            </w:r>
-          </w:p>
-        </w:tc>
-        <w:tc>
-          <w:tcPr>
-            <w:tcW w:type="dxa" w:w="1600"/>
+              <w:t xml:space="preserve">$13,559</w:t>
+            </w:r>
+          </w:p>
+        </w:tc>
+        <w:tc>
+          <w:tcPr>
+            <w:tcW w:type="dxa" w:w="1500"/>
             <w:shd w:fill="175772" w:color="auto" w:val="clear"/>
             <w:tcMar>
               <w:top w:type="dxa" w:w="70"/>
@@ -5048,7 +5148,7 @@
                 <w:sz w:val="19"/>
                 <w:szCs w:val="19"/>
               </w:rPr>
-              <w:t xml:space="preserve">$11,689</w:t>
+              <w:t xml:space="preserve">$11,123</w:t>
             </w:r>
           </w:p>
         </w:tc>
@@ -5067,21 +5167,7 @@
           <w:sz w:val="19"/>
           <w:szCs w:val="19"/>
         </w:rPr>
-        <w:t xml:space="preserve">Precios de la cotización al 9 de octubre de 2026, a $18.20 por dólar, sin IVA. Con IVA: $13,559 el primer año. El asistente cobra por conversación (~270 al mes con 9,000 visitantes) y tiene límite de gasto mensual. La cotización no incluye sesión de fotos ni herramientas de diseño o de IA del equipo: eso es la Parte B.</w:t>
-      </w:r>
-    </w:p>
-    <w:p>
-      <w:pPr>
-        <w:spacing w:after="120" w:before="0"/>
-      </w:pPr>
-      <w:r>
-        <w:rPr>
-          <w:rFonts w:ascii="Arial" w:cs="Arial" w:eastAsia="Arial" w:hAnsi="Arial"/>
-          <w:color w:val="0E3A4E"/>
-          <w:sz w:val="22"/>
-          <w:szCs w:val="22"/>
-        </w:rPr>
-        <w:t xml:space="preserve">El diseño y desarrollo del sitio cubren la estructura, pero un sitio que vende necesita imágenes, textos, planos y videos actualizados para cada evento. Con estas licencias, Comunicación y RRPP produce y mantiene ese contenido sin pagar a proveedores externos por cada cambio. Son pagos anuales con descuento, y cada herramienta tiene un entregable concreto en el sitio.</w:t>
+        <w:t xml:space="preserve">Cotización al 9 de octubre de 2026 ($18.20 por dólar), convertida a pago anual con 16% de IVA para comparar con lo demás. Sin IVA: $11,689 el año 1 y $9,589 los siguientes. El asistente cobra por conversación (~3,240 al año con el tráfico actual) y tiene límite de gasto. La cotización no incluye sesión de fotos ni herramientas de diseño o de IA del equipo: eso es la Parte B.</w:t>
       </w:r>
     </w:p>
     <w:p>
@@ -5249,7 +5335,7 @@
                 <w:sz w:val="19"/>
                 <w:szCs w:val="19"/>
               </w:rPr>
-              <w:t xml:space="preserve">Ahorro vs mensual</w:t>
+              <w:t xml:space="preserve">Ahorro vs pagar mes a mes</w:t>
             </w:r>
           </w:p>
         </w:tc>
@@ -5410,7 +5496,7 @@
             </w:tcMar>
           </w:tcPr>
           <w:p>
-            <w:hyperlink w:history="1" r:id="rId5dnt6idjrthq3_7gilqcz">
+            <w:hyperlink w:history="1" r:id="rIdvonpkoqyp8mxl20az4ijh">
               <w:r>
                 <w:rPr>
                   <w:rFonts w:ascii="Arial" w:cs="Arial" w:eastAsia="Arial" w:hAnsi="Arial"/>
@@ -5553,7 +5639,7 @@
             </w:tcMar>
           </w:tcPr>
           <w:p>
-            <w:hyperlink w:history="1" r:id="rIdfwvxc3udempky-o8fdq2h">
+            <w:hyperlink w:history="1" r:id="rId_6vkyogdfjxcyjvx-o0e4">
               <w:r>
                 <w:rPr>
                   <w:rFonts w:ascii="Arial" w:cs="Arial" w:eastAsia="Arial" w:hAnsi="Arial"/>
@@ -5696,7 +5782,7 @@
             </w:tcMar>
           </w:tcPr>
           <w:p>
-            <w:hyperlink w:history="1" r:id="rIdq8ljoycskaw-3bjp-duqq">
+            <w:hyperlink w:history="1" r:id="rIdei1qyoo_tnm05nrunwvws">
               <w:r>
                 <w:rPr>
                   <w:rFonts w:ascii="Arial" w:cs="Arial" w:eastAsia="Arial" w:hAnsi="Arial"/>
@@ -5839,7 +5925,7 @@
             </w:tcMar>
           </w:tcPr>
           <w:p>
-            <w:hyperlink w:history="1" r:id="rIdvbeu-wiyf87y6ckmak9ko">
+            <w:hyperlink w:history="1" r:id="rIdfb5t6gfv0g7crbioajqjn">
               <w:r>
                 <w:rPr>
                   <w:rFonts w:ascii="Arial" w:cs="Arial" w:eastAsia="Arial" w:hAnsi="Arial"/>
@@ -5982,7 +6068,7 @@
             </w:tcMar>
           </w:tcPr>
           <w:p>
-            <w:hyperlink w:history="1" r:id="rIdr7vdbznw4sia4uz2semzw">
+            <w:hyperlink w:history="1" r:id="rIdsruona0g1foftiv6r_uxr">
               <w:r>
                 <w:rPr>
                   <w:rFonts w:ascii="Arial" w:cs="Arial" w:eastAsia="Arial" w:hAnsi="Arial"/>
@@ -6025,7 +6111,7 @@
                 <w:sz w:val="19"/>
                 <w:szCs w:val="19"/>
               </w:rPr>
-              <w:t xml:space="preserve">Total</w:t>
+              <w:t xml:space="preserve">Total año 1</w:t>
             </w:r>
           </w:p>
         </w:tc>
@@ -6156,7 +6242,7 @@
           <w:sz w:val="19"/>
           <w:szCs w:val="19"/>
         </w:rPr>
-        <w:t xml:space="preserve">CapCut: $2,399 el primer año, renueva en $2,999. ChatGPT: la página mostró impuesto estimado $0; confirmar si se suma IVA al cobrar.</w:t>
+        <w:t xml:space="preserve">Año 2 en adelante: $27,562 (CapCut renueva en $2,999). ChatGPT: la página mostró impuesto estimado $0; confirmar si se suma IVA al cobrar.</w:t>
       </w:r>
     </w:p>
     <w:p>
@@ -6177,281 +6263,6 @@
           <w:szCs w:val="32"/>
         </w:rPr>
         <w:t xml:space="preserve">2.3 Total y publicidad: la web se paga sola</w:t>
-      </w:r>
-    </w:p>
-    <w:tbl>
-      <w:tblPr>
-        <w:tblW w:type="dxa" w:w="9360"/>
-        <w:tblBorders>
-          <w:top w:val="single" w:color="auto" w:sz="4"/>
-          <w:left w:val="single" w:color="auto" w:sz="4"/>
-          <w:bottom w:val="single" w:color="auto" w:sz="4"/>
-          <w:right w:val="single" w:color="auto" w:sz="4"/>
-          <w:insideH w:val="single" w:color="auto" w:sz="4"/>
-          <w:insideV w:val="single" w:color="auto" w:sz="4"/>
-        </w:tblBorders>
-      </w:tblPr>
-      <w:tblGrid>
-        <w:gridCol w:w="4680"/>
-        <w:gridCol w:w="4680"/>
-      </w:tblGrid>
-      <w:tr>
-        <w:trPr>
-          <w:tblHeader/>
-        </w:trPr>
-        <w:tc>
-          <w:tcPr>
-            <w:tcW w:type="dxa" w:w="4680"/>
-            <w:shd w:fill="DCE6EB" w:color="auto" w:val="clear"/>
-            <w:tcMar>
-              <w:top w:type="dxa" w:w="70"/>
-              <w:left w:type="dxa" w:w="100"/>
-              <w:bottom w:type="dxa" w:w="70"/>
-              <w:right w:type="dxa" w:w="100"/>
-            </w:tcMar>
-          </w:tcPr>
-          <w:p>
-            <w:pPr>
-              <w:jc w:val="left"/>
-            </w:pPr>
-            <w:r>
-              <w:rPr>
-                <w:rFonts w:ascii="Arial" w:cs="Arial" w:eastAsia="Arial" w:hAnsi="Arial"/>
-                <w:b/>
-                <w:bCs/>
-                <w:color w:val="0E3A4E"/>
-                <w:sz w:val="19"/>
-                <w:szCs w:val="19"/>
-              </w:rPr>
-              <w:t xml:space="preserve">Concepto</w:t>
-            </w:r>
-          </w:p>
-        </w:tc>
-        <w:tc>
-          <w:tcPr>
-            <w:tcW w:type="dxa" w:w="4680"/>
-            <w:shd w:fill="DCE6EB" w:color="auto" w:val="clear"/>
-            <w:tcMar>
-              <w:top w:type="dxa" w:w="70"/>
-              <w:left w:type="dxa" w:w="100"/>
-              <w:bottom w:type="dxa" w:w="70"/>
-              <w:right w:type="dxa" w:w="100"/>
-            </w:tcMar>
-          </w:tcPr>
-          <w:p>
-            <w:pPr>
-              <w:jc w:val="right"/>
-            </w:pPr>
-            <w:r>
-              <w:rPr>
-                <w:rFonts w:ascii="Arial" w:cs="Arial" w:eastAsia="Arial" w:hAnsi="Arial"/>
-                <w:b/>
-                <w:bCs/>
-                <w:color w:val="0E3A4E"/>
-                <w:sz w:val="19"/>
-                <w:szCs w:val="19"/>
-              </w:rPr>
-              <w:t xml:space="preserve">Primer año</w:t>
-            </w:r>
-          </w:p>
-        </w:tc>
-      </w:tr>
-      <w:tr>
-        <w:trPr>
-          <w:tblHeader w:val="false"/>
-        </w:trPr>
-        <w:tc>
-          <w:tcPr>
-            <w:tcW w:type="dxa" w:w="4680"/>
-            <w:shd w:fill="F6F9FA" w:color="auto" w:val="clear"/>
-            <w:tcMar>
-              <w:top w:type="dxa" w:w="70"/>
-              <w:left w:type="dxa" w:w="100"/>
-              <w:bottom w:type="dxa" w:w="70"/>
-              <w:right w:type="dxa" w:w="100"/>
-            </w:tcMar>
-          </w:tcPr>
-          <w:p>
-            <w:pPr>
-              <w:jc w:val="left"/>
-            </w:pPr>
-            <w:r>
-              <w:rPr>
-                <w:rFonts w:ascii="Arial" w:cs="Arial" w:eastAsia="Arial" w:hAnsi="Arial"/>
-                <w:b w:val="false"/>
-                <w:bCs w:val="false"/>
-                <w:color w:val="0E3A4E"/>
-                <w:sz w:val="19"/>
-                <w:szCs w:val="19"/>
-              </w:rPr>
-              <w:t xml:space="preserve">A · Infraestructura y asistente (con IVA)</w:t>
-            </w:r>
-          </w:p>
-        </w:tc>
-        <w:tc>
-          <w:tcPr>
-            <w:tcW w:type="dxa" w:w="4680"/>
-            <w:shd w:fill="F6F9FA" w:color="auto" w:val="clear"/>
-            <w:tcMar>
-              <w:top w:type="dxa" w:w="70"/>
-              <w:left w:type="dxa" w:w="100"/>
-              <w:bottom w:type="dxa" w:w="70"/>
-              <w:right w:type="dxa" w:w="100"/>
-            </w:tcMar>
-          </w:tcPr>
-          <w:p>
-            <w:pPr>
-              <w:jc w:val="right"/>
-            </w:pPr>
-            <w:r>
-              <w:rPr>
-                <w:rFonts w:ascii="Arial" w:cs="Arial" w:eastAsia="Arial" w:hAnsi="Arial"/>
-                <w:b w:val="false"/>
-                <w:bCs w:val="false"/>
-                <w:color w:val="0E3A4E"/>
-                <w:sz w:val="19"/>
-                <w:szCs w:val="19"/>
-              </w:rPr>
-              <w:t xml:space="preserve">$13,559</w:t>
-            </w:r>
-          </w:p>
-        </w:tc>
-      </w:tr>
-      <w:tr>
-        <w:trPr>
-          <w:tblHeader w:val="false"/>
-        </w:trPr>
-        <w:tc>
-          <w:tcPr>
-            <w:tcW w:type="dxa" w:w="4680"/>
-            <w:shd w:fill="FFFFFF" w:color="auto" w:val="clear"/>
-            <w:tcMar>
-              <w:top w:type="dxa" w:w="70"/>
-              <w:left w:type="dxa" w:w="100"/>
-              <w:bottom w:type="dxa" w:w="70"/>
-              <w:right w:type="dxa" w:w="100"/>
-            </w:tcMar>
-          </w:tcPr>
-          <w:p>
-            <w:pPr>
-              <w:jc w:val="left"/>
-            </w:pPr>
-            <w:r>
-              <w:rPr>
-                <w:rFonts w:ascii="Arial" w:cs="Arial" w:eastAsia="Arial" w:hAnsi="Arial"/>
-                <w:b w:val="false"/>
-                <w:bCs w:val="false"/>
-                <w:color w:val="0E3A4E"/>
-                <w:sz w:val="19"/>
-                <w:szCs w:val="19"/>
-              </w:rPr>
-              <w:t xml:space="preserve">B · Contenido del sitio (con IVA)</w:t>
-            </w:r>
-          </w:p>
-        </w:tc>
-        <w:tc>
-          <w:tcPr>
-            <w:tcW w:type="dxa" w:w="4680"/>
-            <w:shd w:fill="FFFFFF" w:color="auto" w:val="clear"/>
-            <w:tcMar>
-              <w:top w:type="dxa" w:w="70"/>
-              <w:left w:type="dxa" w:w="100"/>
-              <w:bottom w:type="dxa" w:w="70"/>
-              <w:right w:type="dxa" w:w="100"/>
-            </w:tcMar>
-          </w:tcPr>
-          <w:p>
-            <w:pPr>
-              <w:jc w:val="right"/>
-            </w:pPr>
-            <w:r>
-              <w:rPr>
-                <w:rFonts w:ascii="Arial" w:cs="Arial" w:eastAsia="Arial" w:hAnsi="Arial"/>
-                <w:b w:val="false"/>
-                <w:bCs w:val="false"/>
-                <w:color w:val="0E3A4E"/>
-                <w:sz w:val="19"/>
-                <w:szCs w:val="19"/>
-              </w:rPr>
-              <w:t xml:space="preserve">$26,962</w:t>
-            </w:r>
-          </w:p>
-        </w:tc>
-      </w:tr>
-      <w:tr>
-        <w:trPr>
-          <w:tblHeader w:val="false"/>
-        </w:trPr>
-        <w:tc>
-          <w:tcPr>
-            <w:tcW w:type="dxa" w:w="4680"/>
-            <w:shd w:fill="175772" w:color="auto" w:val="clear"/>
-            <w:tcMar>
-              <w:top w:type="dxa" w:w="70"/>
-              <w:left w:type="dxa" w:w="100"/>
-              <w:bottom w:type="dxa" w:w="70"/>
-              <w:right w:type="dxa" w:w="100"/>
-            </w:tcMar>
-          </w:tcPr>
-          <w:p>
-            <w:pPr>
-              <w:jc w:val="left"/>
-            </w:pPr>
-            <w:r>
-              <w:rPr>
-                <w:rFonts w:ascii="Arial" w:cs="Arial" w:eastAsia="Arial" w:hAnsi="Arial"/>
-                <w:b/>
-                <w:bCs/>
-                <w:color w:val="FFFFFF"/>
-                <w:sz w:val="19"/>
-                <w:szCs w:val="19"/>
-              </w:rPr>
-              <w:t xml:space="preserve">Total Propuesta 2</w:t>
-            </w:r>
-          </w:p>
-        </w:tc>
-        <w:tc>
-          <w:tcPr>
-            <w:tcW w:type="dxa" w:w="4680"/>
-            <w:shd w:fill="175772" w:color="auto" w:val="clear"/>
-            <w:tcMar>
-              <w:top w:type="dxa" w:w="70"/>
-              <w:left w:type="dxa" w:w="100"/>
-              <w:bottom w:type="dxa" w:w="70"/>
-              <w:right w:type="dxa" w:w="100"/>
-            </w:tcMar>
-          </w:tcPr>
-          <w:p>
-            <w:pPr>
-              <w:jc w:val="right"/>
-            </w:pPr>
-            <w:r>
-              <w:rPr>
-                <w:rFonts w:ascii="Arial" w:cs="Arial" w:eastAsia="Arial" w:hAnsi="Arial"/>
-                <w:b/>
-                <w:bCs/>
-                <w:color w:val="FFFFFF"/>
-                <w:sz w:val="19"/>
-                <w:szCs w:val="19"/>
-              </w:rPr>
-              <w:t xml:space="preserve">$40,521</w:t>
-            </w:r>
-          </w:p>
-        </w:tc>
-      </w:tr>
-    </w:tbl>
-    <w:p>
-      <w:pPr>
-        <w:spacing w:after="120" w:before="120"/>
-      </w:pPr>
-      <w:r>
-        <w:rPr>
-          <w:rFonts w:ascii="Arial" w:cs="Arial" w:eastAsia="Arial" w:hAnsi="Arial"/>
-          <w:color w:val="0E3A4E"/>
-          <w:sz w:val="22"/>
-          <w:szCs w:val="22"/>
-        </w:rPr>
-        <w:t xml:space="preserve">La web nueva trae 8 espacios para anuncios que el equipo administra desde el portal. Precios de la cotización, con base en el tráfico real (reporte de Quimaira, enero a octubre de 2026):</w:t>
       </w:r>
     </w:p>
     <w:tbl>
@@ -6468,9 +6279,8 @@
       </w:tblPr>
       <w:tblGrid>
         <w:gridCol w:w="4200"/>
-        <w:gridCol w:w="1700"/>
-        <w:gridCol w:w="1700"/>
-        <w:gridCol w:w="1760"/>
+        <w:gridCol w:w="2580"/>
+        <w:gridCol w:w="2580"/>
       </w:tblGrid>
       <w:tr>
         <w:trPr>
@@ -6500,13 +6310,13 @@
                 <w:sz w:val="19"/>
                 <w:szCs w:val="19"/>
               </w:rPr>
-              <w:t xml:space="preserve">Espacio</w:t>
-            </w:r>
-          </w:p>
-        </w:tc>
-        <w:tc>
-          <w:tcPr>
-            <w:tcW w:type="dxa" w:w="1700"/>
+              <w:t xml:space="preserve">Concepto</w:t>
+            </w:r>
+          </w:p>
+        </w:tc>
+        <w:tc>
+          <w:tcPr>
+            <w:tcW w:type="dxa" w:w="2580"/>
             <w:shd w:fill="DCE6EB" w:color="auto" w:val="clear"/>
             <w:tcMar>
               <w:top w:type="dxa" w:w="70"/>
@@ -6528,13 +6338,13 @@
                 <w:sz w:val="19"/>
                 <w:szCs w:val="19"/>
               </w:rPr>
-              <w:t xml:space="preserve">Por mes</w:t>
-            </w:r>
-          </w:p>
-        </w:tc>
-        <w:tc>
-          <w:tcPr>
-            <w:tcW w:type="dxa" w:w="1700"/>
+              <w:t xml:space="preserve">Año 1 · 2027</w:t>
+            </w:r>
+          </w:p>
+        </w:tc>
+        <w:tc>
+          <w:tcPr>
+            <w:tcW w:type="dxa" w:w="2580"/>
             <w:shd w:fill="DCE6EB" w:color="auto" w:val="clear"/>
             <w:tcMar>
               <w:top w:type="dxa" w:w="70"/>
@@ -6556,35 +6366,7 @@
                 <w:sz w:val="19"/>
                 <w:szCs w:val="19"/>
               </w:rPr>
-              <w:t xml:space="preserve">12 meses (−20%)</w:t>
-            </w:r>
-          </w:p>
-        </w:tc>
-        <w:tc>
-          <w:tcPr>
-            <w:tcW w:type="dxa" w:w="1760"/>
-            <w:shd w:fill="DCE6EB" w:color="auto" w:val="clear"/>
-            <w:tcMar>
-              <w:top w:type="dxa" w:w="70"/>
-              <w:left w:type="dxa" w:w="100"/>
-              <w:bottom w:type="dxa" w:w="70"/>
-              <w:right w:type="dxa" w:w="100"/>
-            </w:tcMar>
-          </w:tcPr>
-          <w:p>
-            <w:pPr>
-              <w:jc w:val="right"/>
-            </w:pPr>
-            <w:r>
-              <w:rPr>
-                <w:rFonts w:ascii="Arial" w:cs="Arial" w:eastAsia="Arial" w:hAnsi="Arial"/>
-                <w:b/>
-                <w:bCs/>
-                <w:color w:val="0E3A4E"/>
-                <w:sz w:val="19"/>
-                <w:szCs w:val="19"/>
-              </w:rPr>
-              <w:t xml:space="preserve">Vistas al mes</w:t>
+              <w:t xml:space="preserve">Año 2 en adelante</w:t>
             </w:r>
           </w:p>
         </w:tc>
@@ -6617,13 +6399,13 @@
                 <w:sz w:val="19"/>
                 <w:szCs w:val="19"/>
               </w:rPr>
-              <w:t xml:space="preserve">Ventana al entrar</w:t>
-            </w:r>
-          </w:p>
-        </w:tc>
-        <w:tc>
-          <w:tcPr>
-            <w:tcW w:type="dxa" w:w="1700"/>
+              <w:t xml:space="preserve">A · Infraestructura y asistente</w:t>
+            </w:r>
+          </w:p>
+        </w:tc>
+        <w:tc>
+          <w:tcPr>
+            <w:tcW w:type="dxa" w:w="2580"/>
             <w:shd w:fill="F6F9FA" w:color="auto" w:val="clear"/>
             <w:tcMar>
               <w:top w:type="dxa" w:w="70"/>
@@ -6645,13 +6427,13 @@
                 <w:sz w:val="19"/>
                 <w:szCs w:val="19"/>
               </w:rPr>
-              <w:t xml:space="preserve">$3,000</w:t>
-            </w:r>
-          </w:p>
-        </w:tc>
-        <w:tc>
-          <w:tcPr>
-            <w:tcW w:type="dxa" w:w="1700"/>
+              <w:t xml:space="preserve">$13,559</w:t>
+            </w:r>
+          </w:p>
+        </w:tc>
+        <w:tc>
+          <w:tcPr>
+            <w:tcW w:type="dxa" w:w="2580"/>
             <w:shd w:fill="F6F9FA" w:color="auto" w:val="clear"/>
             <w:tcMar>
               <w:top w:type="dxa" w:w="70"/>
@@ -6673,35 +6455,7 @@
                 <w:sz w:val="19"/>
                 <w:szCs w:val="19"/>
               </w:rPr>
-              <w:t xml:space="preserve">$28,800</w:t>
-            </w:r>
-          </w:p>
-        </w:tc>
-        <w:tc>
-          <w:tcPr>
-            <w:tcW w:type="dxa" w:w="1760"/>
-            <w:shd w:fill="F6F9FA" w:color="auto" w:val="clear"/>
-            <w:tcMar>
-              <w:top w:type="dxa" w:w="70"/>
-              <w:left w:type="dxa" w:w="100"/>
-              <w:bottom w:type="dxa" w:w="70"/>
-              <w:right w:type="dxa" w:w="100"/>
-            </w:tcMar>
-          </w:tcPr>
-          <w:p>
-            <w:pPr>
-              <w:jc w:val="right"/>
-            </w:pPr>
-            <w:r>
-              <w:rPr>
-                <w:rFonts w:ascii="Arial" w:cs="Arial" w:eastAsia="Arial" w:hAnsi="Arial"/>
-                <w:b w:val="false"/>
-                <w:bCs w:val="false"/>
-                <w:color w:val="0E3A4E"/>
-                <w:sz w:val="19"/>
-                <w:szCs w:val="19"/>
-              </w:rPr>
-              <w:t xml:space="preserve">~9,000</w:t>
+              <w:t xml:space="preserve">$11,123</w:t>
             </w:r>
           </w:p>
         </w:tc>
@@ -6734,13 +6488,13 @@
                 <w:sz w:val="19"/>
                 <w:szCs w:val="19"/>
               </w:rPr>
-              <w:t xml:space="preserve">Calendario · banner arriba y abajo</w:t>
-            </w:r>
-          </w:p>
-        </w:tc>
-        <w:tc>
-          <w:tcPr>
-            <w:tcW w:type="dxa" w:w="1700"/>
+              <w:t xml:space="preserve">B · Contenido del sitio</w:t>
+            </w:r>
+          </w:p>
+        </w:tc>
+        <w:tc>
+          <w:tcPr>
+            <w:tcW w:type="dxa" w:w="2580"/>
             <w:shd w:fill="FFFFFF" w:color="auto" w:val="clear"/>
             <w:tcMar>
               <w:top w:type="dxa" w:w="70"/>
@@ -6762,13 +6516,13 @@
                 <w:sz w:val="19"/>
                 <w:szCs w:val="19"/>
               </w:rPr>
-              <w:t xml:space="preserve">$1,800</w:t>
-            </w:r>
-          </w:p>
-        </w:tc>
-        <w:tc>
-          <w:tcPr>
-            <w:tcW w:type="dxa" w:w="1700"/>
+              <w:t xml:space="preserve">$26,962</w:t>
+            </w:r>
+          </w:p>
+        </w:tc>
+        <w:tc>
+          <w:tcPr>
+            <w:tcW w:type="dxa" w:w="2580"/>
             <w:shd w:fill="FFFFFF" w:color="auto" w:val="clear"/>
             <w:tcMar>
               <w:top w:type="dxa" w:w="70"/>
@@ -6790,35 +6544,7 @@
                 <w:sz w:val="19"/>
                 <w:szCs w:val="19"/>
               </w:rPr>
-              <w:t xml:space="preserve">$17,280</w:t>
-            </w:r>
-          </w:p>
-        </w:tc>
-        <w:tc>
-          <w:tcPr>
-            <w:tcW w:type="dxa" w:w="1760"/>
-            <w:shd w:fill="FFFFFF" w:color="auto" w:val="clear"/>
-            <w:tcMar>
-              <w:top w:type="dxa" w:w="70"/>
-              <w:left w:type="dxa" w:w="100"/>
-              <w:bottom w:type="dxa" w:w="70"/>
-              <w:right w:type="dxa" w:w="100"/>
-            </w:tcMar>
-          </w:tcPr>
-          <w:p>
-            <w:pPr>
-              <w:jc w:val="right"/>
-            </w:pPr>
-            <w:r>
-              <w:rPr>
-                <w:rFonts w:ascii="Arial" w:cs="Arial" w:eastAsia="Arial" w:hAnsi="Arial"/>
-                <w:b w:val="false"/>
-                <w:bCs w:val="false"/>
-                <w:color w:val="0E3A4E"/>
-                <w:sz w:val="19"/>
-                <w:szCs w:val="19"/>
-              </w:rPr>
-              <w:t xml:space="preserve">~7,150</w:t>
+              <w:t xml:space="preserve">$27,562</w:t>
             </w:r>
           </w:p>
         </w:tc>
@@ -6830,35 +6556,35 @@
         <w:tc>
           <w:tcPr>
             <w:tcW w:type="dxa" w:w="4200"/>
-            <w:shd w:fill="F6F9FA" w:color="auto" w:val="clear"/>
-            <w:tcMar>
-              <w:top w:type="dxa" w:w="70"/>
-              <w:left w:type="dxa" w:w="100"/>
-              <w:bottom w:type="dxa" w:w="70"/>
-              <w:right w:type="dxa" w:w="100"/>
-            </w:tcMar>
-          </w:tcPr>
-          <w:p>
-            <w:pPr>
-              <w:jc w:val="left"/>
-            </w:pPr>
-            <w:r>
-              <w:rPr>
-                <w:rFonts w:ascii="Arial" w:cs="Arial" w:eastAsia="Arial" w:hAnsi="Arial"/>
-                <w:b w:val="false"/>
-                <w:bCs w:val="false"/>
-                <w:color w:val="0E3A4E"/>
-                <w:sz w:val="19"/>
-                <w:szCs w:val="19"/>
-              </w:rPr>
-              <w:t xml:space="preserve">Calendario · tarjeta entre eventos</w:t>
-            </w:r>
-          </w:p>
-        </w:tc>
-        <w:tc>
-          <w:tcPr>
-            <w:tcW w:type="dxa" w:w="1700"/>
-            <w:shd w:fill="F6F9FA" w:color="auto" w:val="clear"/>
+            <w:shd w:fill="175772" w:color="auto" w:val="clear"/>
+            <w:tcMar>
+              <w:top w:type="dxa" w:w="70"/>
+              <w:left w:type="dxa" w:w="100"/>
+              <w:bottom w:type="dxa" w:w="70"/>
+              <w:right w:type="dxa" w:w="100"/>
+            </w:tcMar>
+          </w:tcPr>
+          <w:p>
+            <w:pPr>
+              <w:jc w:val="left"/>
+            </w:pPr>
+            <w:r>
+              <w:rPr>
+                <w:rFonts w:ascii="Arial" w:cs="Arial" w:eastAsia="Arial" w:hAnsi="Arial"/>
+                <w:b/>
+                <w:bCs/>
+                <w:color w:val="FFFFFF"/>
+                <w:sz w:val="19"/>
+                <w:szCs w:val="19"/>
+              </w:rPr>
+              <w:t xml:space="preserve">Total Propuesta 2</w:t>
+            </w:r>
+          </w:p>
+        </w:tc>
+        <w:tc>
+          <w:tcPr>
+            <w:tcW w:type="dxa" w:w="2580"/>
+            <w:shd w:fill="175772" w:color="auto" w:val="clear"/>
             <w:tcMar>
               <w:top w:type="dxa" w:w="70"/>
               <w:left w:type="dxa" w:w="100"/>
@@ -6873,20 +6599,20 @@
             <w:r>
               <w:rPr>
                 <w:rFonts w:ascii="Arial" w:cs="Arial" w:eastAsia="Arial" w:hAnsi="Arial"/>
-                <w:b w:val="false"/>
-                <w:bCs w:val="false"/>
-                <w:color w:val="0E3A4E"/>
-                <w:sz w:val="19"/>
-                <w:szCs w:val="19"/>
-              </w:rPr>
-              <w:t xml:space="preserve">$1,400</w:t>
-            </w:r>
-          </w:p>
-        </w:tc>
-        <w:tc>
-          <w:tcPr>
-            <w:tcW w:type="dxa" w:w="1700"/>
-            <w:shd w:fill="F6F9FA" w:color="auto" w:val="clear"/>
+                <w:b/>
+                <w:bCs/>
+                <w:color w:val="FFFFFF"/>
+                <w:sz w:val="19"/>
+                <w:szCs w:val="19"/>
+              </w:rPr>
+              <w:t xml:space="preserve">$40,521</w:t>
+            </w:r>
+          </w:p>
+        </w:tc>
+        <w:tc>
+          <w:tcPr>
+            <w:tcW w:type="dxa" w:w="2580"/>
+            <w:shd w:fill="175772" w:color="auto" w:val="clear"/>
             <w:tcMar>
               <w:top w:type="dxa" w:w="70"/>
               <w:left w:type="dxa" w:w="100"/>
@@ -6901,20 +6627,85 @@
             <w:r>
               <w:rPr>
                 <w:rFonts w:ascii="Arial" w:cs="Arial" w:eastAsia="Arial" w:hAnsi="Arial"/>
-                <w:b w:val="false"/>
-                <w:bCs w:val="false"/>
-                <w:color w:val="0E3A4E"/>
-                <w:sz w:val="19"/>
-                <w:szCs w:val="19"/>
-              </w:rPr>
-              <w:t xml:space="preserve">$13,440</w:t>
-            </w:r>
-          </w:p>
-        </w:tc>
-        <w:tc>
-          <w:tcPr>
-            <w:tcW w:type="dxa" w:w="1760"/>
-            <w:shd w:fill="F6F9FA" w:color="auto" w:val="clear"/>
+                <w:b/>
+                <w:bCs/>
+                <w:color w:val="A8C243"/>
+                <w:sz w:val="19"/>
+                <w:szCs w:val="19"/>
+              </w:rPr>
+              <w:t xml:space="preserve">$38,685</w:t>
+            </w:r>
+          </w:p>
+        </w:tc>
+      </w:tr>
+    </w:tbl>
+    <w:p>
+      <w:pPr>
+        <w:spacing w:after="120" w:before="120"/>
+      </w:pPr>
+      <w:r>
+        <w:rPr>
+          <w:rFonts w:ascii="Arial" w:cs="Arial" w:eastAsia="Arial" w:hAnsi="Arial"/>
+          <w:color w:val="0E3A4E"/>
+          <w:sz w:val="22"/>
+          <w:szCs w:val="22"/>
+        </w:rPr>
+        <w:t xml:space="preserve">La web nueva trae 8 espacios para anuncios que el equipo administra desde el portal. Precios de la cotización, con base en el tráfico real (reporte de Quimaira, enero a octubre de 2026):</w:t>
+      </w:r>
+    </w:p>
+    <w:tbl>
+      <w:tblPr>
+        <w:tblW w:type="dxa" w:w="9360"/>
+        <w:tblBorders>
+          <w:top w:val="single" w:color="auto" w:sz="4"/>
+          <w:left w:val="single" w:color="auto" w:sz="4"/>
+          <w:bottom w:val="single" w:color="auto" w:sz="4"/>
+          <w:right w:val="single" w:color="auto" w:sz="4"/>
+          <w:insideH w:val="single" w:color="auto" w:sz="4"/>
+          <w:insideV w:val="single" w:color="auto" w:sz="4"/>
+        </w:tblBorders>
+      </w:tblPr>
+      <w:tblGrid>
+        <w:gridCol w:w="4760"/>
+        <w:gridCol w:w="2300"/>
+        <w:gridCol w:w="2300"/>
+      </w:tblGrid>
+      <w:tr>
+        <w:trPr>
+          <w:tblHeader/>
+        </w:trPr>
+        <w:tc>
+          <w:tcPr>
+            <w:tcW w:type="dxa" w:w="4760"/>
+            <w:shd w:fill="DCE6EB" w:color="auto" w:val="clear"/>
+            <w:tcMar>
+              <w:top w:type="dxa" w:w="70"/>
+              <w:left w:type="dxa" w:w="100"/>
+              <w:bottom w:type="dxa" w:w="70"/>
+              <w:right w:type="dxa" w:w="100"/>
+            </w:tcMar>
+          </w:tcPr>
+          <w:p>
+            <w:pPr>
+              <w:jc w:val="left"/>
+            </w:pPr>
+            <w:r>
+              <w:rPr>
+                <w:rFonts w:ascii="Arial" w:cs="Arial" w:eastAsia="Arial" w:hAnsi="Arial"/>
+                <w:b/>
+                <w:bCs/>
+                <w:color w:val="0E3A4E"/>
+                <w:sz w:val="19"/>
+                <w:szCs w:val="19"/>
+              </w:rPr>
+              <w:t xml:space="preserve">Espacio</w:t>
+            </w:r>
+          </w:p>
+        </w:tc>
+        <w:tc>
+          <w:tcPr>
+            <w:tcW w:type="dxa" w:w="2300"/>
+            <w:shd w:fill="DCE6EB" w:color="auto" w:val="clear"/>
             <w:tcMar>
               <w:top w:type="dxa" w:w="70"/>
               <w:left w:type="dxa" w:w="100"/>
@@ -6929,13 +6720,41 @@
             <w:r>
               <w:rPr>
                 <w:rFonts w:ascii="Arial" w:cs="Arial" w:eastAsia="Arial" w:hAnsi="Arial"/>
-                <w:b w:val="false"/>
-                <w:bCs w:val="false"/>
-                <w:color w:val="0E3A4E"/>
-                <w:sz w:val="19"/>
-                <w:szCs w:val="19"/>
-              </w:rPr>
-              <w:t xml:space="preserve">~7,150</w:t>
+                <w:b/>
+                <w:bCs/>
+                <w:color w:val="0E3A4E"/>
+                <w:sz w:val="19"/>
+                <w:szCs w:val="19"/>
+              </w:rPr>
+              <w:t xml:space="preserve">Contrato anual (−20%)</w:t>
+            </w:r>
+          </w:p>
+        </w:tc>
+        <w:tc>
+          <w:tcPr>
+            <w:tcW w:type="dxa" w:w="2300"/>
+            <w:shd w:fill="DCE6EB" w:color="auto" w:val="clear"/>
+            <w:tcMar>
+              <w:top w:type="dxa" w:w="70"/>
+              <w:left w:type="dxa" w:w="100"/>
+              <w:bottom w:type="dxa" w:w="70"/>
+              <w:right w:type="dxa" w:w="100"/>
+            </w:tcMar>
+          </w:tcPr>
+          <w:p>
+            <w:pPr>
+              <w:jc w:val="right"/>
+            </w:pPr>
+            <w:r>
+              <w:rPr>
+                <w:rFonts w:ascii="Arial" w:cs="Arial" w:eastAsia="Arial" w:hAnsi="Arial"/>
+                <w:b/>
+                <w:bCs/>
+                <w:color w:val="0E3A4E"/>
+                <w:sz w:val="19"/>
+                <w:szCs w:val="19"/>
+              </w:rPr>
+              <w:t xml:space="preserve">Vistas al año</w:t>
             </w:r>
           </w:p>
         </w:tc>
@@ -6946,36 +6765,36 @@
         </w:trPr>
         <w:tc>
           <w:tcPr>
-            <w:tcW w:type="dxa" w:w="4200"/>
-            <w:shd w:fill="FFFFFF" w:color="auto" w:val="clear"/>
-            <w:tcMar>
-              <w:top w:type="dxa" w:w="70"/>
-              <w:left w:type="dxa" w:w="100"/>
-              <w:bottom w:type="dxa" w:w="70"/>
-              <w:right w:type="dxa" w:w="100"/>
-            </w:tcMar>
-          </w:tcPr>
-          <w:p>
-            <w:pPr>
-              <w:jc w:val="left"/>
-            </w:pPr>
-            <w:r>
-              <w:rPr>
-                <w:rFonts w:ascii="Arial" w:cs="Arial" w:eastAsia="Arial" w:hAnsi="Arial"/>
-                <w:b w:val="false"/>
-                <w:bCs w:val="false"/>
-                <w:color w:val="0E3A4E"/>
-                <w:sz w:val="19"/>
-                <w:szCs w:val="19"/>
-              </w:rPr>
-              <w:t xml:space="preserve">Página principal · banner</w:t>
-            </w:r>
-          </w:p>
-        </w:tc>
-        <w:tc>
-          <w:tcPr>
-            <w:tcW w:type="dxa" w:w="1700"/>
-            <w:shd w:fill="FFFFFF" w:color="auto" w:val="clear"/>
+            <w:tcW w:type="dxa" w:w="4760"/>
+            <w:shd w:fill="F6F9FA" w:color="auto" w:val="clear"/>
+            <w:tcMar>
+              <w:top w:type="dxa" w:w="70"/>
+              <w:left w:type="dxa" w:w="100"/>
+              <w:bottom w:type="dxa" w:w="70"/>
+              <w:right w:type="dxa" w:w="100"/>
+            </w:tcMar>
+          </w:tcPr>
+          <w:p>
+            <w:pPr>
+              <w:jc w:val="left"/>
+            </w:pPr>
+            <w:r>
+              <w:rPr>
+                <w:rFonts w:ascii="Arial" w:cs="Arial" w:eastAsia="Arial" w:hAnsi="Arial"/>
+                <w:b w:val="false"/>
+                <w:bCs w:val="false"/>
+                <w:color w:val="0E3A4E"/>
+                <w:sz w:val="19"/>
+                <w:szCs w:val="19"/>
+              </w:rPr>
+              <w:t xml:space="preserve">Ventana al entrar</w:t>
+            </w:r>
+          </w:p>
+        </w:tc>
+        <w:tc>
+          <w:tcPr>
+            <w:tcW w:type="dxa" w:w="2300"/>
+            <w:shd w:fill="F6F9FA" w:color="auto" w:val="clear"/>
             <w:tcMar>
               <w:top w:type="dxa" w:w="70"/>
               <w:left w:type="dxa" w:w="100"/>
@@ -6996,14 +6815,14 @@
                 <w:sz w:val="19"/>
                 <w:szCs w:val="19"/>
               </w:rPr>
-              <w:t xml:space="preserve">$1,500</w:t>
-            </w:r>
-          </w:p>
-        </w:tc>
-        <w:tc>
-          <w:tcPr>
-            <w:tcW w:type="dxa" w:w="1700"/>
-            <w:shd w:fill="FFFFFF" w:color="auto" w:val="clear"/>
+              <w:t xml:space="preserve">$28,800</w:t>
+            </w:r>
+          </w:p>
+        </w:tc>
+        <w:tc>
+          <w:tcPr>
+            <w:tcW w:type="dxa" w:w="2300"/>
+            <w:shd w:fill="F6F9FA" w:color="auto" w:val="clear"/>
             <w:tcMar>
               <w:top w:type="dxa" w:w="70"/>
               <w:left w:type="dxa" w:w="100"/>
@@ -7024,35 +6843,7 @@
                 <w:sz w:val="19"/>
                 <w:szCs w:val="19"/>
               </w:rPr>
-              <w:t xml:space="preserve">$14,400</w:t>
-            </w:r>
-          </w:p>
-        </w:tc>
-        <w:tc>
-          <w:tcPr>
-            <w:tcW w:type="dxa" w:w="1760"/>
-            <w:shd w:fill="FFFFFF" w:color="auto" w:val="clear"/>
-            <w:tcMar>
-              <w:top w:type="dxa" w:w="70"/>
-              <w:left w:type="dxa" w:w="100"/>
-              <w:bottom w:type="dxa" w:w="70"/>
-              <w:right w:type="dxa" w:w="100"/>
-            </w:tcMar>
-          </w:tcPr>
-          <w:p>
-            <w:pPr>
-              <w:jc w:val="right"/>
-            </w:pPr>
-            <w:r>
-              <w:rPr>
-                <w:rFonts w:ascii="Arial" w:cs="Arial" w:eastAsia="Arial" w:hAnsi="Arial"/>
-                <w:b w:val="false"/>
-                <w:bCs w:val="false"/>
-                <w:color w:val="0E3A4E"/>
-                <w:sz w:val="19"/>
-                <w:szCs w:val="19"/>
-              </w:rPr>
-              <w:t xml:space="preserve">~5,730</w:t>
+              <w:t xml:space="preserve">~108,000</w:t>
             </w:r>
           </w:p>
         </w:tc>
@@ -7063,36 +6854,36 @@
         </w:trPr>
         <w:tc>
           <w:tcPr>
-            <w:tcW w:type="dxa" w:w="4200"/>
-            <w:shd w:fill="F6F9FA" w:color="auto" w:val="clear"/>
-            <w:tcMar>
-              <w:top w:type="dxa" w:w="70"/>
-              <w:left w:type="dxa" w:w="100"/>
-              <w:bottom w:type="dxa" w:w="70"/>
-              <w:right w:type="dxa" w:w="100"/>
-            </w:tcMar>
-          </w:tcPr>
-          <w:p>
-            <w:pPr>
-              <w:jc w:val="left"/>
-            </w:pPr>
-            <w:r>
-              <w:rPr>
-                <w:rFonts w:ascii="Arial" w:cs="Arial" w:eastAsia="Arial" w:hAnsi="Arial"/>
-                <w:b w:val="false"/>
-                <w:bCs w:val="false"/>
-                <w:color w:val="0E3A4E"/>
-                <w:sz w:val="19"/>
-                <w:szCs w:val="19"/>
-              </w:rPr>
-              <w:t xml:space="preserve">Cada evento · banner</w:t>
-            </w:r>
-          </w:p>
-        </w:tc>
-        <w:tc>
-          <w:tcPr>
-            <w:tcW w:type="dxa" w:w="1700"/>
-            <w:shd w:fill="F6F9FA" w:color="auto" w:val="clear"/>
+            <w:tcW w:type="dxa" w:w="4760"/>
+            <w:shd w:fill="FFFFFF" w:color="auto" w:val="clear"/>
+            <w:tcMar>
+              <w:top w:type="dxa" w:w="70"/>
+              <w:left w:type="dxa" w:w="100"/>
+              <w:bottom w:type="dxa" w:w="70"/>
+              <w:right w:type="dxa" w:w="100"/>
+            </w:tcMar>
+          </w:tcPr>
+          <w:p>
+            <w:pPr>
+              <w:jc w:val="left"/>
+            </w:pPr>
+            <w:r>
+              <w:rPr>
+                <w:rFonts w:ascii="Arial" w:cs="Arial" w:eastAsia="Arial" w:hAnsi="Arial"/>
+                <w:b w:val="false"/>
+                <w:bCs w:val="false"/>
+                <w:color w:val="0E3A4E"/>
+                <w:sz w:val="19"/>
+                <w:szCs w:val="19"/>
+              </w:rPr>
+              <w:t xml:space="preserve">Calendario · banner arriba y abajo</w:t>
+            </w:r>
+          </w:p>
+        </w:tc>
+        <w:tc>
+          <w:tcPr>
+            <w:tcW w:type="dxa" w:w="2300"/>
+            <w:shd w:fill="FFFFFF" w:color="auto" w:val="clear"/>
             <w:tcMar>
               <w:top w:type="dxa" w:w="70"/>
               <w:left w:type="dxa" w:w="100"/>
@@ -7113,14 +6904,14 @@
                 <w:sz w:val="19"/>
                 <w:szCs w:val="19"/>
               </w:rPr>
-              <w:t xml:space="preserve">$800</w:t>
-            </w:r>
-          </w:p>
-        </w:tc>
-        <w:tc>
-          <w:tcPr>
-            <w:tcW w:type="dxa" w:w="1700"/>
-            <w:shd w:fill="F6F9FA" w:color="auto" w:val="clear"/>
+              <w:t xml:space="preserve">$17,280</w:t>
+            </w:r>
+          </w:p>
+        </w:tc>
+        <w:tc>
+          <w:tcPr>
+            <w:tcW w:type="dxa" w:w="2300"/>
+            <w:shd w:fill="FFFFFF" w:color="auto" w:val="clear"/>
             <w:tcMar>
               <w:top w:type="dxa" w:w="70"/>
               <w:left w:type="dxa" w:w="100"/>
@@ -7141,35 +6932,7 @@
                 <w:sz w:val="19"/>
                 <w:szCs w:val="19"/>
               </w:rPr>
-              <w:t xml:space="preserve">$7,680</w:t>
-            </w:r>
-          </w:p>
-        </w:tc>
-        <w:tc>
-          <w:tcPr>
-            <w:tcW w:type="dxa" w:w="1760"/>
-            <w:shd w:fill="F6F9FA" w:color="auto" w:val="clear"/>
-            <w:tcMar>
-              <w:top w:type="dxa" w:w="70"/>
-              <w:left w:type="dxa" w:w="100"/>
-              <w:bottom w:type="dxa" w:w="70"/>
-              <w:right w:type="dxa" w:w="100"/>
-            </w:tcMar>
-          </w:tcPr>
-          <w:p>
-            <w:pPr>
-              <w:jc w:val="right"/>
-            </w:pPr>
-            <w:r>
-              <w:rPr>
-                <w:rFonts w:ascii="Arial" w:cs="Arial" w:eastAsia="Arial" w:hAnsi="Arial"/>
-                <w:b w:val="false"/>
-                <w:bCs w:val="false"/>
-                <w:color w:val="0E3A4E"/>
-                <w:sz w:val="19"/>
-                <w:szCs w:val="19"/>
-              </w:rPr>
-              <w:t xml:space="preserve">~2,900</w:t>
+              <w:t xml:space="preserve">~85,800</w:t>
             </w:r>
           </w:p>
         </w:tc>
@@ -7180,36 +6943,36 @@
         </w:trPr>
         <w:tc>
           <w:tcPr>
-            <w:tcW w:type="dxa" w:w="4200"/>
-            <w:shd w:fill="FFFFFF" w:color="auto" w:val="clear"/>
-            <w:tcMar>
-              <w:top w:type="dxa" w:w="70"/>
-              <w:left w:type="dxa" w:w="100"/>
-              <w:bottom w:type="dxa" w:w="70"/>
-              <w:right w:type="dxa" w:w="100"/>
-            </w:tcMar>
-          </w:tcPr>
-          <w:p>
-            <w:pPr>
-              <w:jc w:val="left"/>
-            </w:pPr>
-            <w:r>
-              <w:rPr>
-                <w:rFonts w:ascii="Arial" w:cs="Arial" w:eastAsia="Arial" w:hAnsi="Arial"/>
-                <w:b w:val="false"/>
-                <w:bCs w:val="false"/>
-                <w:color w:val="0E3A4E"/>
-                <w:sz w:val="19"/>
-                <w:szCs w:val="19"/>
-              </w:rPr>
-              <w:t xml:space="preserve">Cada evento · cuadro lateral</w:t>
-            </w:r>
-          </w:p>
-        </w:tc>
-        <w:tc>
-          <w:tcPr>
-            <w:tcW w:type="dxa" w:w="1700"/>
-            <w:shd w:fill="FFFFFF" w:color="auto" w:val="clear"/>
+            <w:tcW w:type="dxa" w:w="4760"/>
+            <w:shd w:fill="F6F9FA" w:color="auto" w:val="clear"/>
+            <w:tcMar>
+              <w:top w:type="dxa" w:w="70"/>
+              <w:left w:type="dxa" w:w="100"/>
+              <w:bottom w:type="dxa" w:w="70"/>
+              <w:right w:type="dxa" w:w="100"/>
+            </w:tcMar>
+          </w:tcPr>
+          <w:p>
+            <w:pPr>
+              <w:jc w:val="left"/>
+            </w:pPr>
+            <w:r>
+              <w:rPr>
+                <w:rFonts w:ascii="Arial" w:cs="Arial" w:eastAsia="Arial" w:hAnsi="Arial"/>
+                <w:b w:val="false"/>
+                <w:bCs w:val="false"/>
+                <w:color w:val="0E3A4E"/>
+                <w:sz w:val="19"/>
+                <w:szCs w:val="19"/>
+              </w:rPr>
+              <w:t xml:space="preserve">Calendario · tarjeta entre eventos</w:t>
+            </w:r>
+          </w:p>
+        </w:tc>
+        <w:tc>
+          <w:tcPr>
+            <w:tcW w:type="dxa" w:w="2300"/>
+            <w:shd w:fill="F6F9FA" w:color="auto" w:val="clear"/>
             <w:tcMar>
               <w:top w:type="dxa" w:w="70"/>
               <w:left w:type="dxa" w:w="100"/>
@@ -7230,14 +6993,14 @@
                 <w:sz w:val="19"/>
                 <w:szCs w:val="19"/>
               </w:rPr>
-              <w:t xml:space="preserve">$800</w:t>
-            </w:r>
-          </w:p>
-        </w:tc>
-        <w:tc>
-          <w:tcPr>
-            <w:tcW w:type="dxa" w:w="1700"/>
-            <w:shd w:fill="FFFFFF" w:color="auto" w:val="clear"/>
+              <w:t xml:space="preserve">$13,440</w:t>
+            </w:r>
+          </w:p>
+        </w:tc>
+        <w:tc>
+          <w:tcPr>
+            <w:tcW w:type="dxa" w:w="2300"/>
+            <w:shd w:fill="F6F9FA" w:color="auto" w:val="clear"/>
             <w:tcMar>
               <w:top w:type="dxa" w:w="70"/>
               <w:left w:type="dxa" w:w="100"/>
@@ -7258,35 +7021,7 @@
                 <w:sz w:val="19"/>
                 <w:szCs w:val="19"/>
               </w:rPr>
-              <w:t xml:space="preserve">$7,680</w:t>
-            </w:r>
-          </w:p>
-        </w:tc>
-        <w:tc>
-          <w:tcPr>
-            <w:tcW w:type="dxa" w:w="1760"/>
-            <w:shd w:fill="FFFFFF" w:color="auto" w:val="clear"/>
-            <w:tcMar>
-              <w:top w:type="dxa" w:w="70"/>
-              <w:left w:type="dxa" w:w="100"/>
-              <w:bottom w:type="dxa" w:w="70"/>
-              <w:right w:type="dxa" w:w="100"/>
-            </w:tcMar>
-          </w:tcPr>
-          <w:p>
-            <w:pPr>
-              <w:jc w:val="right"/>
-            </w:pPr>
-            <w:r>
-              <w:rPr>
-                <w:rFonts w:ascii="Arial" w:cs="Arial" w:eastAsia="Arial" w:hAnsi="Arial"/>
-                <w:b w:val="false"/>
-                <w:bCs w:val="false"/>
-                <w:color w:val="0E3A4E"/>
-                <w:sz w:val="19"/>
-                <w:szCs w:val="19"/>
-              </w:rPr>
-              <w:t xml:space="preserve">~2,900</w:t>
+              <w:t xml:space="preserve">~85,800</w:t>
             </w:r>
           </w:p>
         </w:tc>
@@ -7297,36 +7032,36 @@
         </w:trPr>
         <w:tc>
           <w:tcPr>
-            <w:tcW w:type="dxa" w:w="4200"/>
-            <w:shd w:fill="F6F9FA" w:color="auto" w:val="clear"/>
-            <w:tcMar>
-              <w:top w:type="dxa" w:w="70"/>
-              <w:left w:type="dxa" w:w="100"/>
-              <w:bottom w:type="dxa" w:w="70"/>
-              <w:right w:type="dxa" w:w="100"/>
-            </w:tcMar>
-          </w:tcPr>
-          <w:p>
-            <w:pPr>
-              <w:jc w:val="left"/>
-            </w:pPr>
-            <w:r>
-              <w:rPr>
-                <w:rFonts w:ascii="Arial" w:cs="Arial" w:eastAsia="Arial" w:hAnsi="Arial"/>
-                <w:b w:val="false"/>
-                <w:bCs w:val="false"/>
-                <w:color w:val="0E3A4E"/>
-                <w:sz w:val="19"/>
-                <w:szCs w:val="19"/>
-              </w:rPr>
-              <w:t xml:space="preserve">Espacios y salas · banner</w:t>
-            </w:r>
-          </w:p>
-        </w:tc>
-        <w:tc>
-          <w:tcPr>
-            <w:tcW w:type="dxa" w:w="1700"/>
-            <w:shd w:fill="F6F9FA" w:color="auto" w:val="clear"/>
+            <w:tcW w:type="dxa" w:w="4760"/>
+            <w:shd w:fill="FFFFFF" w:color="auto" w:val="clear"/>
+            <w:tcMar>
+              <w:top w:type="dxa" w:w="70"/>
+              <w:left w:type="dxa" w:w="100"/>
+              <w:bottom w:type="dxa" w:w="70"/>
+              <w:right w:type="dxa" w:w="100"/>
+            </w:tcMar>
+          </w:tcPr>
+          <w:p>
+            <w:pPr>
+              <w:jc w:val="left"/>
+            </w:pPr>
+            <w:r>
+              <w:rPr>
+                <w:rFonts w:ascii="Arial" w:cs="Arial" w:eastAsia="Arial" w:hAnsi="Arial"/>
+                <w:b w:val="false"/>
+                <w:bCs w:val="false"/>
+                <w:color w:val="0E3A4E"/>
+                <w:sz w:val="19"/>
+                <w:szCs w:val="19"/>
+              </w:rPr>
+              <w:t xml:space="preserve">Página principal · banner</w:t>
+            </w:r>
+          </w:p>
+        </w:tc>
+        <w:tc>
+          <w:tcPr>
+            <w:tcW w:type="dxa" w:w="2300"/>
+            <w:shd w:fill="FFFFFF" w:color="auto" w:val="clear"/>
             <w:tcMar>
               <w:top w:type="dxa" w:w="70"/>
               <w:left w:type="dxa" w:w="100"/>
@@ -7347,14 +7082,14 @@
                 <w:sz w:val="19"/>
                 <w:szCs w:val="19"/>
               </w:rPr>
-              <w:t xml:space="preserve">$500</w:t>
-            </w:r>
-          </w:p>
-        </w:tc>
-        <w:tc>
-          <w:tcPr>
-            <w:tcW w:type="dxa" w:w="1700"/>
-            <w:shd w:fill="F6F9FA" w:color="auto" w:val="clear"/>
+              <w:t xml:space="preserve">$14,400</w:t>
+            </w:r>
+          </w:p>
+        </w:tc>
+        <w:tc>
+          <w:tcPr>
+            <w:tcW w:type="dxa" w:w="2300"/>
+            <w:shd w:fill="FFFFFF" w:color="auto" w:val="clear"/>
             <w:tcMar>
               <w:top w:type="dxa" w:w="70"/>
               <w:left w:type="dxa" w:w="100"/>
@@ -7375,35 +7110,7 @@
                 <w:sz w:val="19"/>
                 <w:szCs w:val="19"/>
               </w:rPr>
-              <w:t xml:space="preserve">$4,800</w:t>
-            </w:r>
-          </w:p>
-        </w:tc>
-        <w:tc>
-          <w:tcPr>
-            <w:tcW w:type="dxa" w:w="1760"/>
-            <w:shd w:fill="F6F9FA" w:color="auto" w:val="clear"/>
-            <w:tcMar>
-              <w:top w:type="dxa" w:w="70"/>
-              <w:left w:type="dxa" w:w="100"/>
-              <w:bottom w:type="dxa" w:w="70"/>
-              <w:right w:type="dxa" w:w="100"/>
-            </w:tcMar>
-          </w:tcPr>
-          <w:p>
-            <w:pPr>
-              <w:jc w:val="right"/>
-            </w:pPr>
-            <w:r>
-              <w:rPr>
-                <w:rFonts w:ascii="Arial" w:cs="Arial" w:eastAsia="Arial" w:hAnsi="Arial"/>
-                <w:b w:val="false"/>
-                <w:bCs w:val="false"/>
-                <w:color w:val="0E3A4E"/>
-                <w:sz w:val="19"/>
-                <w:szCs w:val="19"/>
-              </w:rPr>
-              <w:t xml:space="preserve">~460</w:t>
+              <w:t xml:space="preserve">~68,760</w:t>
             </w:r>
           </w:p>
         </w:tc>
@@ -7414,36 +7121,36 @@
         </w:trPr>
         <w:tc>
           <w:tcPr>
-            <w:tcW w:type="dxa" w:w="4200"/>
-            <w:shd w:fill="FFFFFF" w:color="auto" w:val="clear"/>
-            <w:tcMar>
-              <w:top w:type="dxa" w:w="70"/>
-              <w:left w:type="dxa" w:w="100"/>
-              <w:bottom w:type="dxa" w:w="70"/>
-              <w:right w:type="dxa" w:w="100"/>
-            </w:tcMar>
-          </w:tcPr>
-          <w:p>
-            <w:pPr>
-              <w:jc w:val="left"/>
-            </w:pPr>
-            <w:r>
-              <w:rPr>
-                <w:rFonts w:ascii="Arial" w:cs="Arial" w:eastAsia="Arial" w:hAnsi="Arial"/>
-                <w:b w:val="false"/>
-                <w:bCs w:val="false"/>
-                <w:color w:val="0E3A4E"/>
-                <w:sz w:val="19"/>
-                <w:szCs w:val="19"/>
-              </w:rPr>
-              <w:t xml:space="preserve">Noticias y blog · banner</w:t>
-            </w:r>
-          </w:p>
-        </w:tc>
-        <w:tc>
-          <w:tcPr>
-            <w:tcW w:type="dxa" w:w="1700"/>
-            <w:shd w:fill="FFFFFF" w:color="auto" w:val="clear"/>
+            <w:tcW w:type="dxa" w:w="4760"/>
+            <w:shd w:fill="F6F9FA" w:color="auto" w:val="clear"/>
+            <w:tcMar>
+              <w:top w:type="dxa" w:w="70"/>
+              <w:left w:type="dxa" w:w="100"/>
+              <w:bottom w:type="dxa" w:w="70"/>
+              <w:right w:type="dxa" w:w="100"/>
+            </w:tcMar>
+          </w:tcPr>
+          <w:p>
+            <w:pPr>
+              <w:jc w:val="left"/>
+            </w:pPr>
+            <w:r>
+              <w:rPr>
+                <w:rFonts w:ascii="Arial" w:cs="Arial" w:eastAsia="Arial" w:hAnsi="Arial"/>
+                <w:b w:val="false"/>
+                <w:bCs w:val="false"/>
+                <w:color w:val="0E3A4E"/>
+                <w:sz w:val="19"/>
+                <w:szCs w:val="19"/>
+              </w:rPr>
+              <w:t xml:space="preserve">Cada evento · banner</w:t>
+            </w:r>
+          </w:p>
+        </w:tc>
+        <w:tc>
+          <w:tcPr>
+            <w:tcW w:type="dxa" w:w="2300"/>
+            <w:shd w:fill="F6F9FA" w:color="auto" w:val="clear"/>
             <w:tcMar>
               <w:top w:type="dxa" w:w="70"/>
               <w:left w:type="dxa" w:w="100"/>
@@ -7464,14 +7171,14 @@
                 <w:sz w:val="19"/>
                 <w:szCs w:val="19"/>
               </w:rPr>
-              <w:t xml:space="preserve">$500</w:t>
-            </w:r>
-          </w:p>
-        </w:tc>
-        <w:tc>
-          <w:tcPr>
-            <w:tcW w:type="dxa" w:w="1700"/>
-            <w:shd w:fill="FFFFFF" w:color="auto" w:val="clear"/>
+              <w:t xml:space="preserve">$7,680</w:t>
+            </w:r>
+          </w:p>
+        </w:tc>
+        <w:tc>
+          <w:tcPr>
+            <w:tcW w:type="dxa" w:w="2300"/>
+            <w:shd w:fill="F6F9FA" w:color="auto" w:val="clear"/>
             <w:tcMar>
               <w:top w:type="dxa" w:w="70"/>
               <w:left w:type="dxa" w:w="100"/>
@@ -7492,35 +7199,7 @@
                 <w:sz w:val="19"/>
                 <w:szCs w:val="19"/>
               </w:rPr>
-              <w:t xml:space="preserve">$4,800</w:t>
-            </w:r>
-          </w:p>
-        </w:tc>
-        <w:tc>
-          <w:tcPr>
-            <w:tcW w:type="dxa" w:w="1760"/>
-            <w:shd w:fill="FFFFFF" w:color="auto" w:val="clear"/>
-            <w:tcMar>
-              <w:top w:type="dxa" w:w="70"/>
-              <w:left w:type="dxa" w:w="100"/>
-              <w:bottom w:type="dxa" w:w="70"/>
-              <w:right w:type="dxa" w:w="100"/>
-            </w:tcMar>
-          </w:tcPr>
-          <w:p>
-            <w:pPr>
-              <w:jc w:val="right"/>
-            </w:pPr>
-            <w:r>
-              <w:rPr>
-                <w:rFonts w:ascii="Arial" w:cs="Arial" w:eastAsia="Arial" w:hAnsi="Arial"/>
-                <w:b w:val="false"/>
-                <w:bCs w:val="false"/>
-                <w:color w:val="0E3A4E"/>
-                <w:sz w:val="19"/>
-                <w:szCs w:val="19"/>
-              </w:rPr>
-              <w:t xml:space="preserve">por medir</w:t>
+              <w:t xml:space="preserve">~34,800</w:t>
             </w:r>
           </w:p>
         </w:tc>
@@ -7531,7 +7210,274 @@
         </w:trPr>
         <w:tc>
           <w:tcPr>
-            <w:tcW w:type="dxa" w:w="4200"/>
+            <w:tcW w:type="dxa" w:w="4760"/>
+            <w:shd w:fill="FFFFFF" w:color="auto" w:val="clear"/>
+            <w:tcMar>
+              <w:top w:type="dxa" w:w="70"/>
+              <w:left w:type="dxa" w:w="100"/>
+              <w:bottom w:type="dxa" w:w="70"/>
+              <w:right w:type="dxa" w:w="100"/>
+            </w:tcMar>
+          </w:tcPr>
+          <w:p>
+            <w:pPr>
+              <w:jc w:val="left"/>
+            </w:pPr>
+            <w:r>
+              <w:rPr>
+                <w:rFonts w:ascii="Arial" w:cs="Arial" w:eastAsia="Arial" w:hAnsi="Arial"/>
+                <w:b w:val="false"/>
+                <w:bCs w:val="false"/>
+                <w:color w:val="0E3A4E"/>
+                <w:sz w:val="19"/>
+                <w:szCs w:val="19"/>
+              </w:rPr>
+              <w:t xml:space="preserve">Cada evento · cuadro lateral</w:t>
+            </w:r>
+          </w:p>
+        </w:tc>
+        <w:tc>
+          <w:tcPr>
+            <w:tcW w:type="dxa" w:w="2300"/>
+            <w:shd w:fill="FFFFFF" w:color="auto" w:val="clear"/>
+            <w:tcMar>
+              <w:top w:type="dxa" w:w="70"/>
+              <w:left w:type="dxa" w:w="100"/>
+              <w:bottom w:type="dxa" w:w="70"/>
+              <w:right w:type="dxa" w:w="100"/>
+            </w:tcMar>
+          </w:tcPr>
+          <w:p>
+            <w:pPr>
+              <w:jc w:val="right"/>
+            </w:pPr>
+            <w:r>
+              <w:rPr>
+                <w:rFonts w:ascii="Arial" w:cs="Arial" w:eastAsia="Arial" w:hAnsi="Arial"/>
+                <w:b w:val="false"/>
+                <w:bCs w:val="false"/>
+                <w:color w:val="0E3A4E"/>
+                <w:sz w:val="19"/>
+                <w:szCs w:val="19"/>
+              </w:rPr>
+              <w:t xml:space="preserve">$7,680</w:t>
+            </w:r>
+          </w:p>
+        </w:tc>
+        <w:tc>
+          <w:tcPr>
+            <w:tcW w:type="dxa" w:w="2300"/>
+            <w:shd w:fill="FFFFFF" w:color="auto" w:val="clear"/>
+            <w:tcMar>
+              <w:top w:type="dxa" w:w="70"/>
+              <w:left w:type="dxa" w:w="100"/>
+              <w:bottom w:type="dxa" w:w="70"/>
+              <w:right w:type="dxa" w:w="100"/>
+            </w:tcMar>
+          </w:tcPr>
+          <w:p>
+            <w:pPr>
+              <w:jc w:val="right"/>
+            </w:pPr>
+            <w:r>
+              <w:rPr>
+                <w:rFonts w:ascii="Arial" w:cs="Arial" w:eastAsia="Arial" w:hAnsi="Arial"/>
+                <w:b w:val="false"/>
+                <w:bCs w:val="false"/>
+                <w:color w:val="0E3A4E"/>
+                <w:sz w:val="19"/>
+                <w:szCs w:val="19"/>
+              </w:rPr>
+              <w:t xml:space="preserve">~34,800</w:t>
+            </w:r>
+          </w:p>
+        </w:tc>
+      </w:tr>
+      <w:tr>
+        <w:trPr>
+          <w:tblHeader w:val="false"/>
+        </w:trPr>
+        <w:tc>
+          <w:tcPr>
+            <w:tcW w:type="dxa" w:w="4760"/>
+            <w:shd w:fill="F6F9FA" w:color="auto" w:val="clear"/>
+            <w:tcMar>
+              <w:top w:type="dxa" w:w="70"/>
+              <w:left w:type="dxa" w:w="100"/>
+              <w:bottom w:type="dxa" w:w="70"/>
+              <w:right w:type="dxa" w:w="100"/>
+            </w:tcMar>
+          </w:tcPr>
+          <w:p>
+            <w:pPr>
+              <w:jc w:val="left"/>
+            </w:pPr>
+            <w:r>
+              <w:rPr>
+                <w:rFonts w:ascii="Arial" w:cs="Arial" w:eastAsia="Arial" w:hAnsi="Arial"/>
+                <w:b w:val="false"/>
+                <w:bCs w:val="false"/>
+                <w:color w:val="0E3A4E"/>
+                <w:sz w:val="19"/>
+                <w:szCs w:val="19"/>
+              </w:rPr>
+              <w:t xml:space="preserve">Espacios y salas · banner</w:t>
+            </w:r>
+          </w:p>
+        </w:tc>
+        <w:tc>
+          <w:tcPr>
+            <w:tcW w:type="dxa" w:w="2300"/>
+            <w:shd w:fill="F6F9FA" w:color="auto" w:val="clear"/>
+            <w:tcMar>
+              <w:top w:type="dxa" w:w="70"/>
+              <w:left w:type="dxa" w:w="100"/>
+              <w:bottom w:type="dxa" w:w="70"/>
+              <w:right w:type="dxa" w:w="100"/>
+            </w:tcMar>
+          </w:tcPr>
+          <w:p>
+            <w:pPr>
+              <w:jc w:val="right"/>
+            </w:pPr>
+            <w:r>
+              <w:rPr>
+                <w:rFonts w:ascii="Arial" w:cs="Arial" w:eastAsia="Arial" w:hAnsi="Arial"/>
+                <w:b w:val="false"/>
+                <w:bCs w:val="false"/>
+                <w:color w:val="0E3A4E"/>
+                <w:sz w:val="19"/>
+                <w:szCs w:val="19"/>
+              </w:rPr>
+              <w:t xml:space="preserve">$4,800</w:t>
+            </w:r>
+          </w:p>
+        </w:tc>
+        <w:tc>
+          <w:tcPr>
+            <w:tcW w:type="dxa" w:w="2300"/>
+            <w:shd w:fill="F6F9FA" w:color="auto" w:val="clear"/>
+            <w:tcMar>
+              <w:top w:type="dxa" w:w="70"/>
+              <w:left w:type="dxa" w:w="100"/>
+              <w:bottom w:type="dxa" w:w="70"/>
+              <w:right w:type="dxa" w:w="100"/>
+            </w:tcMar>
+          </w:tcPr>
+          <w:p>
+            <w:pPr>
+              <w:jc w:val="right"/>
+            </w:pPr>
+            <w:r>
+              <w:rPr>
+                <w:rFonts w:ascii="Arial" w:cs="Arial" w:eastAsia="Arial" w:hAnsi="Arial"/>
+                <w:b w:val="false"/>
+                <w:bCs w:val="false"/>
+                <w:color w:val="0E3A4E"/>
+                <w:sz w:val="19"/>
+                <w:szCs w:val="19"/>
+              </w:rPr>
+              <w:t xml:space="preserve">~5,520</w:t>
+            </w:r>
+          </w:p>
+        </w:tc>
+      </w:tr>
+      <w:tr>
+        <w:trPr>
+          <w:tblHeader w:val="false"/>
+        </w:trPr>
+        <w:tc>
+          <w:tcPr>
+            <w:tcW w:type="dxa" w:w="4760"/>
+            <w:shd w:fill="FFFFFF" w:color="auto" w:val="clear"/>
+            <w:tcMar>
+              <w:top w:type="dxa" w:w="70"/>
+              <w:left w:type="dxa" w:w="100"/>
+              <w:bottom w:type="dxa" w:w="70"/>
+              <w:right w:type="dxa" w:w="100"/>
+            </w:tcMar>
+          </w:tcPr>
+          <w:p>
+            <w:pPr>
+              <w:jc w:val="left"/>
+            </w:pPr>
+            <w:r>
+              <w:rPr>
+                <w:rFonts w:ascii="Arial" w:cs="Arial" w:eastAsia="Arial" w:hAnsi="Arial"/>
+                <w:b w:val="false"/>
+                <w:bCs w:val="false"/>
+                <w:color w:val="0E3A4E"/>
+                <w:sz w:val="19"/>
+                <w:szCs w:val="19"/>
+              </w:rPr>
+              <w:t xml:space="preserve">Noticias y blog · banner</w:t>
+            </w:r>
+          </w:p>
+        </w:tc>
+        <w:tc>
+          <w:tcPr>
+            <w:tcW w:type="dxa" w:w="2300"/>
+            <w:shd w:fill="FFFFFF" w:color="auto" w:val="clear"/>
+            <w:tcMar>
+              <w:top w:type="dxa" w:w="70"/>
+              <w:left w:type="dxa" w:w="100"/>
+              <w:bottom w:type="dxa" w:w="70"/>
+              <w:right w:type="dxa" w:w="100"/>
+            </w:tcMar>
+          </w:tcPr>
+          <w:p>
+            <w:pPr>
+              <w:jc w:val="right"/>
+            </w:pPr>
+            <w:r>
+              <w:rPr>
+                <w:rFonts w:ascii="Arial" w:cs="Arial" w:eastAsia="Arial" w:hAnsi="Arial"/>
+                <w:b w:val="false"/>
+                <w:bCs w:val="false"/>
+                <w:color w:val="0E3A4E"/>
+                <w:sz w:val="19"/>
+                <w:szCs w:val="19"/>
+              </w:rPr>
+              <w:t xml:space="preserve">$4,800</w:t>
+            </w:r>
+          </w:p>
+        </w:tc>
+        <w:tc>
+          <w:tcPr>
+            <w:tcW w:type="dxa" w:w="2300"/>
+            <w:shd w:fill="FFFFFF" w:color="auto" w:val="clear"/>
+            <w:tcMar>
+              <w:top w:type="dxa" w:w="70"/>
+              <w:left w:type="dxa" w:w="100"/>
+              <w:bottom w:type="dxa" w:w="70"/>
+              <w:right w:type="dxa" w:w="100"/>
+            </w:tcMar>
+          </w:tcPr>
+          <w:p>
+            <w:pPr>
+              <w:jc w:val="right"/>
+            </w:pPr>
+            <w:r>
+              <w:rPr>
+                <w:rFonts w:ascii="Arial" w:cs="Arial" w:eastAsia="Arial" w:hAnsi="Arial"/>
+                <w:b w:val="false"/>
+                <w:bCs w:val="false"/>
+                <w:color w:val="0E3A4E"/>
+                <w:sz w:val="19"/>
+                <w:szCs w:val="19"/>
+              </w:rPr>
+              <w:t xml:space="preserve">por medir</w:t>
+            </w:r>
+          </w:p>
+        </w:tc>
+      </w:tr>
+      <w:tr>
+        <w:trPr>
+          <w:tblHeader w:val="false"/>
+        </w:trPr>
+        <w:tc>
+          <w:tcPr>
+            <w:tcW w:type="dxa" w:w="4760"/>
             <w:shd w:fill="175772" w:color="auto" w:val="clear"/>
             <w:tcMar>
               <w:top w:type="dxa" w:w="70"/>
@@ -7559,7 +7505,7 @@
         </w:tc>
         <w:tc>
           <w:tcPr>
-            <w:tcW w:type="dxa" w:w="1700"/>
+            <w:tcW w:type="dxa" w:w="2300"/>
             <w:shd w:fill="175772" w:color="auto" w:val="clear"/>
             <w:tcMar>
               <w:top w:type="dxa" w:w="70"/>
@@ -7581,41 +7527,13 @@
                 <w:sz w:val="19"/>
                 <w:szCs w:val="19"/>
               </w:rPr>
-              <w:t xml:space="preserve">$10,300</w:t>
-            </w:r>
-          </w:p>
-        </w:tc>
-        <w:tc>
-          <w:tcPr>
-            <w:tcW w:type="dxa" w:w="1700"/>
-            <w:shd w:fill="175772" w:color="auto" w:val="clear"/>
-            <w:tcMar>
-              <w:top w:type="dxa" w:w="70"/>
-              <w:left w:type="dxa" w:w="100"/>
-              <w:bottom w:type="dxa" w:w="70"/>
-              <w:right w:type="dxa" w:w="100"/>
-            </w:tcMar>
-          </w:tcPr>
-          <w:p>
-            <w:pPr>
-              <w:jc w:val="right"/>
-            </w:pPr>
-            <w:r>
-              <w:rPr>
-                <w:rFonts w:ascii="Arial" w:cs="Arial" w:eastAsia="Arial" w:hAnsi="Arial"/>
-                <w:b/>
-                <w:bCs/>
-                <w:color w:val="A8C243"/>
-                <w:sz w:val="19"/>
-                <w:szCs w:val="19"/>
-              </w:rPr>
               <w:t xml:space="preserve">$98,880</w:t>
             </w:r>
           </w:p>
         </w:tc>
         <w:tc>
           <w:tcPr>
-            <w:tcW w:type="dxa" w:w="1760"/>
+            <w:tcW w:type="dxa" w:w="2300"/>
             <w:shd w:fill="175772" w:color="auto" w:val="clear"/>
             <w:tcMar>
               <w:top w:type="dxa" w:w="70"/>
@@ -7656,7 +7574,7 @@
           <w:sz w:val="22"/>
           <w:szCs w:val="22"/>
         </w:rPr>
-        <w:t xml:space="preserve">Con la mitad de los espacios vendidos en contratos anuales (~$49,000 al año), la publicidad cubre toda la Propuesta 2, contenido incluido. </w:t>
+        <w:t xml:space="preserve">Con la mitad de los espacios vendidos en contratos anuales (~$49,000 al año), la publicidad cubre toda la Propuesta 2 cada año, contenido incluido. </w:t>
       </w:r>
       <w:r>
         <w:rPr>
@@ -9422,7 +9340,7 @@
         </w:numPr>
         <w:spacing w:after="60"/>
       </w:pPr>
-      <w:hyperlink w:history="1" r:id="rId2hh4qwovtkrhl1ka1z3gz">
+      <w:hyperlink w:history="1" r:id="rIdb-oxf9sppezv8bhb_hvxh">
         <w:r>
           <w:rPr>
             <w:rFonts w:ascii="Arial" w:cs="Arial" w:eastAsia="Arial" w:hAnsi="Arial"/>
@@ -9444,7 +9362,7 @@
         </w:numPr>
         <w:spacing w:after="60"/>
       </w:pPr>
-      <w:hyperlink w:history="1" r:id="rIdfkuvgwqfsek_sk1si-kmz">
+      <w:hyperlink w:history="1" r:id="rId-qlck5ufktbz6drhiw1dm">
         <w:r>
           <w:rPr>
             <w:rFonts w:ascii="Arial" w:cs="Arial" w:eastAsia="Arial" w:hAnsi="Arial"/>
@@ -9466,7 +9384,7 @@
         </w:numPr>
         <w:spacing w:after="60"/>
       </w:pPr>
-      <w:hyperlink w:history="1" r:id="rIdqcfntvk4exbi88dzdqx7q">
+      <w:hyperlink w:history="1" r:id="rIdueoqxurvzjnikqr8-uw7i">
         <w:r>
           <w:rPr>
             <w:rFonts w:ascii="Arial" w:cs="Arial" w:eastAsia="Arial" w:hAnsi="Arial"/>
@@ -9488,7 +9406,7 @@
         </w:numPr>
         <w:spacing w:after="60"/>
       </w:pPr>
-      <w:hyperlink w:history="1" r:id="rIdct2lhrc0at6_pglwgzbt9">
+      <w:hyperlink w:history="1" r:id="rIdpb3rpeum4ticpeewmr2at">
         <w:r>
           <w:rPr>
             <w:rFonts w:ascii="Arial" w:cs="Arial" w:eastAsia="Arial" w:hAnsi="Arial"/>
@@ -9510,7 +9428,7 @@
         </w:numPr>
         <w:spacing w:after="60"/>
       </w:pPr>
-      <w:hyperlink w:history="1" r:id="rId6wlg4ssnneeoelhj54tdh">
+      <w:hyperlink w:history="1" r:id="rIdcuavdspxhh_1ci9df0crc">
         <w:r>
           <w:rPr>
             <w:rFonts w:ascii="Arial" w:cs="Arial" w:eastAsia="Arial" w:hAnsi="Arial"/>
@@ -9532,7 +9450,7 @@
         </w:numPr>
         <w:spacing w:after="60"/>
       </w:pPr>
-      <w:hyperlink w:history="1" r:id="rIds7cj84hxeou2loeb21p1c">
+      <w:hyperlink w:history="1" r:id="rIdl53gdzgcudbahmkpt_oa4">
         <w:r>
           <w:rPr>
             <w:rFonts w:ascii="Arial" w:cs="Arial" w:eastAsia="Arial" w:hAnsi="Arial"/>
@@ -9554,7 +9472,7 @@
         </w:numPr>
         <w:spacing w:after="60"/>
       </w:pPr>
-      <w:hyperlink w:history="1" r:id="rIdfv786fz1mz4r73qikzsug">
+      <w:hyperlink w:history="1" r:id="rIdmlx8p-cstyefoamreljdg">
         <w:r>
           <w:rPr>
             <w:rFonts w:ascii="Arial" w:cs="Arial" w:eastAsia="Arial" w:hAnsi="Arial"/>
@@ -9576,7 +9494,7 @@
         </w:numPr>
         <w:spacing w:after="60"/>
       </w:pPr>
-      <w:hyperlink w:history="1" r:id="rId0jgtd8snvmdfwxeok61ft">
+      <w:hyperlink w:history="1" r:id="rIddmy8bv8odl2hw30a8587l">
         <w:r>
           <w:rPr>
             <w:rFonts w:ascii="Arial" w:cs="Arial" w:eastAsia="Arial" w:hAnsi="Arial"/>
@@ -9598,7 +9516,7 @@
         </w:numPr>
         <w:spacing w:after="60"/>
       </w:pPr>
-      <w:hyperlink w:history="1" r:id="rIdl-prfacevrykpp7uvwfjt">
+      <w:hyperlink w:history="1" r:id="rId2tnkmnsfaulgy1rifofxu">
         <w:r>
           <w:rPr>
             <w:rFonts w:ascii="Arial" w:cs="Arial" w:eastAsia="Arial" w:hAnsi="Arial"/>

</xml_diff>

<commit_message>
Porqués detallados, Claude Team en vez de ChatGPT y revisión de costos
Co-Authored-By: Claude Opus 5.5 <noreply@anthropic.com>
Claude-Session: https://claude.ai/code/session_01GFkSYVqa8d2zDX8Qy6Lwpz
</commit_message>
<xml_diff>
--- a/Presupuesto_2027_Comunicacion_y_Web_Poliforum_Leon.docx
+++ b/Presupuesto_2027_Comunicacion_y_Web_Poliforum_Leon.docx
@@ -303,7 +303,7 @@
                 <w:sz w:val="19"/>
                 <w:szCs w:val="19"/>
               </w:rPr>
-              <w:t xml:space="preserve">$27,680–28,880</w:t>
+              <w:t xml:space="preserve">$26,479–27,479</w:t>
             </w:r>
           </w:p>
         </w:tc>
@@ -570,7 +570,7 @@
                 <w:sz w:val="19"/>
                 <w:szCs w:val="19"/>
               </w:rPr>
-              <w:t xml:space="preserve">$40,521</w:t>
+              <w:t xml:space="preserve">$35,994</w:t>
             </w:r>
           </w:p>
         </w:tc>
@@ -598,7 +598,7 @@
                 <w:sz w:val="19"/>
                 <w:szCs w:val="19"/>
               </w:rPr>
-              <w:t xml:space="preserve">$38,685</w:t>
+              <w:t xml:space="preserve">$34,158</w:t>
             </w:r>
           </w:p>
         </w:tc>
@@ -617,7 +617,1513 @@
           <w:sz w:val="19"/>
           <w:szCs w:val="19"/>
         </w:rPr>
-        <w:t xml:space="preserve">MXN con IVA. Comunicación: ManyChat Pro, Metricool Starter y X Premium cada año; la cámara solo el año 1. Página web: servidor, asistente y seguridad (cotización) más ChatGPT, Magnific, Illustrator, Canva y CapCut; las llaves Yubico solo el año 1 y CapCut sube a $2,999 al renovar.</w:t>
+        <w:t xml:space="preserve">MXN con IVA. Comunicación: ManyChat Pro, Metricool Starter y X Premium cada año; la cámara solo el año 1. Página web: servidor, asistente y seguridad (cotización) más Claude Team, Magnific, Canva, CapCut y Affinity (gratis); las llaves Yubico solo el año 1 y CapCut sube a $2,999 al renovar.</w:t>
+      </w:r>
+    </w:p>
+    <w:p>
+      <w:pPr>
+        <w:pStyle w:val="Heading1"/>
+        <w:pBdr>
+          <w:bottom w:val="single" w:color="A8C243" w:sz="12" w:space="4"/>
+        </w:pBdr>
+        <w:spacing w:after="120" w:before="240"/>
+      </w:pPr>
+      <w:r>
+        <w:rPr>
+          <w:rFonts w:ascii="Arial" w:cs="Arial" w:eastAsia="Arial" w:hAnsi="Arial"/>
+          <w:b/>
+          <w:bCs/>
+          <w:color w:val="175772"/>
+          <w:sz w:val="32"/>
+          <w:szCs w:val="32"/>
+        </w:rPr>
+        <w:t xml:space="preserve">Revisión de costos: qué es caro y si de verdad hace falta</w:t>
+      </w:r>
+    </w:p>
+    <w:tbl>
+      <w:tblPr>
+        <w:tblW w:type="dxa" w:w="9360"/>
+        <w:tblBorders>
+          <w:top w:val="single" w:color="auto" w:sz="4"/>
+          <w:left w:val="single" w:color="auto" w:sz="4"/>
+          <w:bottom w:val="single" w:color="auto" w:sz="4"/>
+          <w:right w:val="single" w:color="auto" w:sz="4"/>
+          <w:insideH w:val="single" w:color="auto" w:sz="4"/>
+          <w:insideV w:val="single" w:color="auto" w:sz="4"/>
+        </w:tblBorders>
+      </w:tblPr>
+      <w:tblGrid>
+        <w:gridCol w:w="2000"/>
+        <w:gridCol w:w="1400"/>
+        <w:gridCol w:w="1300"/>
+        <w:gridCol w:w="3260"/>
+        <w:gridCol w:w="1400"/>
+      </w:tblGrid>
+      <w:tr>
+        <w:trPr>
+          <w:tblHeader/>
+        </w:trPr>
+        <w:tc>
+          <w:tcPr>
+            <w:tcW w:type="dxa" w:w="2000"/>
+            <w:shd w:fill="DCE6EB" w:color="auto" w:val="clear"/>
+            <w:tcMar>
+              <w:top w:type="dxa" w:w="70"/>
+              <w:left w:type="dxa" w:w="100"/>
+              <w:bottom w:type="dxa" w:w="70"/>
+              <w:right w:type="dxa" w:w="100"/>
+            </w:tcMar>
+          </w:tcPr>
+          <w:p>
+            <w:pPr>
+              <w:jc w:val="left"/>
+            </w:pPr>
+            <w:r>
+              <w:rPr>
+                <w:rFonts w:ascii="Arial" w:cs="Arial" w:eastAsia="Arial" w:hAnsi="Arial"/>
+                <w:b/>
+                <w:bCs/>
+                <w:color w:val="0E3A4E"/>
+                <w:sz w:val="19"/>
+                <w:szCs w:val="19"/>
+              </w:rPr>
+              <w:t xml:space="preserve">Concepto</w:t>
+            </w:r>
+          </w:p>
+        </w:tc>
+        <w:tc>
+          <w:tcPr>
+            <w:tcW w:type="dxa" w:w="1400"/>
+            <w:shd w:fill="DCE6EB" w:color="auto" w:val="clear"/>
+            <w:tcMar>
+              <w:top w:type="dxa" w:w="70"/>
+              <w:left w:type="dxa" w:w="100"/>
+              <w:bottom w:type="dxa" w:w="70"/>
+              <w:right w:type="dxa" w:w="100"/>
+            </w:tcMar>
+          </w:tcPr>
+          <w:p>
+            <w:pPr>
+              <w:jc w:val="left"/>
+            </w:pPr>
+            <w:r>
+              <w:rPr>
+                <w:rFonts w:ascii="Arial" w:cs="Arial" w:eastAsia="Arial" w:hAnsi="Arial"/>
+                <w:b/>
+                <w:bCs/>
+                <w:color w:val="0E3A4E"/>
+                <w:sz w:val="19"/>
+                <w:szCs w:val="19"/>
+              </w:rPr>
+              <w:t xml:space="preserve">Costo anual</w:t>
+            </w:r>
+          </w:p>
+        </w:tc>
+        <w:tc>
+          <w:tcPr>
+            <w:tcW w:type="dxa" w:w="1300"/>
+            <w:shd w:fill="DCE6EB" w:color="auto" w:val="clear"/>
+            <w:tcMar>
+              <w:top w:type="dxa" w:w="70"/>
+              <w:left w:type="dxa" w:w="100"/>
+              <w:bottom w:type="dxa" w:w="70"/>
+              <w:right w:type="dxa" w:w="100"/>
+            </w:tcMar>
+          </w:tcPr>
+          <w:p>
+            <w:pPr>
+              <w:jc w:val="left"/>
+            </w:pPr>
+            <w:r>
+              <w:rPr>
+                <w:rFonts w:ascii="Arial" w:cs="Arial" w:eastAsia="Arial" w:hAnsi="Arial"/>
+                <w:b/>
+                <w:bCs/>
+                <w:color w:val="0E3A4E"/>
+                <w:sz w:val="19"/>
+                <w:szCs w:val="19"/>
+              </w:rPr>
+              <w:t xml:space="preserve">Veredicto</w:t>
+            </w:r>
+          </w:p>
+        </w:tc>
+        <w:tc>
+          <w:tcPr>
+            <w:tcW w:type="dxa" w:w="3260"/>
+            <w:shd w:fill="DCE6EB" w:color="auto" w:val="clear"/>
+            <w:tcMar>
+              <w:top w:type="dxa" w:w="70"/>
+              <w:left w:type="dxa" w:w="100"/>
+              <w:bottom w:type="dxa" w:w="70"/>
+              <w:right w:type="dxa" w:w="100"/>
+            </w:tcMar>
+          </w:tcPr>
+          <w:p>
+            <w:pPr>
+              <w:jc w:val="left"/>
+            </w:pPr>
+            <w:r>
+              <w:rPr>
+                <w:rFonts w:ascii="Arial" w:cs="Arial" w:eastAsia="Arial" w:hAnsi="Arial"/>
+                <w:b/>
+                <w:bCs/>
+                <w:color w:val="0E3A4E"/>
+                <w:sz w:val="19"/>
+                <w:szCs w:val="19"/>
+              </w:rPr>
+              <w:t xml:space="preserve">Por qué</w:t>
+            </w:r>
+          </w:p>
+        </w:tc>
+        <w:tc>
+          <w:tcPr>
+            <w:tcW w:type="dxa" w:w="1400"/>
+            <w:shd w:fill="DCE6EB" w:color="auto" w:val="clear"/>
+            <w:tcMar>
+              <w:top w:type="dxa" w:w="70"/>
+              <w:left w:type="dxa" w:w="100"/>
+              <w:bottom w:type="dxa" w:w="70"/>
+              <w:right w:type="dxa" w:w="100"/>
+            </w:tcMar>
+          </w:tcPr>
+          <w:p>
+            <w:pPr>
+              <w:jc w:val="left"/>
+            </w:pPr>
+            <w:r>
+              <w:rPr>
+                <w:rFonts w:ascii="Arial" w:cs="Arial" w:eastAsia="Arial" w:hAnsi="Arial"/>
+                <w:b/>
+                <w:bCs/>
+                <w:color w:val="0E3A4E"/>
+                <w:sz w:val="19"/>
+                <w:szCs w:val="19"/>
+              </w:rPr>
+              <w:t xml:space="preserve">Ajuste</w:t>
+            </w:r>
+          </w:p>
+        </w:tc>
+      </w:tr>
+      <w:tr>
+        <w:trPr>
+          <w:tblHeader w:val="false"/>
+        </w:trPr>
+        <w:tc>
+          <w:tcPr>
+            <w:tcW w:type="dxa" w:w="2000"/>
+            <w:shd w:fill="F6F9FA" w:color="auto" w:val="clear"/>
+            <w:tcMar>
+              <w:top w:type="dxa" w:w="70"/>
+              <w:left w:type="dxa" w:w="100"/>
+              <w:bottom w:type="dxa" w:w="70"/>
+              <w:right w:type="dxa" w:w="100"/>
+            </w:tcMar>
+          </w:tcPr>
+          <w:p>
+            <w:pPr>
+              <w:jc w:val="left"/>
+            </w:pPr>
+            <w:r>
+              <w:rPr>
+                <w:rFonts w:ascii="Arial" w:cs="Arial" w:eastAsia="Arial" w:hAnsi="Arial"/>
+                <w:b w:val="false"/>
+                <w:bCs w:val="false"/>
+                <w:color w:val="0E3A4E"/>
+                <w:sz w:val="19"/>
+                <w:szCs w:val="19"/>
+              </w:rPr>
+              <w:t xml:space="preserve">Adobe Illustrator</w:t>
+            </w:r>
+          </w:p>
+        </w:tc>
+        <w:tc>
+          <w:tcPr>
+            <w:tcW w:type="dxa" w:w="1400"/>
+            <w:shd w:fill="F6F9FA" w:color="auto" w:val="clear"/>
+            <w:tcMar>
+              <w:top w:type="dxa" w:w="70"/>
+              <w:left w:type="dxa" w:w="100"/>
+              <w:bottom w:type="dxa" w:w="70"/>
+              <w:right w:type="dxa" w:w="100"/>
+            </w:tcMar>
+          </w:tcPr>
+          <w:p>
+            <w:pPr>
+              <w:jc w:val="left"/>
+            </w:pPr>
+            <w:r>
+              <w:rPr>
+                <w:rFonts w:ascii="Arial" w:cs="Arial" w:eastAsia="Arial" w:hAnsi="Arial"/>
+                <w:b w:val="false"/>
+                <w:bCs w:val="false"/>
+                <w:color w:val="0E3A4E"/>
+                <w:sz w:val="19"/>
+                <w:szCs w:val="19"/>
+              </w:rPr>
+              <w:t xml:space="preserve">$6,946</w:t>
+            </w:r>
+          </w:p>
+        </w:tc>
+        <w:tc>
+          <w:tcPr>
+            <w:tcW w:type="dxa" w:w="1300"/>
+            <w:shd w:fill="F6F9FA" w:color="auto" w:val="clear"/>
+            <w:tcMar>
+              <w:top w:type="dxa" w:w="70"/>
+              <w:left w:type="dxa" w:w="100"/>
+              <w:bottom w:type="dxa" w:w="70"/>
+              <w:right w:type="dxa" w:w="100"/>
+            </w:tcMar>
+          </w:tcPr>
+          <w:p>
+            <w:pPr>
+              <w:jc w:val="left"/>
+            </w:pPr>
+            <w:r>
+              <w:rPr>
+                <w:rFonts w:ascii="Arial" w:cs="Arial" w:eastAsia="Arial" w:hAnsi="Arial"/>
+                <w:b/>
+                <w:bCs/>
+                <w:color w:val="0E3A4E"/>
+                <w:sz w:val="19"/>
+                <w:szCs w:val="19"/>
+              </w:rPr>
+              <w:t xml:space="preserve">Prescindible</w:t>
+            </w:r>
+          </w:p>
+        </w:tc>
+        <w:tc>
+          <w:tcPr>
+            <w:tcW w:type="dxa" w:w="3260"/>
+            <w:shd w:fill="F6F9FA" w:color="auto" w:val="clear"/>
+            <w:tcMar>
+              <w:top w:type="dxa" w:w="70"/>
+              <w:left w:type="dxa" w:w="100"/>
+              <w:bottom w:type="dxa" w:w="70"/>
+              <w:right w:type="dxa" w:w="100"/>
+            </w:tcMar>
+          </w:tcPr>
+          <w:p>
+            <w:pPr>
+              <w:jc w:val="left"/>
+            </w:pPr>
+            <w:r>
+              <w:rPr>
+                <w:rFonts w:ascii="Arial" w:cs="Arial" w:eastAsia="Arial" w:hAnsi="Arial"/>
+                <w:b w:val="false"/>
+                <w:bCs w:val="false"/>
+                <w:color w:val="0E3A4E"/>
+                <w:sz w:val="19"/>
+                <w:szCs w:val="19"/>
+              </w:rPr>
+              <w:t xml:space="preserve">Affinity by Canva hace vectores y archivos de imprenta, gratis</w:t>
+            </w:r>
+          </w:p>
+        </w:tc>
+        <w:tc>
+          <w:tcPr>
+            <w:tcW w:type="dxa" w:w="1400"/>
+            <w:shd w:fill="F6F9FA" w:color="auto" w:val="clear"/>
+            <w:tcMar>
+              <w:top w:type="dxa" w:w="70"/>
+              <w:left w:type="dxa" w:w="100"/>
+              <w:bottom w:type="dxa" w:w="70"/>
+              <w:right w:type="dxa" w:w="100"/>
+            </w:tcMar>
+          </w:tcPr>
+          <w:p>
+            <w:pPr>
+              <w:jc w:val="left"/>
+            </w:pPr>
+            <w:r>
+              <w:rPr>
+                <w:rFonts w:ascii="Arial" w:cs="Arial" w:eastAsia="Arial" w:hAnsi="Arial"/>
+                <w:b w:val="false"/>
+                <w:bCs w:val="false"/>
+                <w:color w:val="0E3A4E"/>
+                <w:sz w:val="19"/>
+                <w:szCs w:val="19"/>
+              </w:rPr>
+              <w:t xml:space="preserve">−$6,946 (aplicado)</w:t>
+            </w:r>
+          </w:p>
+        </w:tc>
+      </w:tr>
+      <w:tr>
+        <w:trPr>
+          <w:tblHeader w:val="false"/>
+        </w:trPr>
+        <w:tc>
+          <w:tcPr>
+            <w:tcW w:type="dxa" w:w="2000"/>
+            <w:shd w:fill="FFFFFF" w:color="auto" w:val="clear"/>
+            <w:tcMar>
+              <w:top w:type="dxa" w:w="70"/>
+              <w:left w:type="dxa" w:w="100"/>
+              <w:bottom w:type="dxa" w:w="70"/>
+              <w:right w:type="dxa" w:w="100"/>
+            </w:tcMar>
+          </w:tcPr>
+          <w:p>
+            <w:pPr>
+              <w:jc w:val="left"/>
+            </w:pPr>
+            <w:r>
+              <w:rPr>
+                <w:rFonts w:ascii="Arial" w:cs="Arial" w:eastAsia="Arial" w:hAnsi="Arial"/>
+                <w:b w:val="false"/>
+                <w:bCs w:val="false"/>
+                <w:color w:val="0E3A4E"/>
+                <w:sz w:val="19"/>
+                <w:szCs w:val="19"/>
+              </w:rPr>
+              <w:t xml:space="preserve">Mango con batería de la Osmo</w:t>
+            </w:r>
+          </w:p>
+        </w:tc>
+        <w:tc>
+          <w:tcPr>
+            <w:tcW w:type="dxa" w:w="1400"/>
+            <w:shd w:fill="FFFFFF" w:color="auto" w:val="clear"/>
+            <w:tcMar>
+              <w:top w:type="dxa" w:w="70"/>
+              <w:left w:type="dxa" w:w="100"/>
+              <w:bottom w:type="dxa" w:w="70"/>
+              <w:right w:type="dxa" w:w="100"/>
+            </w:tcMar>
+          </w:tcPr>
+          <w:p>
+            <w:pPr>
+              <w:jc w:val="left"/>
+            </w:pPr>
+            <w:r>
+              <w:rPr>
+                <w:rFonts w:ascii="Arial" w:cs="Arial" w:eastAsia="Arial" w:hAnsi="Arial"/>
+                <w:b w:val="false"/>
+                <w:bCs w:val="false"/>
+                <w:color w:val="0E3A4E"/>
+                <w:sz w:val="19"/>
+                <w:szCs w:val="19"/>
+              </w:rPr>
+              <w:t xml:space="preserve">$1,199–1,399</w:t>
+            </w:r>
+          </w:p>
+        </w:tc>
+        <w:tc>
+          <w:tcPr>
+            <w:tcW w:type="dxa" w:w="1300"/>
+            <w:shd w:fill="FFFFFF" w:color="auto" w:val="clear"/>
+            <w:tcMar>
+              <w:top w:type="dxa" w:w="70"/>
+              <w:left w:type="dxa" w:w="100"/>
+              <w:bottom w:type="dxa" w:w="70"/>
+              <w:right w:type="dxa" w:w="100"/>
+            </w:tcMar>
+          </w:tcPr>
+          <w:p>
+            <w:pPr>
+              <w:jc w:val="left"/>
+            </w:pPr>
+            <w:r>
+              <w:rPr>
+                <w:rFonts w:ascii="Arial" w:cs="Arial" w:eastAsia="Arial" w:hAnsi="Arial"/>
+                <w:b/>
+                <w:bCs/>
+                <w:color w:val="0E3A4E"/>
+                <w:sz w:val="19"/>
+                <w:szCs w:val="19"/>
+              </w:rPr>
+              <w:t xml:space="preserve">Prescindible</w:t>
+            </w:r>
+          </w:p>
+        </w:tc>
+        <w:tc>
+          <w:tcPr>
+            <w:tcW w:type="dxa" w:w="3260"/>
+            <w:shd w:fill="FFFFFF" w:color="auto" w:val="clear"/>
+            <w:tcMar>
+              <w:top w:type="dxa" w:w="70"/>
+              <w:left w:type="dxa" w:w="100"/>
+              <w:bottom w:type="dxa" w:w="70"/>
+              <w:right w:type="dxa" w:w="100"/>
+            </w:tcMar>
+          </w:tcPr>
+          <w:p>
+            <w:pPr>
+              <w:jc w:val="left"/>
+            </w:pPr>
+            <w:r>
+              <w:rPr>
+                <w:rFonts w:ascii="Arial" w:cs="Arial" w:eastAsia="Arial" w:hAnsi="Arial"/>
+                <w:b w:val="false"/>
+                <w:bCs w:val="false"/>
+                <w:color w:val="0E3A4E"/>
+                <w:sz w:val="19"/>
+                <w:szCs w:val="19"/>
+              </w:rPr>
+              <w:t xml:space="preserve">La Osmo graba hasta ~4 h con su batería; si hace falta, un power bank</w:t>
+            </w:r>
+          </w:p>
+        </w:tc>
+        <w:tc>
+          <w:tcPr>
+            <w:tcW w:type="dxa" w:w="1400"/>
+            <w:shd w:fill="FFFFFF" w:color="auto" w:val="clear"/>
+            <w:tcMar>
+              <w:top w:type="dxa" w:w="70"/>
+              <w:left w:type="dxa" w:w="100"/>
+              <w:bottom w:type="dxa" w:w="70"/>
+              <w:right w:type="dxa" w:w="100"/>
+            </w:tcMar>
+          </w:tcPr>
+          <w:p>
+            <w:pPr>
+              <w:jc w:val="left"/>
+            </w:pPr>
+            <w:r>
+              <w:rPr>
+                <w:rFonts w:ascii="Arial" w:cs="Arial" w:eastAsia="Arial" w:hAnsi="Arial"/>
+                <w:b w:val="false"/>
+                <w:bCs w:val="false"/>
+                <w:color w:val="0E3A4E"/>
+                <w:sz w:val="19"/>
+                <w:szCs w:val="19"/>
+              </w:rPr>
+              <w:t xml:space="preserve">−$1,199–1,399 (aplicado)</w:t>
+            </w:r>
+          </w:p>
+        </w:tc>
+      </w:tr>
+      <w:tr>
+        <w:trPr>
+          <w:tblHeader w:val="false"/>
+        </w:trPr>
+        <w:tc>
+          <w:tcPr>
+            <w:tcW w:type="dxa" w:w="2000"/>
+            <w:shd w:fill="F6F9FA" w:color="auto" w:val="clear"/>
+            <w:tcMar>
+              <w:top w:type="dxa" w:w="70"/>
+              <w:left w:type="dxa" w:w="100"/>
+              <w:bottom w:type="dxa" w:w="70"/>
+              <w:right w:type="dxa" w:w="100"/>
+            </w:tcMar>
+          </w:tcPr>
+          <w:p>
+            <w:pPr>
+              <w:jc w:val="left"/>
+            </w:pPr>
+            <w:r>
+              <w:rPr>
+                <w:rFonts w:ascii="Arial" w:cs="Arial" w:eastAsia="Arial" w:hAnsi="Arial"/>
+                <w:b w:val="false"/>
+                <w:bCs w:val="false"/>
+                <w:color w:val="0E3A4E"/>
+                <w:sz w:val="19"/>
+                <w:szCs w:val="19"/>
+              </w:rPr>
+              <w:t xml:space="preserve">Software de la cámara</w:t>
+            </w:r>
+          </w:p>
+        </w:tc>
+        <w:tc>
+          <w:tcPr>
+            <w:tcW w:type="dxa" w:w="1400"/>
+            <w:shd w:fill="F6F9FA" w:color="auto" w:val="clear"/>
+            <w:tcMar>
+              <w:top w:type="dxa" w:w="70"/>
+              <w:left w:type="dxa" w:w="100"/>
+              <w:bottom w:type="dxa" w:w="70"/>
+              <w:right w:type="dxa" w:w="100"/>
+            </w:tcMar>
+          </w:tcPr>
+          <w:p>
+            <w:pPr>
+              <w:jc w:val="left"/>
+            </w:pPr>
+            <w:r>
+              <w:rPr>
+                <w:rFonts w:ascii="Arial" w:cs="Arial" w:eastAsia="Arial" w:hAnsi="Arial"/>
+                <w:b w:val="false"/>
+                <w:bCs w:val="false"/>
+                <w:color w:val="0E3A4E"/>
+                <w:sz w:val="19"/>
+                <w:szCs w:val="19"/>
+              </w:rPr>
+              <w:t xml:space="preserve">—</w:t>
+            </w:r>
+          </w:p>
+        </w:tc>
+        <w:tc>
+          <w:tcPr>
+            <w:tcW w:type="dxa" w:w="1300"/>
+            <w:shd w:fill="F6F9FA" w:color="auto" w:val="clear"/>
+            <w:tcMar>
+              <w:top w:type="dxa" w:w="70"/>
+              <w:left w:type="dxa" w:w="100"/>
+              <w:bottom w:type="dxa" w:w="70"/>
+              <w:right w:type="dxa" w:w="100"/>
+            </w:tcMar>
+          </w:tcPr>
+          <w:p>
+            <w:pPr>
+              <w:jc w:val="left"/>
+            </w:pPr>
+            <w:r>
+              <w:rPr>
+                <w:rFonts w:ascii="Arial" w:cs="Arial" w:eastAsia="Arial" w:hAnsi="Arial"/>
+                <w:b/>
+                <w:bCs/>
+                <w:color w:val="0E3A4E"/>
+                <w:sz w:val="19"/>
+                <w:szCs w:val="19"/>
+              </w:rPr>
+              <w:t xml:space="preserve">No se paga</w:t>
+            </w:r>
+          </w:p>
+        </w:tc>
+        <w:tc>
+          <w:tcPr>
+            <w:tcW w:type="dxa" w:w="3260"/>
+            <w:shd w:fill="F6F9FA" w:color="auto" w:val="clear"/>
+            <w:tcMar>
+              <w:top w:type="dxa" w:w="70"/>
+              <w:left w:type="dxa" w:w="100"/>
+              <w:bottom w:type="dxa" w:w="70"/>
+              <w:right w:type="dxa" w:w="100"/>
+            </w:tcMar>
+          </w:tcPr>
+          <w:p>
+            <w:pPr>
+              <w:jc w:val="left"/>
+            </w:pPr>
+            <w:r>
+              <w:rPr>
+                <w:rFonts w:ascii="Arial" w:cs="Arial" w:eastAsia="Arial" w:hAnsi="Arial"/>
+                <w:b w:val="false"/>
+                <w:bCs w:val="false"/>
+                <w:color w:val="0E3A4E"/>
+                <w:sz w:val="19"/>
+                <w:szCs w:val="19"/>
+              </w:rPr>
+              <w:t xml:space="preserve">DJI Mimo y las apps de Sony son gratis</w:t>
+            </w:r>
+          </w:p>
+        </w:tc>
+        <w:tc>
+          <w:tcPr>
+            <w:tcW w:type="dxa" w:w="1400"/>
+            <w:shd w:fill="F6F9FA" w:color="auto" w:val="clear"/>
+            <w:tcMar>
+              <w:top w:type="dxa" w:w="70"/>
+              <w:left w:type="dxa" w:w="100"/>
+              <w:bottom w:type="dxa" w:w="70"/>
+              <w:right w:type="dxa" w:w="100"/>
+            </w:tcMar>
+          </w:tcPr>
+          <w:p>
+            <w:pPr>
+              <w:jc w:val="left"/>
+            </w:pPr>
+            <w:r>
+              <w:rPr>
+                <w:rFonts w:ascii="Arial" w:cs="Arial" w:eastAsia="Arial" w:hAnsi="Arial"/>
+                <w:b w:val="false"/>
+                <w:bCs w:val="false"/>
+                <w:color w:val="0E3A4E"/>
+                <w:sz w:val="19"/>
+                <w:szCs w:val="19"/>
+              </w:rPr>
+              <w:t xml:space="preserve">$0</w:t>
+            </w:r>
+          </w:p>
+        </w:tc>
+      </w:tr>
+      <w:tr>
+        <w:trPr>
+          <w:tblHeader w:val="false"/>
+        </w:trPr>
+        <w:tc>
+          <w:tcPr>
+            <w:tcW w:type="dxa" w:w="2000"/>
+            <w:shd w:fill="FFFFFF" w:color="auto" w:val="clear"/>
+            <w:tcMar>
+              <w:top w:type="dxa" w:w="70"/>
+              <w:left w:type="dxa" w:w="100"/>
+              <w:bottom w:type="dxa" w:w="70"/>
+              <w:right w:type="dxa" w:w="100"/>
+            </w:tcMar>
+          </w:tcPr>
+          <w:p>
+            <w:pPr>
+              <w:jc w:val="left"/>
+            </w:pPr>
+            <w:r>
+              <w:rPr>
+                <w:rFonts w:ascii="Arial" w:cs="Arial" w:eastAsia="Arial" w:hAnsi="Arial"/>
+                <w:b w:val="false"/>
+                <w:bCs w:val="false"/>
+                <w:color w:val="0E3A4E"/>
+                <w:sz w:val="19"/>
+                <w:szCs w:val="19"/>
+              </w:rPr>
+              <w:t xml:space="preserve">Osmo Pocket 4P</w:t>
+            </w:r>
+          </w:p>
+        </w:tc>
+        <w:tc>
+          <w:tcPr>
+            <w:tcW w:type="dxa" w:w="1400"/>
+            <w:shd w:fill="FFFFFF" w:color="auto" w:val="clear"/>
+            <w:tcMar>
+              <w:top w:type="dxa" w:w="70"/>
+              <w:left w:type="dxa" w:w="100"/>
+              <w:bottom w:type="dxa" w:w="70"/>
+              <w:right w:type="dxa" w:w="100"/>
+            </w:tcMar>
+          </w:tcPr>
+          <w:p>
+            <w:pPr>
+              <w:jc w:val="left"/>
+            </w:pPr>
+            <w:r>
+              <w:rPr>
+                <w:rFonts w:ascii="Arial" w:cs="Arial" w:eastAsia="Arial" w:hAnsi="Arial"/>
+                <w:b w:val="false"/>
+                <w:bCs w:val="false"/>
+                <w:color w:val="0E3A4E"/>
+                <w:sz w:val="19"/>
+                <w:szCs w:val="19"/>
+              </w:rPr>
+              <w:t xml:space="preserve">$11,999–12,999</w:t>
+            </w:r>
+          </w:p>
+        </w:tc>
+        <w:tc>
+          <w:tcPr>
+            <w:tcW w:type="dxa" w:w="1300"/>
+            <w:shd w:fill="FFFFFF" w:color="auto" w:val="clear"/>
+            <w:tcMar>
+              <w:top w:type="dxa" w:w="70"/>
+              <w:left w:type="dxa" w:w="100"/>
+              <w:bottom w:type="dxa" w:w="70"/>
+              <w:right w:type="dxa" w:w="100"/>
+            </w:tcMar>
+          </w:tcPr>
+          <w:p>
+            <w:pPr>
+              <w:jc w:val="left"/>
+            </w:pPr>
+            <w:r>
+              <w:rPr>
+                <w:rFonts w:ascii="Arial" w:cs="Arial" w:eastAsia="Arial" w:hAnsi="Arial"/>
+                <w:b/>
+                <w:bCs/>
+                <w:color w:val="0E3A4E"/>
+                <w:sz w:val="19"/>
+                <w:szCs w:val="19"/>
+              </w:rPr>
+              <w:t xml:space="preserve">Ajustable</w:t>
+            </w:r>
+          </w:p>
+        </w:tc>
+        <w:tc>
+          <w:tcPr>
+            <w:tcW w:type="dxa" w:w="3260"/>
+            <w:shd w:fill="FFFFFF" w:color="auto" w:val="clear"/>
+            <w:tcMar>
+              <w:top w:type="dxa" w:w="70"/>
+              <w:left w:type="dxa" w:w="100"/>
+              <w:bottom w:type="dxa" w:w="70"/>
+              <w:right w:type="dxa" w:w="100"/>
+            </w:tcMar>
+          </w:tcPr>
+          <w:p>
+            <w:pPr>
+              <w:jc w:val="left"/>
+            </w:pPr>
+            <w:r>
+              <w:rPr>
+                <w:rFonts w:ascii="Arial" w:cs="Arial" w:eastAsia="Arial" w:hAnsi="Arial"/>
+                <w:b w:val="false"/>
+                <w:bCs w:val="false"/>
+                <w:color w:val="0E3A4E"/>
+                <w:sz w:val="19"/>
+                <w:szCs w:val="19"/>
+              </w:rPr>
+              <w:t xml:space="preserve">La Pocket 4 ($9,599) graba igual para redes; la 4P suma un segundo lente con zoom 3x</w:t>
+            </w:r>
+          </w:p>
+        </w:tc>
+        <w:tc>
+          <w:tcPr>
+            <w:tcW w:type="dxa" w:w="1400"/>
+            <w:shd w:fill="FFFFFF" w:color="auto" w:val="clear"/>
+            <w:tcMar>
+              <w:top w:type="dxa" w:w="70"/>
+              <w:left w:type="dxa" w:w="100"/>
+              <w:bottom w:type="dxa" w:w="70"/>
+              <w:right w:type="dxa" w:w="100"/>
+            </w:tcMar>
+          </w:tcPr>
+          <w:p>
+            <w:pPr>
+              <w:jc w:val="left"/>
+            </w:pPr>
+            <w:r>
+              <w:rPr>
+                <w:rFonts w:ascii="Arial" w:cs="Arial" w:eastAsia="Arial" w:hAnsi="Arial"/>
+                <w:b w:val="false"/>
+                <w:bCs w:val="false"/>
+                <w:color w:val="0E3A4E"/>
+                <w:sz w:val="19"/>
+                <w:szCs w:val="19"/>
+              </w:rPr>
+              <w:t xml:space="preserve">−$2,400 si se cambia</w:t>
+            </w:r>
+          </w:p>
+        </w:tc>
+      </w:tr>
+      <w:tr>
+        <w:trPr>
+          <w:tblHeader w:val="false"/>
+        </w:trPr>
+        <w:tc>
+          <w:tcPr>
+            <w:tcW w:type="dxa" w:w="2000"/>
+            <w:shd w:fill="F6F9FA" w:color="auto" w:val="clear"/>
+            <w:tcMar>
+              <w:top w:type="dxa" w:w="70"/>
+              <w:left w:type="dxa" w:w="100"/>
+              <w:bottom w:type="dxa" w:w="70"/>
+              <w:right w:type="dxa" w:w="100"/>
+            </w:tcMar>
+          </w:tcPr>
+          <w:p>
+            <w:pPr>
+              <w:jc w:val="left"/>
+            </w:pPr>
+            <w:r>
+              <w:rPr>
+                <w:rFonts w:ascii="Arial" w:cs="Arial" w:eastAsia="Arial" w:hAnsi="Arial"/>
+                <w:b w:val="false"/>
+                <w:bCs w:val="false"/>
+                <w:color w:val="0E3A4E"/>
+                <w:sz w:val="19"/>
+                <w:szCs w:val="19"/>
+              </w:rPr>
+              <w:t xml:space="preserve">Claude Team</w:t>
+            </w:r>
+          </w:p>
+        </w:tc>
+        <w:tc>
+          <w:tcPr>
+            <w:tcW w:type="dxa" w:w="1400"/>
+            <w:shd w:fill="F6F9FA" w:color="auto" w:val="clear"/>
+            <w:tcMar>
+              <w:top w:type="dxa" w:w="70"/>
+              <w:left w:type="dxa" w:w="100"/>
+              <w:bottom w:type="dxa" w:w="70"/>
+              <w:right w:type="dxa" w:w="100"/>
+            </w:tcMar>
+          </w:tcPr>
+          <w:p>
+            <w:pPr>
+              <w:jc w:val="left"/>
+            </w:pPr>
+            <w:r>
+              <w:rPr>
+                <w:rFonts w:ascii="Arial" w:cs="Arial" w:eastAsia="Arial" w:hAnsi="Arial"/>
+                <w:b w:val="false"/>
+                <w:bCs w:val="false"/>
+                <w:color w:val="0E3A4E"/>
+                <w:sz w:val="19"/>
+                <w:szCs w:val="19"/>
+              </w:rPr>
+              <w:t xml:space="preserve">$10,579</w:t>
+            </w:r>
+          </w:p>
+        </w:tc>
+        <w:tc>
+          <w:tcPr>
+            <w:tcW w:type="dxa" w:w="1300"/>
+            <w:shd w:fill="F6F9FA" w:color="auto" w:val="clear"/>
+            <w:tcMar>
+              <w:top w:type="dxa" w:w="70"/>
+              <w:left w:type="dxa" w:w="100"/>
+              <w:bottom w:type="dxa" w:w="70"/>
+              <w:right w:type="dxa" w:w="100"/>
+            </w:tcMar>
+          </w:tcPr>
+          <w:p>
+            <w:pPr>
+              <w:jc w:val="left"/>
+            </w:pPr>
+            <w:r>
+              <w:rPr>
+                <w:rFonts w:ascii="Arial" w:cs="Arial" w:eastAsia="Arial" w:hAnsi="Arial"/>
+                <w:b/>
+                <w:bCs/>
+                <w:color w:val="0E3A4E"/>
+                <w:sz w:val="19"/>
+                <w:szCs w:val="19"/>
+              </w:rPr>
+              <w:t xml:space="preserve">Ajustable</w:t>
+            </w:r>
+          </w:p>
+        </w:tc>
+        <w:tc>
+          <w:tcPr>
+            <w:tcW w:type="dxa" w:w="3260"/>
+            <w:shd w:fill="F6F9FA" w:color="auto" w:val="clear"/>
+            <w:tcMar>
+              <w:top w:type="dxa" w:w="70"/>
+              <w:left w:type="dxa" w:w="100"/>
+              <w:bottom w:type="dxa" w:w="70"/>
+              <w:right w:type="dxa" w:w="100"/>
+            </w:tcMar>
+          </w:tcPr>
+          <w:p>
+            <w:pPr>
+              <w:jc w:val="left"/>
+            </w:pPr>
+            <w:r>
+              <w:rPr>
+                <w:rFonts w:ascii="Arial" w:cs="Arial" w:eastAsia="Arial" w:hAnsi="Arial"/>
+                <w:b w:val="false"/>
+                <w:bCs w:val="false"/>
+                <w:color w:val="0E3A4E"/>
+                <w:sz w:val="19"/>
+                <w:szCs w:val="19"/>
+              </w:rPr>
+              <w:t xml:space="preserve">Dos cuentas Claude Pro cuestan $8,816, apagando el entrenamiento a mano</w:t>
+            </w:r>
+          </w:p>
+        </w:tc>
+        <w:tc>
+          <w:tcPr>
+            <w:tcW w:type="dxa" w:w="1400"/>
+            <w:shd w:fill="F6F9FA" w:color="auto" w:val="clear"/>
+            <w:tcMar>
+              <w:top w:type="dxa" w:w="70"/>
+              <w:left w:type="dxa" w:w="100"/>
+              <w:bottom w:type="dxa" w:w="70"/>
+              <w:right w:type="dxa" w:w="100"/>
+            </w:tcMar>
+          </w:tcPr>
+          <w:p>
+            <w:pPr>
+              <w:jc w:val="left"/>
+            </w:pPr>
+            <w:r>
+              <w:rPr>
+                <w:rFonts w:ascii="Arial" w:cs="Arial" w:eastAsia="Arial" w:hAnsi="Arial"/>
+                <w:b w:val="false"/>
+                <w:bCs w:val="false"/>
+                <w:color w:val="0E3A4E"/>
+                <w:sz w:val="19"/>
+                <w:szCs w:val="19"/>
+              </w:rPr>
+              <w:t xml:space="preserve">−$1,763 si se cambia</w:t>
+            </w:r>
+          </w:p>
+        </w:tc>
+      </w:tr>
+      <w:tr>
+        <w:trPr>
+          <w:tblHeader w:val="false"/>
+        </w:trPr>
+        <w:tc>
+          <w:tcPr>
+            <w:tcW w:type="dxa" w:w="2000"/>
+            <w:shd w:fill="FFFFFF" w:color="auto" w:val="clear"/>
+            <w:tcMar>
+              <w:top w:type="dxa" w:w="70"/>
+              <w:left w:type="dxa" w:w="100"/>
+              <w:bottom w:type="dxa" w:w="70"/>
+              <w:right w:type="dxa" w:w="100"/>
+            </w:tcMar>
+          </w:tcPr>
+          <w:p>
+            <w:pPr>
+              <w:jc w:val="left"/>
+            </w:pPr>
+            <w:r>
+              <w:rPr>
+                <w:rFonts w:ascii="Arial" w:cs="Arial" w:eastAsia="Arial" w:hAnsi="Arial"/>
+                <w:b w:val="false"/>
+                <w:bCs w:val="false"/>
+                <w:color w:val="0E3A4E"/>
+                <w:sz w:val="19"/>
+                <w:szCs w:val="19"/>
+              </w:rPr>
+              <w:t xml:space="preserve">Magnific Premium+</w:t>
+            </w:r>
+          </w:p>
+        </w:tc>
+        <w:tc>
+          <w:tcPr>
+            <w:tcW w:type="dxa" w:w="1400"/>
+            <w:shd w:fill="FFFFFF" w:color="auto" w:val="clear"/>
+            <w:tcMar>
+              <w:top w:type="dxa" w:w="70"/>
+              <w:left w:type="dxa" w:w="100"/>
+              <w:bottom w:type="dxa" w:w="70"/>
+              <w:right w:type="dxa" w:w="100"/>
+            </w:tcMar>
+          </w:tcPr>
+          <w:p>
+            <w:pPr>
+              <w:jc w:val="left"/>
+            </w:pPr>
+            <w:r>
+              <w:rPr>
+                <w:rFonts w:ascii="Arial" w:cs="Arial" w:eastAsia="Arial" w:hAnsi="Arial"/>
+                <w:b w:val="false"/>
+                <w:bCs w:val="false"/>
+                <w:color w:val="0E3A4E"/>
+                <w:sz w:val="19"/>
+                <w:szCs w:val="19"/>
+              </w:rPr>
+              <w:t xml:space="preserve">$7,037</w:t>
+            </w:r>
+          </w:p>
+        </w:tc>
+        <w:tc>
+          <w:tcPr>
+            <w:tcW w:type="dxa" w:w="1300"/>
+            <w:shd w:fill="FFFFFF" w:color="auto" w:val="clear"/>
+            <w:tcMar>
+              <w:top w:type="dxa" w:w="70"/>
+              <w:left w:type="dxa" w:w="100"/>
+              <w:bottom w:type="dxa" w:w="70"/>
+              <w:right w:type="dxa" w:w="100"/>
+            </w:tcMar>
+          </w:tcPr>
+          <w:p>
+            <w:pPr>
+              <w:jc w:val="left"/>
+            </w:pPr>
+            <w:r>
+              <w:rPr>
+                <w:rFonts w:ascii="Arial" w:cs="Arial" w:eastAsia="Arial" w:hAnsi="Arial"/>
+                <w:b/>
+                <w:bCs/>
+                <w:color w:val="0E3A4E"/>
+                <w:sz w:val="19"/>
+                <w:szCs w:val="19"/>
+              </w:rPr>
+              <w:t xml:space="preserve">Se queda</w:t>
+            </w:r>
+          </w:p>
+        </w:tc>
+        <w:tc>
+          <w:tcPr>
+            <w:tcW w:type="dxa" w:w="3260"/>
+            <w:shd w:fill="FFFFFF" w:color="auto" w:val="clear"/>
+            <w:tcMar>
+              <w:top w:type="dxa" w:w="70"/>
+              <w:left w:type="dxa" w:w="100"/>
+              <w:bottom w:type="dxa" w:w="70"/>
+              <w:right w:type="dxa" w:w="100"/>
+            </w:tcMar>
+          </w:tcPr>
+          <w:p>
+            <w:pPr>
+              <w:jc w:val="left"/>
+            </w:pPr>
+            <w:r>
+              <w:rPr>
+                <w:rFonts w:ascii="Arial" w:cs="Arial" w:eastAsia="Arial" w:hAnsi="Arial"/>
+                <w:b w:val="false"/>
+                <w:bCs w:val="false"/>
+                <w:color w:val="0E3A4E"/>
+                <w:sz w:val="19"/>
+                <w:szCs w:val="19"/>
+              </w:rPr>
+              <w:t xml:space="preserve">El plan menor da 2.5 veces menos créditos de video</w:t>
+            </w:r>
+          </w:p>
+        </w:tc>
+        <w:tc>
+          <w:tcPr>
+            <w:tcW w:type="dxa" w:w="1400"/>
+            <w:shd w:fill="FFFFFF" w:color="auto" w:val="clear"/>
+            <w:tcMar>
+              <w:top w:type="dxa" w:w="70"/>
+              <w:left w:type="dxa" w:w="100"/>
+              <w:bottom w:type="dxa" w:w="70"/>
+              <w:right w:type="dxa" w:w="100"/>
+            </w:tcMar>
+          </w:tcPr>
+          <w:p>
+            <w:pPr>
+              <w:jc w:val="left"/>
+            </w:pPr>
+            <w:r>
+              <w:rPr>
+                <w:rFonts w:ascii="Arial" w:cs="Arial" w:eastAsia="Arial" w:hAnsi="Arial"/>
+                <w:b w:val="false"/>
+                <w:bCs w:val="false"/>
+                <w:color w:val="0E3A4E"/>
+                <w:sz w:val="19"/>
+                <w:szCs w:val="19"/>
+              </w:rPr>
+              <w:t xml:space="preserve">—</w:t>
+            </w:r>
+          </w:p>
+        </w:tc>
+      </w:tr>
+      <w:tr>
+        <w:trPr>
+          <w:tblHeader w:val="false"/>
+        </w:trPr>
+        <w:tc>
+          <w:tcPr>
+            <w:tcW w:type="dxa" w:w="2000"/>
+            <w:shd w:fill="F6F9FA" w:color="auto" w:val="clear"/>
+            <w:tcMar>
+              <w:top w:type="dxa" w:w="70"/>
+              <w:left w:type="dxa" w:w="100"/>
+              <w:bottom w:type="dxa" w:w="70"/>
+              <w:right w:type="dxa" w:w="100"/>
+            </w:tcMar>
+          </w:tcPr>
+          <w:p>
+            <w:pPr>
+              <w:jc w:val="left"/>
+            </w:pPr>
+            <w:r>
+              <w:rPr>
+                <w:rFonts w:ascii="Arial" w:cs="Arial" w:eastAsia="Arial" w:hAnsi="Arial"/>
+                <w:b w:val="false"/>
+                <w:bCs w:val="false"/>
+                <w:color w:val="0E3A4E"/>
+                <w:sz w:val="19"/>
+                <w:szCs w:val="19"/>
+              </w:rPr>
+              <w:t xml:space="preserve">ManyChat Pro</w:t>
+            </w:r>
+          </w:p>
+        </w:tc>
+        <w:tc>
+          <w:tcPr>
+            <w:tcW w:type="dxa" w:w="1400"/>
+            <w:shd w:fill="F6F9FA" w:color="auto" w:val="clear"/>
+            <w:tcMar>
+              <w:top w:type="dxa" w:w="70"/>
+              <w:left w:type="dxa" w:w="100"/>
+              <w:bottom w:type="dxa" w:w="70"/>
+              <w:right w:type="dxa" w:w="100"/>
+            </w:tcMar>
+          </w:tcPr>
+          <w:p>
+            <w:pPr>
+              <w:jc w:val="left"/>
+            </w:pPr>
+            <w:r>
+              <w:rPr>
+                <w:rFonts w:ascii="Arial" w:cs="Arial" w:eastAsia="Arial" w:hAnsi="Arial"/>
+                <w:b w:val="false"/>
+                <w:bCs w:val="false"/>
+                <w:color w:val="0E3A4E"/>
+                <w:sz w:val="19"/>
+                <w:szCs w:val="19"/>
+              </w:rPr>
+              <w:t xml:space="preserve">$7,670</w:t>
+            </w:r>
+          </w:p>
+        </w:tc>
+        <w:tc>
+          <w:tcPr>
+            <w:tcW w:type="dxa" w:w="1300"/>
+            <w:shd w:fill="F6F9FA" w:color="auto" w:val="clear"/>
+            <w:tcMar>
+              <w:top w:type="dxa" w:w="70"/>
+              <w:left w:type="dxa" w:w="100"/>
+              <w:bottom w:type="dxa" w:w="70"/>
+              <w:right w:type="dxa" w:w="100"/>
+            </w:tcMar>
+          </w:tcPr>
+          <w:p>
+            <w:pPr>
+              <w:jc w:val="left"/>
+            </w:pPr>
+            <w:r>
+              <w:rPr>
+                <w:rFonts w:ascii="Arial" w:cs="Arial" w:eastAsia="Arial" w:hAnsi="Arial"/>
+                <w:b/>
+                <w:bCs/>
+                <w:color w:val="0E3A4E"/>
+                <w:sz w:val="19"/>
+                <w:szCs w:val="19"/>
+              </w:rPr>
+              <w:t xml:space="preserve">Se queda</w:t>
+            </w:r>
+          </w:p>
+        </w:tc>
+        <w:tc>
+          <w:tcPr>
+            <w:tcW w:type="dxa" w:w="3260"/>
+            <w:shd w:fill="F6F9FA" w:color="auto" w:val="clear"/>
+            <w:tcMar>
+              <w:top w:type="dxa" w:w="70"/>
+              <w:left w:type="dxa" w:w="100"/>
+              <w:bottom w:type="dxa" w:w="70"/>
+              <w:right w:type="dxa" w:w="100"/>
+            </w:tcMar>
+          </w:tcPr>
+          <w:p>
+            <w:pPr>
+              <w:jc w:val="left"/>
+            </w:pPr>
+            <w:r>
+              <w:rPr>
+                <w:rFonts w:ascii="Arial" w:cs="Arial" w:eastAsia="Arial" w:hAnsi="Arial"/>
+                <w:b w:val="false"/>
+                <w:bCs w:val="false"/>
+                <w:color w:val="0E3A4E"/>
+                <w:sz w:val="19"/>
+                <w:szCs w:val="19"/>
+              </w:rPr>
+              <w:t xml:space="preserve">El Básico (250 contactos al mes) se llena con una sola dinámica</w:t>
+            </w:r>
+          </w:p>
+        </w:tc>
+        <w:tc>
+          <w:tcPr>
+            <w:tcW w:type="dxa" w:w="1400"/>
+            <w:shd w:fill="F6F9FA" w:color="auto" w:val="clear"/>
+            <w:tcMar>
+              <w:top w:type="dxa" w:w="70"/>
+              <w:left w:type="dxa" w:w="100"/>
+              <w:bottom w:type="dxa" w:w="70"/>
+              <w:right w:type="dxa" w:w="100"/>
+            </w:tcMar>
+          </w:tcPr>
+          <w:p>
+            <w:pPr>
+              <w:jc w:val="left"/>
+            </w:pPr>
+            <w:r>
+              <w:rPr>
+                <w:rFonts w:ascii="Arial" w:cs="Arial" w:eastAsia="Arial" w:hAnsi="Arial"/>
+                <w:b w:val="false"/>
+                <w:bCs w:val="false"/>
+                <w:color w:val="0E3A4E"/>
+                <w:sz w:val="19"/>
+                <w:szCs w:val="19"/>
+              </w:rPr>
+              <w:t xml:space="preserve">—</w:t>
+            </w:r>
+          </w:p>
+        </w:tc>
+      </w:tr>
+      <w:tr>
+        <w:trPr>
+          <w:tblHeader w:val="false"/>
+        </w:trPr>
+        <w:tc>
+          <w:tcPr>
+            <w:tcW w:type="dxa" w:w="2000"/>
+            <w:shd w:fill="FFFFFF" w:color="auto" w:val="clear"/>
+            <w:tcMar>
+              <w:top w:type="dxa" w:w="70"/>
+              <w:left w:type="dxa" w:w="100"/>
+              <w:bottom w:type="dxa" w:w="70"/>
+              <w:right w:type="dxa" w:w="100"/>
+            </w:tcMar>
+          </w:tcPr>
+          <w:p>
+            <w:pPr>
+              <w:jc w:val="left"/>
+            </w:pPr>
+            <w:r>
+              <w:rPr>
+                <w:rFonts w:ascii="Arial" w:cs="Arial" w:eastAsia="Arial" w:hAnsi="Arial"/>
+                <w:b w:val="false"/>
+                <w:bCs w:val="false"/>
+                <w:color w:val="0E3A4E"/>
+                <w:sz w:val="19"/>
+                <w:szCs w:val="19"/>
+              </w:rPr>
+              <w:t xml:space="preserve">Metricool</w:t>
+            </w:r>
+          </w:p>
+        </w:tc>
+        <w:tc>
+          <w:tcPr>
+            <w:tcW w:type="dxa" w:w="1400"/>
+            <w:shd w:fill="FFFFFF" w:color="auto" w:val="clear"/>
+            <w:tcMar>
+              <w:top w:type="dxa" w:w="70"/>
+              <w:left w:type="dxa" w:w="100"/>
+              <w:bottom w:type="dxa" w:w="70"/>
+              <w:right w:type="dxa" w:w="100"/>
+            </w:tcMar>
+          </w:tcPr>
+          <w:p>
+            <w:pPr>
+              <w:jc w:val="left"/>
+            </w:pPr>
+            <w:r>
+              <w:rPr>
+                <w:rFonts w:ascii="Arial" w:cs="Arial" w:eastAsia="Arial" w:hAnsi="Arial"/>
+                <w:b w:val="false"/>
+                <w:bCs w:val="false"/>
+                <w:color w:val="0E3A4E"/>
+                <w:sz w:val="19"/>
+                <w:szCs w:val="19"/>
+              </w:rPr>
+              <w:t xml:space="preserve">$5,290</w:t>
+            </w:r>
+          </w:p>
+        </w:tc>
+        <w:tc>
+          <w:tcPr>
+            <w:tcW w:type="dxa" w:w="1300"/>
+            <w:shd w:fill="FFFFFF" w:color="auto" w:val="clear"/>
+            <w:tcMar>
+              <w:top w:type="dxa" w:w="70"/>
+              <w:left w:type="dxa" w:w="100"/>
+              <w:bottom w:type="dxa" w:w="70"/>
+              <w:right w:type="dxa" w:w="100"/>
+            </w:tcMar>
+          </w:tcPr>
+          <w:p>
+            <w:pPr>
+              <w:jc w:val="left"/>
+            </w:pPr>
+            <w:r>
+              <w:rPr>
+                <w:rFonts w:ascii="Arial" w:cs="Arial" w:eastAsia="Arial" w:hAnsi="Arial"/>
+                <w:b/>
+                <w:bCs/>
+                <w:color w:val="0E3A4E"/>
+                <w:sz w:val="19"/>
+                <w:szCs w:val="19"/>
+              </w:rPr>
+              <w:t xml:space="preserve">Se queda</w:t>
+            </w:r>
+          </w:p>
+        </w:tc>
+        <w:tc>
+          <w:tcPr>
+            <w:tcW w:type="dxa" w:w="3260"/>
+            <w:shd w:fill="FFFFFF" w:color="auto" w:val="clear"/>
+            <w:tcMar>
+              <w:top w:type="dxa" w:w="70"/>
+              <w:left w:type="dxa" w:w="100"/>
+              <w:bottom w:type="dxa" w:w="70"/>
+              <w:right w:type="dxa" w:w="100"/>
+            </w:tcMar>
+          </w:tcPr>
+          <w:p>
+            <w:pPr>
+              <w:jc w:val="left"/>
+            </w:pPr>
+            <w:r>
+              <w:rPr>
+                <w:rFonts w:ascii="Arial" w:cs="Arial" w:eastAsia="Arial" w:hAnsi="Arial"/>
+                <w:b w:val="false"/>
+                <w:bCs w:val="false"/>
+                <w:color w:val="0E3A4E"/>
+                <w:sz w:val="19"/>
+                <w:szCs w:val="19"/>
+              </w:rPr>
+              <w:t xml:space="preserve">Canva solo programa Facebook e Instagram; Metricool suma TikTok, YouTube y LinkedIn</w:t>
+            </w:r>
+          </w:p>
+        </w:tc>
+        <w:tc>
+          <w:tcPr>
+            <w:tcW w:type="dxa" w:w="1400"/>
+            <w:shd w:fill="FFFFFF" w:color="auto" w:val="clear"/>
+            <w:tcMar>
+              <w:top w:type="dxa" w:w="70"/>
+              <w:left w:type="dxa" w:w="100"/>
+              <w:bottom w:type="dxa" w:w="70"/>
+              <w:right w:type="dxa" w:w="100"/>
+            </w:tcMar>
+          </w:tcPr>
+          <w:p>
+            <w:pPr>
+              <w:jc w:val="left"/>
+            </w:pPr>
+            <w:r>
+              <w:rPr>
+                <w:rFonts w:ascii="Arial" w:cs="Arial" w:eastAsia="Arial" w:hAnsi="Arial"/>
+                <w:b w:val="false"/>
+                <w:bCs w:val="false"/>
+                <w:color w:val="0E3A4E"/>
+                <w:sz w:val="19"/>
+                <w:szCs w:val="19"/>
+              </w:rPr>
+              <w:t xml:space="preserve">—</w:t>
+            </w:r>
+          </w:p>
+        </w:tc>
+      </w:tr>
+      <w:tr>
+        <w:trPr>
+          <w:tblHeader w:val="false"/>
+        </w:trPr>
+        <w:tc>
+          <w:tcPr>
+            <w:tcW w:type="dxa" w:w="2000"/>
+            <w:shd w:fill="F6F9FA" w:color="auto" w:val="clear"/>
+            <w:tcMar>
+              <w:top w:type="dxa" w:w="70"/>
+              <w:left w:type="dxa" w:w="100"/>
+              <w:bottom w:type="dxa" w:w="70"/>
+              <w:right w:type="dxa" w:w="100"/>
+            </w:tcMar>
+          </w:tcPr>
+          <w:p>
+            <w:pPr>
+              <w:jc w:val="left"/>
+            </w:pPr>
+            <w:r>
+              <w:rPr>
+                <w:rFonts w:ascii="Arial" w:cs="Arial" w:eastAsia="Arial" w:hAnsi="Arial"/>
+                <w:b w:val="false"/>
+                <w:bCs w:val="false"/>
+                <w:color w:val="0E3A4E"/>
+                <w:sz w:val="19"/>
+                <w:szCs w:val="19"/>
+              </w:rPr>
+              <w:t xml:space="preserve">X Premium</w:t>
+            </w:r>
+          </w:p>
+        </w:tc>
+        <w:tc>
+          <w:tcPr>
+            <w:tcW w:type="dxa" w:w="1400"/>
+            <w:shd w:fill="F6F9FA" w:color="auto" w:val="clear"/>
+            <w:tcMar>
+              <w:top w:type="dxa" w:w="70"/>
+              <w:left w:type="dxa" w:w="100"/>
+              <w:bottom w:type="dxa" w:w="70"/>
+              <w:right w:type="dxa" w:w="100"/>
+            </w:tcMar>
+          </w:tcPr>
+          <w:p>
+            <w:pPr>
+              <w:jc w:val="left"/>
+            </w:pPr>
+            <w:r>
+              <w:rPr>
+                <w:rFonts w:ascii="Arial" w:cs="Arial" w:eastAsia="Arial" w:hAnsi="Arial"/>
+                <w:b w:val="false"/>
+                <w:bCs w:val="false"/>
+                <w:color w:val="0E3A4E"/>
+                <w:sz w:val="19"/>
+                <w:szCs w:val="19"/>
+              </w:rPr>
+              <w:t xml:space="preserve">$1,520</w:t>
+            </w:r>
+          </w:p>
+        </w:tc>
+        <w:tc>
+          <w:tcPr>
+            <w:tcW w:type="dxa" w:w="1300"/>
+            <w:shd w:fill="F6F9FA" w:color="auto" w:val="clear"/>
+            <w:tcMar>
+              <w:top w:type="dxa" w:w="70"/>
+              <w:left w:type="dxa" w:w="100"/>
+              <w:bottom w:type="dxa" w:w="70"/>
+              <w:right w:type="dxa" w:w="100"/>
+            </w:tcMar>
+          </w:tcPr>
+          <w:p>
+            <w:pPr>
+              <w:jc w:val="left"/>
+            </w:pPr>
+            <w:r>
+              <w:rPr>
+                <w:rFonts w:ascii="Arial" w:cs="Arial" w:eastAsia="Arial" w:hAnsi="Arial"/>
+                <w:b/>
+                <w:bCs/>
+                <w:color w:val="0E3A4E"/>
+                <w:sz w:val="19"/>
+                <w:szCs w:val="19"/>
+              </w:rPr>
+              <w:t xml:space="preserve">Opcional</w:t>
+            </w:r>
+          </w:p>
+        </w:tc>
+        <w:tc>
+          <w:tcPr>
+            <w:tcW w:type="dxa" w:w="3260"/>
+            <w:shd w:fill="F6F9FA" w:color="auto" w:val="clear"/>
+            <w:tcMar>
+              <w:top w:type="dxa" w:w="70"/>
+              <w:left w:type="dxa" w:w="100"/>
+              <w:bottom w:type="dxa" w:w="70"/>
+              <w:right w:type="dxa" w:w="100"/>
+            </w:tcMar>
+          </w:tcPr>
+          <w:p>
+            <w:pPr>
+              <w:jc w:val="left"/>
+            </w:pPr>
+            <w:r>
+              <w:rPr>
+                <w:rFonts w:ascii="Arial" w:cs="Arial" w:eastAsia="Arial" w:hAnsi="Arial"/>
+                <w:b w:val="false"/>
+                <w:bCs w:val="false"/>
+                <w:color w:val="0E3A4E"/>
+                <w:sz w:val="19"/>
+                <w:szCs w:val="19"/>
+              </w:rPr>
+              <w:t xml:space="preserve">Barato; se puede quitar si X no es prioridad</w:t>
+            </w:r>
+          </w:p>
+        </w:tc>
+        <w:tc>
+          <w:tcPr>
+            <w:tcW w:type="dxa" w:w="1400"/>
+            <w:shd w:fill="F6F9FA" w:color="auto" w:val="clear"/>
+            <w:tcMar>
+              <w:top w:type="dxa" w:w="70"/>
+              <w:left w:type="dxa" w:w="100"/>
+              <w:bottom w:type="dxa" w:w="70"/>
+              <w:right w:type="dxa" w:w="100"/>
+            </w:tcMar>
+          </w:tcPr>
+          <w:p>
+            <w:pPr>
+              <w:jc w:val="left"/>
+            </w:pPr>
+            <w:r>
+              <w:rPr>
+                <w:rFonts w:ascii="Arial" w:cs="Arial" w:eastAsia="Arial" w:hAnsi="Arial"/>
+                <w:b w:val="false"/>
+                <w:bCs w:val="false"/>
+                <w:color w:val="0E3A4E"/>
+                <w:sz w:val="19"/>
+                <w:szCs w:val="19"/>
+              </w:rPr>
+              <w:t xml:space="preserve">−$1,520 si se quita</w:t>
+            </w:r>
+          </w:p>
+        </w:tc>
+      </w:tr>
+    </w:tbl>
+    <w:p>
+      <w:pPr>
+        <w:spacing w:after="120" w:before="80"/>
+      </w:pPr>
+      <w:r>
+        <w:rPr>
+          <w:rFonts w:ascii="Arial" w:cs="Arial" w:eastAsia="Arial" w:hAnsi="Arial"/>
+          <w:i/>
+          <w:iCs/>
+          <w:color w:val="3D5866"/>
+          <w:sz w:val="19"/>
+          <w:szCs w:val="19"/>
+        </w:rPr>
+        <w:t xml:space="preserve">Ya aplicado en este presupuesto: fuera Illustrator y el mango con batería. Los ajustables quedan a decisión.</w:t>
       </w:r>
     </w:p>
     <w:p>
@@ -969,7 +2475,7 @@
             </w:tcMar>
           </w:tcPr>
           <w:p>
-            <w:hyperlink w:history="1" r:id="rIdhflwqqsvha2fs0abi2jcm">
+            <w:hyperlink w:history="1" r:id="rIdk_gilzt9u7kfu18fv3xku">
               <w:r>
                 <w:rPr>
                   <w:rFonts w:ascii="Arial" w:cs="Arial" w:eastAsia="Arial" w:hAnsi="Arial"/>
@@ -1112,7 +2618,7 @@
             </w:tcMar>
           </w:tcPr>
           <w:p>
-            <w:hyperlink w:history="1" r:id="rId98mb2h0yj17grtlailo5i">
+            <w:hyperlink w:history="1" r:id="rIdlaj4vibkki69agl_n-iwd">
               <w:r>
                 <w:rPr>
                   <w:rFonts w:ascii="Arial" w:cs="Arial" w:eastAsia="Arial" w:hAnsi="Arial"/>
@@ -1255,7 +2761,7 @@
             </w:tcMar>
           </w:tcPr>
           <w:p>
-            <w:hyperlink w:history="1" r:id="rIdjgokqwxcpqrcuutoytoxb">
+            <w:hyperlink w:history="1" r:id="rIdq6a9co7p11ca_e8sl2cao">
               <w:r>
                 <w:rPr>
                   <w:rFonts w:ascii="Arial" w:cs="Arial" w:eastAsia="Arial" w:hAnsi="Arial"/>
@@ -1466,6 +2972,73 @@
           <w:sz w:val="26"/>
           <w:szCs w:val="26"/>
         </w:rPr>
+        <w:t xml:space="preserve">Cámara de video · año 1</w:t>
+      </w:r>
+    </w:p>
+    <w:p>
+      <w:pPr>
+        <w:spacing w:after="40" w:before="0"/>
+      </w:pPr>
+      <w:r>
+        <w:rPr>
+          <w:rFonts w:ascii="Arial" w:cs="Arial" w:eastAsia="Arial" w:hAnsi="Arial"/>
+          <w:b/>
+          <w:bCs/>
+          <w:color w:val="0E3A4E"/>
+          <w:sz w:val="22"/>
+          <w:szCs w:val="22"/>
+        </w:rPr>
+        <w:t xml:space="preserve">Por qué: </w:t>
+      </w:r>
+      <w:r>
+        <w:rPr>
+          <w:rFonts w:ascii="Arial" w:cs="Arial" w:eastAsia="Arial" w:hAnsi="Arial"/>
+          <w:color w:val="0E3A4E"/>
+          <w:sz w:val="22"/>
+          <w:szCs w:val="22"/>
+        </w:rPr>
+        <w:t xml:space="preserve">Sube el nivel de todo lo que publicamos: imagen estable, 4K y buena respuesta con la poca luz de salones y foros. El contenido institucional y de redes se ve profesional sin contratar producción externa.</w:t>
+      </w:r>
+    </w:p>
+    <w:p>
+      <w:pPr>
+        <w:spacing w:after="120" w:before="0"/>
+      </w:pPr>
+      <w:r>
+        <w:rPr>
+          <w:rFonts w:ascii="Arial" w:cs="Arial" w:eastAsia="Arial" w:hAnsi="Arial"/>
+          <w:b/>
+          <w:bCs/>
+          <w:color w:val="0E3A4E"/>
+          <w:sz w:val="22"/>
+          <w:szCs w:val="22"/>
+        </w:rPr>
+        <w:t xml:space="preserve">Ejemplo: </w:t>
+      </w:r>
+      <w:r>
+        <w:rPr>
+          <w:rFonts w:ascii="Arial" w:cs="Arial" w:eastAsia="Arial" w:hAnsi="Arial"/>
+          <w:color w:val="0E3A4E"/>
+          <w:sz w:val="22"/>
+          <w:szCs w:val="22"/>
+        </w:rPr>
+        <w:t xml:space="preserve">El video institucional del recinto, entrevistas a organizadores y el reel del montaje de un evento se graban con calidad de producción y salen el mismo día.</w:t>
+      </w:r>
+    </w:p>
+    <w:p>
+      <w:pPr>
+        <w:pStyle w:val="Heading2"/>
+        <w:spacing w:after="80" w:before="200"/>
+      </w:pPr>
+      <w:r>
+        <w:rPr>
+          <w:rFonts w:ascii="Arial" w:cs="Arial" w:eastAsia="Arial" w:hAnsi="Arial"/>
+          <w:b/>
+          <w:bCs/>
+          <w:color w:val="175772"/>
+          <w:sz w:val="26"/>
+          <w:szCs w:val="26"/>
+        </w:rPr>
         <w:t xml:space="preserve">ManyChat Pro · $7,670/año</w:t>
       </w:r>
     </w:p>
@@ -1491,7 +3064,7 @@
           <w:sz w:val="22"/>
           <w:szCs w:val="22"/>
         </w:rPr>
-        <w:t xml:space="preserve">Contesta en automático los mensajes privados de Instagram y Facebook y las dinámicas de comentarios.</w:t>
+        <w:t xml:space="preserve">Convierte comentarios en leads. Cada persona que comenta una palabra clave recibe al instante un mensaje privado con el link o la información, y de paso contesta solo los mensajes frecuentes de Instagram y Facebook, de día y de noche.</w:t>
       </w:r>
     </w:p>
     <w:p>
@@ -1516,7 +3089,7 @@
           <w:sz w:val="22"/>
           <w:szCs w:val="22"/>
         </w:rPr>
-        <w:t xml:space="preserve">Alguien comenta "BOLETOS" y le llega por mensaje el link oficial.</w:t>
+        <w:t xml:space="preserve">En la campaña de Maricela Cordero llegaron unos 3 leads sin pagar publicidad, respondiendo a mano. Con ManyChat cada comentario se contesta solo y al momento: más leads con el mismo contenido.</w:t>
       </w:r>
     </w:p>
     <w:p>
@@ -1558,7 +3131,7 @@
           <w:sz w:val="22"/>
           <w:szCs w:val="22"/>
         </w:rPr>
-        <w:t xml:space="preserve">Publica directo en Facebook, Instagram, TikTok, YouTube y LinkedIn desde un calendario, y mide qué funciona.</w:t>
+        <w:t xml:space="preserve">Hace más sencillo y eficaz publicar: un solo calendario para Facebook, Instagram, TikTok, YouTube y LinkedIn, mejores horarios sugeridos y reportes automáticos.</w:t>
       </w:r>
     </w:p>
     <w:p>
@@ -1583,7 +3156,7 @@
           <w:sz w:val="22"/>
           <w:szCs w:val="22"/>
         </w:rPr>
-        <w:t xml:space="preserve">El reporte mensual de campañas para Dirección sale en un clic.</w:t>
+        <w:t xml:space="preserve">El lunes se programa la semana completa de eventos en una sola sesión, y el reporte mensual para Dirección sale en un clic.</w:t>
       </w:r>
     </w:p>
     <w:p>
@@ -1625,7 +3198,7 @@
           <w:sz w:val="22"/>
           <w:szCs w:val="22"/>
         </w:rPr>
-        <w:t xml:space="preserve">Palomita de verificación en la cuenta oficial del recinto.</w:t>
+        <w:t xml:space="preserve">Palomita de verificación en la cuenta oficial: la gente distingue la cuenta real de las falsas y las publicaciones tienen más alcance.</w:t>
       </w:r>
     </w:p>
     <w:p>
@@ -1650,74 +3223,7 @@
           <w:sz w:val="22"/>
           <w:szCs w:val="22"/>
         </w:rPr>
-        <w:t xml:space="preserve">Avisos de accesos y horarios que nadie confunde con cuentas falsas.</w:t>
-      </w:r>
-    </w:p>
-    <w:p>
-      <w:pPr>
-        <w:pStyle w:val="Heading2"/>
-        <w:spacing w:after="80" w:before="200"/>
-      </w:pPr>
-      <w:r>
-        <w:rPr>
-          <w:rFonts w:ascii="Arial" w:cs="Arial" w:eastAsia="Arial" w:hAnsi="Arial"/>
-          <w:b/>
-          <w:bCs/>
-          <w:color w:val="175772"/>
-          <w:sz w:val="26"/>
-          <w:szCs w:val="26"/>
-        </w:rPr>
-        <w:t xml:space="preserve">Cámara de video · desde $13,200</w:t>
-      </w:r>
-    </w:p>
-    <w:p>
-      <w:pPr>
-        <w:spacing w:after="40" w:before="0"/>
-      </w:pPr>
-      <w:r>
-        <w:rPr>
-          <w:rFonts w:ascii="Arial" w:cs="Arial" w:eastAsia="Arial" w:hAnsi="Arial"/>
-          <w:b/>
-          <w:bCs/>
-          <w:color w:val="0E3A4E"/>
-          <w:sz w:val="22"/>
-          <w:szCs w:val="22"/>
-        </w:rPr>
-        <w:t xml:space="preserve">Por qué: </w:t>
-      </w:r>
-      <w:r>
-        <w:rPr>
-          <w:rFonts w:ascii="Arial" w:cs="Arial" w:eastAsia="Arial" w:hAnsi="Arial"/>
-          <w:color w:val="0E3A4E"/>
-          <w:sz w:val="22"/>
-          <w:szCs w:val="22"/>
-        </w:rPr>
-        <w:t xml:space="preserve">Video estable y con calidad para cobertura de eventos, entrevistas y reels.</w:t>
-      </w:r>
-    </w:p>
-    <w:p>
-      <w:pPr>
-        <w:spacing w:after="120" w:before="0"/>
-      </w:pPr>
-      <w:r>
-        <w:rPr>
-          <w:rFonts w:ascii="Arial" w:cs="Arial" w:eastAsia="Arial" w:hAnsi="Arial"/>
-          <w:b/>
-          <w:bCs/>
-          <w:color w:val="0E3A4E"/>
-          <w:sz w:val="22"/>
-          <w:szCs w:val="22"/>
-        </w:rPr>
-        <w:t xml:space="preserve">Ejemplo: </w:t>
-      </w:r>
-      <w:r>
-        <w:rPr>
-          <w:rFonts w:ascii="Arial" w:cs="Arial" w:eastAsia="Arial" w:hAnsi="Arial"/>
-          <w:color w:val="0E3A4E"/>
-          <w:sz w:val="22"/>
-          <w:szCs w:val="22"/>
-        </w:rPr>
-        <w:t xml:space="preserve">La cobertura de un evento se graba y se publica el mismo día, sin contratar producción.</w:t>
+        <w:t xml:space="preserve">En un evento masivo, los avisos de accesos, estacionamiento y horarios se reconocen como oficiales al instante.</w:t>
       </w:r>
     </w:p>
     <w:p>
@@ -2681,7 +4187,7 @@
                 <w:sz w:val="19"/>
                 <w:szCs w:val="19"/>
               </w:rPr>
-              <w:t xml:space="preserve">Mango con batería DJI · $1,199–1,399</w:t>
+              <w:t xml:space="preserve">Integrada, hasta ~4 h a 1080p</w:t>
             </w:r>
           </w:p>
         </w:tc>
@@ -2798,7 +4304,7 @@
                 <w:sz w:val="19"/>
                 <w:szCs w:val="19"/>
               </w:rPr>
-              <w:t xml:space="preserve">$13,200–14,400</w:t>
+              <w:t xml:space="preserve">$11,999–12,999</w:t>
             </w:r>
           </w:p>
         </w:tc>
@@ -3040,7 +4546,7 @@
                 <w:sz w:val="19"/>
                 <w:szCs w:val="19"/>
               </w:rPr>
-              <w:t xml:space="preserve">Osmo Pocket 4P + mango con batería DJI</w:t>
+              <w:t xml:space="preserve">Osmo Pocket 4P (sola)</w:t>
             </w:r>
           </w:p>
         </w:tc>
@@ -3068,7 +4574,7 @@
                 <w:sz w:val="19"/>
                 <w:szCs w:val="19"/>
               </w:rPr>
-              <w:t xml:space="preserve">Sí, oficial</w:t>
+              <w:t xml:space="preserve">Todo integrado</w:t>
             </w:r>
           </w:p>
         </w:tc>
@@ -3096,7 +4602,7 @@
                 <w:sz w:val="19"/>
                 <w:szCs w:val="19"/>
               </w:rPr>
-              <w:t xml:space="preserve">Estabilizador integrado; el mango suma ~130 min a 1080p y se cambia sin apagar</w:t>
+              <w:t xml:space="preserve">Estabilizador de 3 ejes, micrófonos y batería de hasta ~4 h; no necesita accesorios ni software de pago</w:t>
             </w:r>
           </w:p>
         </w:tc>
@@ -3124,7 +4630,7 @@
                 <w:sz w:val="19"/>
                 <w:szCs w:val="19"/>
               </w:rPr>
-              <w:t xml:space="preserve">Comprar el mango oficial: los de otras marcas chocan con la tapa protectora</w:t>
+              <w:t xml:space="preserve">Si una jornada pasa de 4 h: mango oficial (~$1,200) o power bank</w:t>
             </w:r>
           </w:p>
         </w:tc>
@@ -3706,7 +5212,7 @@
                 <w:sz w:val="19"/>
                 <w:szCs w:val="19"/>
               </w:rPr>
-              <w:t xml:space="preserve">$13,200–14,400</w:t>
+              <w:t xml:space="preserve">$11,999–12,999</w:t>
             </w:r>
           </w:p>
         </w:tc>
@@ -3823,7 +5329,7 @@
                 <w:sz w:val="19"/>
                 <w:szCs w:val="19"/>
               </w:rPr>
-              <w:t xml:space="preserve">$27,680–28,880</w:t>
+              <w:t xml:space="preserve">$26,479–27,479</w:t>
             </w:r>
           </w:p>
         </w:tc>
@@ -3936,7 +5442,7 @@
         </w:numPr>
         <w:spacing w:after="60"/>
       </w:pPr>
-      <w:hyperlink w:history="1" r:id="rIdun7sbmb-gungcbvejvdfo">
+      <w:hyperlink w:history="1" r:id="rIdepgq4zmb_wk7pchc97osy">
         <w:r>
           <w:rPr>
             <w:rFonts w:ascii="Arial" w:cs="Arial" w:eastAsia="Arial" w:hAnsi="Arial"/>
@@ -3958,7 +5464,7 @@
         </w:numPr>
         <w:spacing w:after="60"/>
       </w:pPr>
-      <w:hyperlink w:history="1" r:id="rIdfyfgzhtfn1tr97tnlxjcn">
+      <w:hyperlink w:history="1" r:id="rIdnclgol32mmnyr-c12ufgi">
         <w:r>
           <w:rPr>
             <w:rFonts w:ascii="Arial" w:cs="Arial" w:eastAsia="Arial" w:hAnsi="Arial"/>
@@ -3980,7 +5486,7 @@
         </w:numPr>
         <w:spacing w:after="60"/>
       </w:pPr>
-      <w:hyperlink w:history="1" r:id="rIdp1aruxuulyiwkyxlkx1t8">
+      <w:hyperlink w:history="1" r:id="rId8cmeaszascqmp0rhsz07e">
         <w:r>
           <w:rPr>
             <w:rFonts w:ascii="Arial" w:cs="Arial" w:eastAsia="Arial" w:hAnsi="Arial"/>
@@ -4002,7 +5508,7 @@
         </w:numPr>
         <w:spacing w:after="60"/>
       </w:pPr>
-      <w:hyperlink w:history="1" r:id="rIdajdzjua5x5bwjaa6zl7rj">
+      <w:hyperlink w:history="1" r:id="rIdezyudkskpvljk436jiski">
         <w:r>
           <w:rPr>
             <w:rFonts w:ascii="Arial" w:cs="Arial" w:eastAsia="Arial" w:hAnsi="Arial"/>
@@ -4024,29 +5530,7 @@
         </w:numPr>
         <w:spacing w:after="60"/>
       </w:pPr>
-      <w:hyperlink w:history="1" r:id="rIdvuhijc6qf63wyhe4b2mxg">
-        <w:r>
-          <w:rPr>
-            <w:rFonts w:ascii="Arial" w:cs="Arial" w:eastAsia="Arial" w:hAnsi="Arial"/>
-            <w:color w:val="039AD1"/>
-            <w:sz w:val="20"/>
-            <w:szCs w:val="20"/>
-            <w:u w:val="single"/>
-          </w:rPr>
-          <w:t xml:space="preserve">Mango con batería Osmo Pocket 4 · Amazon México</w:t>
-        </w:r>
-      </w:hyperlink>
-    </w:p>
-    <w:p>
-      <w:pPr>
-        <w:pStyle w:val="ListParagraph"/>
-        <w:numPr>
-          <w:ilvl w:val="0"/>
-          <w:numId w:val="2"/>
-        </w:numPr>
-        <w:spacing w:after="60"/>
-      </w:pPr>
-      <w:hyperlink w:history="1" r:id="rIdaeceeclgyxpfpvynq1hb7">
+      <w:hyperlink w:history="1" r:id="rIducxvcvr5g-c93r-dkgbgk">
         <w:r>
           <w:rPr>
             <w:rFonts w:ascii="Arial" w:cs="Arial" w:eastAsia="Arial" w:hAnsi="Arial"/>
@@ -4068,7 +5552,7 @@
         </w:numPr>
         <w:spacing w:after="60"/>
       </w:pPr>
-      <w:hyperlink w:history="1" r:id="rIdizjiwjyo0f1edyprebne7">
+      <w:hyperlink w:history="1" r:id="rIdgxcmwqd9uhgr_mfk8rq6u">
         <w:r>
           <w:rPr>
             <w:rFonts w:ascii="Arial" w:cs="Arial" w:eastAsia="Arial" w:hAnsi="Arial"/>
@@ -4090,7 +5574,7 @@
         </w:numPr>
         <w:spacing w:after="60"/>
       </w:pPr>
-      <w:hyperlink w:history="1" r:id="rIdw8oal1qppx1yif0_hembf">
+      <w:hyperlink w:history="1" r:id="rId5efa8xnqivjkeqnrc4gph">
         <w:r>
           <w:rPr>
             <w:rFonts w:ascii="Arial" w:cs="Arial" w:eastAsia="Arial" w:hAnsi="Arial"/>
@@ -4153,7 +5637,7 @@
           <w:sz w:val="22"/>
           <w:szCs w:val="22"/>
         </w:rPr>
-        <w:t xml:space="preserve">Año 1: $40,521 · Año 2 en adelante: $38,685 (MXN con IVA). </w:t>
+        <w:t xml:space="preserve">Año 1: $35,994 · Año 2 en adelante: $34,158 (MXN con IVA). </w:t>
       </w:r>
       <w:r>
         <w:rPr>
@@ -5424,7 +6908,7 @@
                 <w:sz w:val="19"/>
                 <w:szCs w:val="19"/>
               </w:rPr>
-              <w:t xml:space="preserve">ChatGPT Business (2 usuarios)</w:t>
+              <w:t xml:space="preserve">Claude Team (2 usuarios)</w:t>
             </w:r>
           </w:p>
         </w:tc>
@@ -5452,7 +6936,7 @@
                 <w:sz w:val="19"/>
                 <w:szCs w:val="19"/>
               </w:rPr>
-              <w:t xml:space="preserve">$8,160</w:t>
+              <w:t xml:space="preserve">$10,579</w:t>
             </w:r>
           </w:p>
         </w:tc>
@@ -5480,7 +6964,7 @@
                 <w:sz w:val="19"/>
                 <w:szCs w:val="19"/>
               </w:rPr>
-              <w:t xml:space="preserve">$2,160</w:t>
+              <w:t xml:space="preserve">~$2,645</w:t>
             </w:r>
           </w:p>
         </w:tc>
@@ -5496,7 +6980,7 @@
             </w:tcMar>
           </w:tcPr>
           <w:p>
-            <w:hyperlink w:history="1" r:id="rIdvonpkoqyp8mxl20az4ijh">
+            <w:hyperlink w:history="1" r:id="rIdwhx8m_gln6u5rrsxzeapa">
               <w:r>
                 <w:rPr>
                   <w:rFonts w:ascii="Arial" w:cs="Arial" w:eastAsia="Arial" w:hAnsi="Arial"/>
@@ -5505,7 +6989,7 @@
                   <w:szCs w:val="20"/>
                   <w:u w:val="single"/>
                 </w:rPr>
-                <w:t xml:space="preserve">openai.com/business</w:t>
+                <w:t xml:space="preserve">claude.com/pricing</w:t>
               </w:r>
             </w:hyperlink>
           </w:p>
@@ -5639,7 +7123,7 @@
             </w:tcMar>
           </w:tcPr>
           <w:p>
-            <w:hyperlink w:history="1" r:id="rId_6vkyogdfjxcyjvx-o0e4">
+            <w:hyperlink w:history="1" r:id="rIdlxcozq27o1o0eafwqgc10">
               <w:r>
                 <w:rPr>
                   <w:rFonts w:ascii="Arial" w:cs="Arial" w:eastAsia="Arial" w:hAnsi="Arial"/>
@@ -5710,7 +7194,7 @@
                 <w:sz w:val="19"/>
                 <w:szCs w:val="19"/>
               </w:rPr>
-              <w:t xml:space="preserve">Adobe Illustrator</w:t>
+              <w:t xml:space="preserve">Affinity by Canva</w:t>
             </w:r>
           </w:p>
         </w:tc>
@@ -5738,7 +7222,7 @@
                 <w:sz w:val="19"/>
                 <w:szCs w:val="19"/>
               </w:rPr>
-              <w:t xml:space="preserve">$6,946</w:t>
+              <w:t xml:space="preserve">$0</w:t>
             </w:r>
           </w:p>
         </w:tc>
@@ -5766,7 +7250,7 @@
                 <w:sz w:val="19"/>
                 <w:szCs w:val="19"/>
               </w:rPr>
-              <w:t xml:space="preserve">$3,480</w:t>
+              <w:t xml:space="preserve">—</w:t>
             </w:r>
           </w:p>
         </w:tc>
@@ -5782,7 +7266,7 @@
             </w:tcMar>
           </w:tcPr>
           <w:p>
-            <w:hyperlink w:history="1" r:id="rIdei1qyoo_tnm05nrunwvws">
+            <w:hyperlink w:history="1" r:id="rId2my0-wx6ipwgr33_jdkfu">
               <w:r>
                 <w:rPr>
                   <w:rFonts w:ascii="Arial" w:cs="Arial" w:eastAsia="Arial" w:hAnsi="Arial"/>
@@ -5791,7 +7275,7 @@
                   <w:szCs w:val="20"/>
                   <w:u w:val="single"/>
                 </w:rPr>
-                <w:t xml:space="preserve">adobe.com/mx</w:t>
+                <w:t xml:space="preserve">affinity.studio</w:t>
               </w:r>
             </w:hyperlink>
           </w:p>
@@ -5925,7 +7409,7 @@
             </w:tcMar>
           </w:tcPr>
           <w:p>
-            <w:hyperlink w:history="1" r:id="rIdfb5t6gfv0g7crbioajqjn">
+            <w:hyperlink w:history="1" r:id="rIdfxmm24pwnfvqc6onv0eb5">
               <w:r>
                 <w:rPr>
                   <w:rFonts w:ascii="Arial" w:cs="Arial" w:eastAsia="Arial" w:hAnsi="Arial"/>
@@ -6068,7 +7552,7 @@
             </w:tcMar>
           </w:tcPr>
           <w:p>
-            <w:hyperlink w:history="1" r:id="rIdsruona0g1foftiv6r_uxr">
+            <w:hyperlink w:history="1" r:id="rIdo6ugvtyreenoa1kwbuq8u">
               <w:r>
                 <w:rPr>
                   <w:rFonts w:ascii="Arial" w:cs="Arial" w:eastAsia="Arial" w:hAnsi="Arial"/>
@@ -6139,7 +7623,7 @@
                 <w:sz w:val="19"/>
                 <w:szCs w:val="19"/>
               </w:rPr>
-              <w:t xml:space="preserve">5 licencias</w:t>
+              <w:t xml:space="preserve">5 herramientas</w:t>
             </w:r>
           </w:p>
         </w:tc>
@@ -6167,7 +7651,7 @@
                 <w:sz w:val="19"/>
                 <w:szCs w:val="19"/>
               </w:rPr>
-              <w:t xml:space="preserve">$26,962</w:t>
+              <w:t xml:space="preserve">$22,435</w:t>
             </w:r>
           </w:p>
         </w:tc>
@@ -6195,7 +7679,7 @@
                 <w:sz w:val="19"/>
                 <w:szCs w:val="19"/>
               </w:rPr>
-              <w:t xml:space="preserve">$12,097</w:t>
+              <w:t xml:space="preserve">$9,102</w:t>
             </w:r>
           </w:p>
         </w:tc>
@@ -6242,7 +7726,7 @@
           <w:sz w:val="19"/>
           <w:szCs w:val="19"/>
         </w:rPr>
-        <w:t xml:space="preserve">Año 2 en adelante: $27,562 (CapCut renueva en $2,999). ChatGPT: la página mostró impuesto estimado $0; confirmar si se suma IVA al cobrar.</w:t>
+        <w:t xml:space="preserve">Año 2 en adelante: $23,035 (CapCut renueva en $2,999). Affinity reemplaza a Adobe Illustrator sin costo. Claude Team: 20 USD por usuario al mes en pago anual, mínimo 2 (claude.com/pricing).</w:t>
       </w:r>
     </w:p>
     <w:p>
@@ -6516,7 +8000,7 @@
                 <w:sz w:val="19"/>
                 <w:szCs w:val="19"/>
               </w:rPr>
-              <w:t xml:space="preserve">$26,962</w:t>
+              <w:t xml:space="preserve">$22,435</w:t>
             </w:r>
           </w:p>
         </w:tc>
@@ -6544,7 +8028,7 @@
                 <w:sz w:val="19"/>
                 <w:szCs w:val="19"/>
               </w:rPr>
-              <w:t xml:space="preserve">$27,562</w:t>
+              <w:t xml:space="preserve">$23,035</w:t>
             </w:r>
           </w:p>
         </w:tc>
@@ -6605,7 +8089,7 @@
                 <w:sz w:val="19"/>
                 <w:szCs w:val="19"/>
               </w:rPr>
-              <w:t xml:space="preserve">$40,521</w:t>
+              <w:t xml:space="preserve">$35,994</w:t>
             </w:r>
           </w:p>
         </w:tc>
@@ -6633,7 +8117,7 @@
                 <w:sz w:val="19"/>
                 <w:szCs w:val="19"/>
               </w:rPr>
-              <w:t xml:space="preserve">$38,685</w:t>
+              <w:t xml:space="preserve">$34,158</w:t>
             </w:r>
           </w:p>
         </w:tc>
@@ -7636,7 +9120,7 @@
           <w:sz w:val="26"/>
           <w:szCs w:val="26"/>
         </w:rPr>
-        <w:t xml:space="preserve">ChatGPT Business · $8,160/año</w:t>
+        <w:t xml:space="preserve">Claude Team · 2 usuarios · $10,579/año</w:t>
       </w:r>
     </w:p>
     <w:p>
@@ -7661,7 +9145,7 @@
           <w:sz w:val="22"/>
           <w:szCs w:val="22"/>
         </w:rPr>
-        <w:t xml:space="preserve">El sitio necesita textos para cada sala, cada tipo de evento, las preguntas frecuentes y una versión en inglés para atraer congresos y expositores de fuera. Escribir y traducir por fuera se cobra por pieza y por cada cambio. Con esta herramienta el equipo produce y actualiza los textos sin depender de un proveedor, y la información no se usa para entrenar la IA.</w:t>
+        <w:t xml:space="preserve">Redacta, traduce y automatiza los textos del sitio sin que nuestros datos se usen para entrenar la IA. Es el mismo proveedor del asistente virtual de la web, así que la información que se le carga se prepara en el mismo lugar.</w:t>
       </w:r>
     </w:p>
     <w:p>
@@ -7686,7 +9170,7 @@
           <w:sz w:val="22"/>
           <w:szCs w:val="22"/>
         </w:rPr>
-        <w:t xml:space="preserve">Textos de todas las páginas, una página por tipo de evento para aparecer en Google, preguntas frecuentes y sitio en inglés.</w:t>
+        <w:t xml:space="preserve">De la ficha de un evento salen en minutos su página, la versión en inglés, las preguntas frecuentes y la nota para el blog.</w:t>
       </w:r>
     </w:p>
     <w:p>
@@ -7728,7 +9212,7 @@
           <w:sz w:val="22"/>
           <w:szCs w:val="22"/>
         </w:rPr>
-        <w:t xml:space="preserve">Lo primero que ve un organizador es la portada del sitio. Mejora la calidad de las fotos que ya tenemos del recinto, crea la imagen y el video de portada, y trae un banco de recursos con licencia comercial. No hay que comprar fotos de stock ni pagar producción cada vez que cambia una campaña.</w:t>
+        <w:t xml:space="preserve">Mejora el contenido que ya tenemos y lo vuelve dinámico para la audiencia: sube la resolución de fotos viejas, convierte una foto fija en un video corto y crea variaciones para cada campaña.</w:t>
       </w:r>
     </w:p>
     <w:p>
@@ -7753,7 +9237,7 @@
           <w:sz w:val="22"/>
           <w:szCs w:val="22"/>
         </w:rPr>
-        <w:t xml:space="preserve">Imagen y video de portada, fotos del recinto mejoradas e imágenes para cada página de evento.</w:t>
+        <w:t xml:space="preserve">Una foto del salón vacío se vuelve un video de 5 segundos con movimiento de cámara para la portada; fotos de archivo de eventos se mejoran a alta calidad.</w:t>
       </w:r>
     </w:p>
     <w:p>
@@ -7770,7 +9254,7 @@
           <w:sz w:val="26"/>
           <w:szCs w:val="26"/>
         </w:rPr>
-        <w:t xml:space="preserve">Adobe Illustrator · $6,946/año</w:t>
+        <w:t xml:space="preserve">Affinity by Canva · $0</w:t>
       </w:r>
     </w:p>
     <w:p>
@@ -7795,7 +9279,7 @@
           <w:sz w:val="22"/>
           <w:szCs w:val="22"/>
         </w:rPr>
-        <w:t xml:space="preserve">Un organizador decide si renta una sala viendo el plano, las medidas y el acomodo. Los planos y mapas en vector se ven nítidos en cualquier pantalla y cargan rápido, lo que Google premia. Los mismos archivos sirven a la imprenta para la señalética.</w:t>
+        <w:t xml:space="preserve">Reemplaza a Adobe Illustrator: vectores, planos y archivos para imprenta, gratis con la cuenta de Canva. Ahorra $6,946 al año.</w:t>
       </w:r>
     </w:p>
     <w:p>
@@ -7820,7 +9304,7 @@
           <w:sz w:val="22"/>
           <w:szCs w:val="22"/>
         </w:rPr>
-        <w:t xml:space="preserve">Planos de cada sala, mapa del recinto, íconos del sitio y logo en formato web.</w:t>
+        <w:t xml:space="preserve">Planos de cada sala, mapa del recinto, íconos del sitio y lonas para imprenta.</w:t>
       </w:r>
     </w:p>
     <w:p>
@@ -7862,7 +9346,7 @@
           <w:sz w:val="22"/>
           <w:szCs w:val="22"/>
         </w:rPr>
-        <w:t xml:space="preserve">Cada evento necesita su banner en el sitio. Dos personas del equipo publican esos gráficos con la marca del recinto el mismo día, sin esperar a un diseñador externo. Un sitio desactualizado da imagen de recinto inactivo.</w:t>
+        <w:t xml:space="preserve">Cada evento necesita su banner con la marca del recinto en todos los tamaños. Canva lo adapta en un clic y da acceso a Affinity con la misma cuenta.</w:t>
       </w:r>
     </w:p>
     <w:p>
@@ -7887,7 +9371,7 @@
           <w:sz w:val="22"/>
           <w:szCs w:val="22"/>
         </w:rPr>
-        <w:t xml:space="preserve">Banners por evento, imágenes para compartir el sitio en redes y WhatsApp, gráficos de promociones.</w:t>
+        <w:t xml:space="preserve">El banner de un evento sale listo para la web, Instagram, historias y pantallas del recinto sin esperar a un diseñador externo.</w:t>
       </w:r>
     </w:p>
     <w:p>
@@ -7929,7 +9413,7 @@
           <w:sz w:val="22"/>
           <w:szCs w:val="22"/>
         </w:rPr>
-        <w:t xml:space="preserve">El video mantiene más tiempo al visitante en la página y explica mejor el recinto que cualquier texto. Se editan en casa los recorridos por salas y el video institucional.</w:t>
+        <w:t xml:space="preserve">Hace más eficiente la edición: subtítulos automáticos, plantillas, recortes y quitar fondo en minutos. Lo que antes tomaba horas libera tiempo para hacer más contenido.</w:t>
       </w:r>
     </w:p>
     <w:p>
@@ -7954,7 +9438,7 @@
           <w:sz w:val="22"/>
           <w:szCs w:val="22"/>
         </w:rPr>
-        <w:t xml:space="preserve">Video de portada, un recorrido por cada sala y video institucional.</w:t>
+        <w:t xml:space="preserve">El resumen en video de un evento queda listo el mismo día, para la portada del sitio y para redes, y el resto de la tarde se usa en otra pieza.</w:t>
       </w:r>
     </w:p>
     <w:p>
@@ -7995,9 +9479,10 @@
         </w:tblBorders>
       </w:tblPr>
       <w:tblGrid>
-        <w:gridCol w:w="2800"/>
-        <w:gridCol w:w="3280"/>
-        <w:gridCol w:w="3280"/>
+        <w:gridCol w:w="2700"/>
+        <w:gridCol w:w="2220"/>
+        <w:gridCol w:w="2220"/>
+        <w:gridCol w:w="2220"/>
       </w:tblGrid>
       <w:tr>
         <w:trPr>
@@ -8005,7 +9490,7 @@
         </w:trPr>
         <w:tc>
           <w:tcPr>
-            <w:tcW w:type="dxa" w:w="2800"/>
+            <w:tcW w:type="dxa" w:w="2700"/>
             <w:shd w:fill="DCE6EB" w:color="auto" w:val="clear"/>
             <w:tcMar>
               <w:top w:type="dxa" w:w="70"/>
@@ -8033,7 +9518,7 @@
         </w:tc>
         <w:tc>
           <w:tcPr>
-            <w:tcW w:type="dxa" w:w="3280"/>
+            <w:tcW w:type="dxa" w:w="2220"/>
             <w:shd w:fill="DCE6EB" w:color="auto" w:val="clear"/>
             <w:tcMar>
               <w:top w:type="dxa" w:w="70"/>
@@ -8055,13 +9540,13 @@
                 <w:sz w:val="19"/>
                 <w:szCs w:val="19"/>
               </w:rPr>
-              <w:t xml:space="preserve">ChatGPT Business (en presupuesto)</w:t>
-            </w:r>
-          </w:p>
-        </w:tc>
-        <w:tc>
-          <w:tcPr>
-            <w:tcW w:type="dxa" w:w="3280"/>
+              <w:t xml:space="preserve">Claude Team (en presupuesto)</w:t>
+            </w:r>
+          </w:p>
+        </w:tc>
+        <w:tc>
+          <w:tcPr>
+            <w:tcW w:type="dxa" w:w="2220"/>
             <w:shd w:fill="DCE6EB" w:color="auto" w:val="clear"/>
             <w:tcMar>
               <w:top w:type="dxa" w:w="70"/>
@@ -8083,7 +9568,35 @@
                 <w:sz w:val="19"/>
                 <w:szCs w:val="19"/>
               </w:rPr>
-              <w:t xml:space="preserve">Claude Team</w:t>
+              <w:t xml:space="preserve">Claude Pro (2 cuentas)</w:t>
+            </w:r>
+          </w:p>
+        </w:tc>
+        <w:tc>
+          <w:tcPr>
+            <w:tcW w:type="dxa" w:w="2220"/>
+            <w:shd w:fill="DCE6EB" w:color="auto" w:val="clear"/>
+            <w:tcMar>
+              <w:top w:type="dxa" w:w="70"/>
+              <w:left w:type="dxa" w:w="100"/>
+              <w:bottom w:type="dxa" w:w="70"/>
+              <w:right w:type="dxa" w:w="100"/>
+            </w:tcMar>
+          </w:tcPr>
+          <w:p>
+            <w:pPr>
+              <w:jc w:val="left"/>
+            </w:pPr>
+            <w:r>
+              <w:rPr>
+                <w:rFonts w:ascii="Arial" w:cs="Arial" w:eastAsia="Arial" w:hAnsi="Arial"/>
+                <w:b/>
+                <w:bCs/>
+                <w:color w:val="0E3A4E"/>
+                <w:sz w:val="19"/>
+                <w:szCs w:val="19"/>
+              </w:rPr>
+              <w:t xml:space="preserve">ChatGPT Business</w:t>
             </w:r>
           </w:p>
         </w:tc>
@@ -8094,7 +9607,7 @@
         </w:trPr>
         <w:tc>
           <w:tcPr>
-            <w:tcW w:type="dxa" w:w="2800"/>
+            <w:tcW w:type="dxa" w:w="2700"/>
             <w:shd w:fill="F6F9FA" w:color="auto" w:val="clear"/>
             <w:tcMar>
               <w:top w:type="dxa" w:w="70"/>
@@ -8122,57 +9635,85 @@
         </w:tc>
         <w:tc>
           <w:tcPr>
-            <w:tcW w:type="dxa" w:w="3280"/>
-            <w:shd w:fill="F6F9FA" w:color="auto" w:val="clear"/>
-            <w:tcMar>
-              <w:top w:type="dxa" w:w="70"/>
-              <w:left w:type="dxa" w:w="100"/>
-              <w:bottom w:type="dxa" w:w="70"/>
-              <w:right w:type="dxa" w:w="100"/>
-            </w:tcMar>
-          </w:tcPr>
-          <w:p>
-            <w:pPr>
-              <w:jc w:val="left"/>
-            </w:pPr>
-            <w:r>
-              <w:rPr>
-                <w:rFonts w:ascii="Arial" w:cs="Arial" w:eastAsia="Arial" w:hAnsi="Arial"/>
-                <w:b w:val="false"/>
-                <w:bCs w:val="false"/>
-                <w:color w:val="0E3A4E"/>
-                <w:sz w:val="19"/>
-                <w:szCs w:val="19"/>
-              </w:rPr>
-              <w:t xml:space="preserve">$8,160 (precio México)</w:t>
-            </w:r>
-          </w:p>
-        </w:tc>
-        <w:tc>
-          <w:tcPr>
-            <w:tcW w:type="dxa" w:w="3280"/>
-            <w:shd w:fill="F6F9FA" w:color="auto" w:val="clear"/>
-            <w:tcMar>
-              <w:top w:type="dxa" w:w="70"/>
-              <w:left w:type="dxa" w:w="100"/>
-              <w:bottom w:type="dxa" w:w="70"/>
-              <w:right w:type="dxa" w:w="100"/>
-            </w:tcMar>
-          </w:tcPr>
-          <w:p>
-            <w:pPr>
-              <w:jc w:val="left"/>
-            </w:pPr>
-            <w:r>
-              <w:rPr>
-                <w:rFonts w:ascii="Arial" w:cs="Arial" w:eastAsia="Arial" w:hAnsi="Arial"/>
-                <w:b w:val="false"/>
-                <w:bCs w:val="false"/>
-                <w:color w:val="0E3A4E"/>
-                <w:sz w:val="19"/>
-                <w:szCs w:val="19"/>
-              </w:rPr>
-              <w:t xml:space="preserve">~$10,579 (en dólares)</w:t>
+            <w:tcW w:type="dxa" w:w="2220"/>
+            <w:shd w:fill="F6F9FA" w:color="auto" w:val="clear"/>
+            <w:tcMar>
+              <w:top w:type="dxa" w:w="70"/>
+              <w:left w:type="dxa" w:w="100"/>
+              <w:bottom w:type="dxa" w:w="70"/>
+              <w:right w:type="dxa" w:w="100"/>
+            </w:tcMar>
+          </w:tcPr>
+          <w:p>
+            <w:pPr>
+              <w:jc w:val="left"/>
+            </w:pPr>
+            <w:r>
+              <w:rPr>
+                <w:rFonts w:ascii="Arial" w:cs="Arial" w:eastAsia="Arial" w:hAnsi="Arial"/>
+                <w:b w:val="false"/>
+                <w:bCs w:val="false"/>
+                <w:color w:val="0E3A4E"/>
+                <w:sz w:val="19"/>
+                <w:szCs w:val="19"/>
+              </w:rPr>
+              <w:t xml:space="preserve">$10,579</w:t>
+            </w:r>
+          </w:p>
+        </w:tc>
+        <w:tc>
+          <w:tcPr>
+            <w:tcW w:type="dxa" w:w="2220"/>
+            <w:shd w:fill="F6F9FA" w:color="auto" w:val="clear"/>
+            <w:tcMar>
+              <w:top w:type="dxa" w:w="70"/>
+              <w:left w:type="dxa" w:w="100"/>
+              <w:bottom w:type="dxa" w:w="70"/>
+              <w:right w:type="dxa" w:w="100"/>
+            </w:tcMar>
+          </w:tcPr>
+          <w:p>
+            <w:pPr>
+              <w:jc w:val="left"/>
+            </w:pPr>
+            <w:r>
+              <w:rPr>
+                <w:rFonts w:ascii="Arial" w:cs="Arial" w:eastAsia="Arial" w:hAnsi="Arial"/>
+                <w:b w:val="false"/>
+                <w:bCs w:val="false"/>
+                <w:color w:val="0E3A4E"/>
+                <w:sz w:val="19"/>
+                <w:szCs w:val="19"/>
+              </w:rPr>
+              <w:t xml:space="preserve">$8,816</w:t>
+            </w:r>
+          </w:p>
+        </w:tc>
+        <w:tc>
+          <w:tcPr>
+            <w:tcW w:type="dxa" w:w="2220"/>
+            <w:shd w:fill="F6F9FA" w:color="auto" w:val="clear"/>
+            <w:tcMar>
+              <w:top w:type="dxa" w:w="70"/>
+              <w:left w:type="dxa" w:w="100"/>
+              <w:bottom w:type="dxa" w:w="70"/>
+              <w:right w:type="dxa" w:w="100"/>
+            </w:tcMar>
+          </w:tcPr>
+          <w:p>
+            <w:pPr>
+              <w:jc w:val="left"/>
+            </w:pPr>
+            <w:r>
+              <w:rPr>
+                <w:rFonts w:ascii="Arial" w:cs="Arial" w:eastAsia="Arial" w:hAnsi="Arial"/>
+                <w:b w:val="false"/>
+                <w:bCs w:val="false"/>
+                <w:color w:val="0E3A4E"/>
+                <w:sz w:val="19"/>
+                <w:szCs w:val="19"/>
+              </w:rPr>
+              <w:t xml:space="preserve">$8,160</w:t>
             </w:r>
           </w:p>
         </w:tc>
@@ -8183,7 +9724,7 @@
         </w:trPr>
         <w:tc>
           <w:tcPr>
-            <w:tcW w:type="dxa" w:w="2800"/>
+            <w:tcW w:type="dxa" w:w="2700"/>
             <w:shd w:fill="FFFFFF" w:color="auto" w:val="clear"/>
             <w:tcMar>
               <w:top w:type="dxa" w:w="70"/>
@@ -8211,7 +9752,7 @@
         </w:tc>
         <w:tc>
           <w:tcPr>
-            <w:tcW w:type="dxa" w:w="3280"/>
+            <w:tcW w:type="dxa" w:w="2220"/>
             <w:shd w:fill="FFFFFF" w:color="auto" w:val="clear"/>
             <w:tcMar>
               <w:top w:type="dxa" w:w="70"/>
@@ -8233,13 +9774,13 @@
                 <w:sz w:val="19"/>
                 <w:szCs w:val="19"/>
               </w:rPr>
-              <w:t xml:space="preserve">No, por defecto; datos cifrados</w:t>
-            </w:r>
-          </w:p>
-        </w:tc>
-        <w:tc>
-          <w:tcPr>
-            <w:tcW w:type="dxa" w:w="3280"/>
+              <w:t xml:space="preserve">No, nunca (plan de empresa)</w:t>
+            </w:r>
+          </w:p>
+        </w:tc>
+        <w:tc>
+          <w:tcPr>
+            <w:tcW w:type="dxa" w:w="2220"/>
             <w:shd w:fill="FFFFFF" w:color="auto" w:val="clear"/>
             <w:tcMar>
               <w:top w:type="dxa" w:w="70"/>
@@ -8261,7 +9802,35 @@
                 <w:sz w:val="19"/>
                 <w:szCs w:val="19"/>
               </w:rPr>
-              <w:t xml:space="preserve">No, por defecto (plan comercial)</w:t>
+              <w:t xml:space="preserve">Solo si no se apaga en ajustes</w:t>
+            </w:r>
+          </w:p>
+        </w:tc>
+        <w:tc>
+          <w:tcPr>
+            <w:tcW w:type="dxa" w:w="2220"/>
+            <w:shd w:fill="FFFFFF" w:color="auto" w:val="clear"/>
+            <w:tcMar>
+              <w:top w:type="dxa" w:w="70"/>
+              <w:left w:type="dxa" w:w="100"/>
+              <w:bottom w:type="dxa" w:w="70"/>
+              <w:right w:type="dxa" w:w="100"/>
+            </w:tcMar>
+          </w:tcPr>
+          <w:p>
+            <w:pPr>
+              <w:jc w:val="left"/>
+            </w:pPr>
+            <w:r>
+              <w:rPr>
+                <w:rFonts w:ascii="Arial" w:cs="Arial" w:eastAsia="Arial" w:hAnsi="Arial"/>
+                <w:b w:val="false"/>
+                <w:bCs w:val="false"/>
+                <w:color w:val="0E3A4E"/>
+                <w:sz w:val="19"/>
+                <w:szCs w:val="19"/>
+              </w:rPr>
+              <w:t xml:space="preserve">No (plan de empresa)</w:t>
             </w:r>
           </w:p>
         </w:tc>
@@ -8272,85 +9841,113 @@
         </w:trPr>
         <w:tc>
           <w:tcPr>
-            <w:tcW w:type="dxa" w:w="2800"/>
-            <w:shd w:fill="F6F9FA" w:color="auto" w:val="clear"/>
-            <w:tcMar>
-              <w:top w:type="dxa" w:w="70"/>
-              <w:left w:type="dxa" w:w="100"/>
-              <w:bottom w:type="dxa" w:w="70"/>
-              <w:right w:type="dxa" w:w="100"/>
-            </w:tcMar>
-          </w:tcPr>
-          <w:p>
-            <w:pPr>
-              <w:jc w:val="left"/>
-            </w:pPr>
-            <w:r>
-              <w:rPr>
-                <w:rFonts w:ascii="Arial" w:cs="Arial" w:eastAsia="Arial" w:hAnsi="Arial"/>
-                <w:b w:val="false"/>
-                <w:bCs w:val="false"/>
-                <w:color w:val="0E3A4E"/>
-                <w:sz w:val="19"/>
-                <w:szCs w:val="19"/>
-              </w:rPr>
-              <w:t xml:space="preserve">Generar imágenes</w:t>
-            </w:r>
-          </w:p>
-        </w:tc>
-        <w:tc>
-          <w:tcPr>
-            <w:tcW w:type="dxa" w:w="3280"/>
-            <w:shd w:fill="F6F9FA" w:color="auto" w:val="clear"/>
-            <w:tcMar>
-              <w:top w:type="dxa" w:w="70"/>
-              <w:left w:type="dxa" w:w="100"/>
-              <w:bottom w:type="dxa" w:w="70"/>
-              <w:right w:type="dxa" w:w="100"/>
-            </w:tcMar>
-          </w:tcPr>
-          <w:p>
-            <w:pPr>
-              <w:jc w:val="left"/>
-            </w:pPr>
-            <w:r>
-              <w:rPr>
-                <w:rFonts w:ascii="Arial" w:cs="Arial" w:eastAsia="Arial" w:hAnsi="Arial"/>
-                <w:b w:val="false"/>
-                <w:bCs w:val="false"/>
-                <w:color w:val="0E3A4E"/>
-                <w:sz w:val="19"/>
-                <w:szCs w:val="19"/>
-              </w:rPr>
-              <w:t xml:space="preserve">Sí, en el mismo chat</w:t>
-            </w:r>
-          </w:p>
-        </w:tc>
-        <w:tc>
-          <w:tcPr>
-            <w:tcW w:type="dxa" w:w="3280"/>
-            <w:shd w:fill="F6F9FA" w:color="auto" w:val="clear"/>
-            <w:tcMar>
-              <w:top w:type="dxa" w:w="70"/>
-              <w:left w:type="dxa" w:w="100"/>
-              <w:bottom w:type="dxa" w:w="70"/>
-              <w:right w:type="dxa" w:w="100"/>
-            </w:tcMar>
-          </w:tcPr>
-          <w:p>
-            <w:pPr>
-              <w:jc w:val="left"/>
-            </w:pPr>
-            <w:r>
-              <w:rPr>
-                <w:rFonts w:ascii="Arial" w:cs="Arial" w:eastAsia="Arial" w:hAnsi="Arial"/>
-                <w:b w:val="false"/>
-                <w:bCs w:val="false"/>
-                <w:color w:val="0E3A4E"/>
-                <w:sz w:val="19"/>
-                <w:szCs w:val="19"/>
-              </w:rPr>
-              <w:t xml:space="preserve">No</w:t>
+            <w:tcW w:type="dxa" w:w="2700"/>
+            <w:shd w:fill="F6F9FA" w:color="auto" w:val="clear"/>
+            <w:tcMar>
+              <w:top w:type="dxa" w:w="70"/>
+              <w:left w:type="dxa" w:w="100"/>
+              <w:bottom w:type="dxa" w:w="70"/>
+              <w:right w:type="dxa" w:w="100"/>
+            </w:tcMar>
+          </w:tcPr>
+          <w:p>
+            <w:pPr>
+              <w:jc w:val="left"/>
+            </w:pPr>
+            <w:r>
+              <w:rPr>
+                <w:rFonts w:ascii="Arial" w:cs="Arial" w:eastAsia="Arial" w:hAnsi="Arial"/>
+                <w:b w:val="false"/>
+                <w:bCs w:val="false"/>
+                <w:color w:val="0E3A4E"/>
+                <w:sz w:val="19"/>
+                <w:szCs w:val="19"/>
+              </w:rPr>
+              <w:t xml:space="preserve">Administración central</w:t>
+            </w:r>
+          </w:p>
+        </w:tc>
+        <w:tc>
+          <w:tcPr>
+            <w:tcW w:type="dxa" w:w="2220"/>
+            <w:shd w:fill="F6F9FA" w:color="auto" w:val="clear"/>
+            <w:tcMar>
+              <w:top w:type="dxa" w:w="70"/>
+              <w:left w:type="dxa" w:w="100"/>
+              <w:bottom w:type="dxa" w:w="70"/>
+              <w:right w:type="dxa" w:w="100"/>
+            </w:tcMar>
+          </w:tcPr>
+          <w:p>
+            <w:pPr>
+              <w:jc w:val="left"/>
+            </w:pPr>
+            <w:r>
+              <w:rPr>
+                <w:rFonts w:ascii="Arial" w:cs="Arial" w:eastAsia="Arial" w:hAnsi="Arial"/>
+                <w:b w:val="false"/>
+                <w:bCs w:val="false"/>
+                <w:color w:val="0E3A4E"/>
+                <w:sz w:val="19"/>
+                <w:szCs w:val="19"/>
+              </w:rPr>
+              <w:t xml:space="preserve">Sí: cuentas, facturas y proyectos compartidos</w:t>
+            </w:r>
+          </w:p>
+        </w:tc>
+        <w:tc>
+          <w:tcPr>
+            <w:tcW w:type="dxa" w:w="2220"/>
+            <w:shd w:fill="F6F9FA" w:color="auto" w:val="clear"/>
+            <w:tcMar>
+              <w:top w:type="dxa" w:w="70"/>
+              <w:left w:type="dxa" w:w="100"/>
+              <w:bottom w:type="dxa" w:w="70"/>
+              <w:right w:type="dxa" w:w="100"/>
+            </w:tcMar>
+          </w:tcPr>
+          <w:p>
+            <w:pPr>
+              <w:jc w:val="left"/>
+            </w:pPr>
+            <w:r>
+              <w:rPr>
+                <w:rFonts w:ascii="Arial" w:cs="Arial" w:eastAsia="Arial" w:hAnsi="Arial"/>
+                <w:b w:val="false"/>
+                <w:bCs w:val="false"/>
+                <w:color w:val="0E3A4E"/>
+                <w:sz w:val="19"/>
+                <w:szCs w:val="19"/>
+              </w:rPr>
+              <w:t xml:space="preserve">No: dos cuentas sueltas</w:t>
+            </w:r>
+          </w:p>
+        </w:tc>
+        <w:tc>
+          <w:tcPr>
+            <w:tcW w:type="dxa" w:w="2220"/>
+            <w:shd w:fill="F6F9FA" w:color="auto" w:val="clear"/>
+            <w:tcMar>
+              <w:top w:type="dxa" w:w="70"/>
+              <w:left w:type="dxa" w:w="100"/>
+              <w:bottom w:type="dxa" w:w="70"/>
+              <w:right w:type="dxa" w:w="100"/>
+            </w:tcMar>
+          </w:tcPr>
+          <w:p>
+            <w:pPr>
+              <w:jc w:val="left"/>
+            </w:pPr>
+            <w:r>
+              <w:rPr>
+                <w:rFonts w:ascii="Arial" w:cs="Arial" w:eastAsia="Arial" w:hAnsi="Arial"/>
+                <w:b w:val="false"/>
+                <w:bCs w:val="false"/>
+                <w:color w:val="0E3A4E"/>
+                <w:sz w:val="19"/>
+                <w:szCs w:val="19"/>
+              </w:rPr>
+              <w:t xml:space="preserve">Sí</w:t>
             </w:r>
           </w:p>
         </w:tc>
@@ -8361,7 +9958,7 @@
         </w:trPr>
         <w:tc>
           <w:tcPr>
-            <w:tcW w:type="dxa" w:w="2800"/>
+            <w:tcW w:type="dxa" w:w="2700"/>
             <w:shd w:fill="FFFFFF" w:color="auto" w:val="clear"/>
             <w:tcMar>
               <w:top w:type="dxa" w:w="70"/>
@@ -8383,13 +9980,13 @@
                 <w:sz w:val="19"/>
                 <w:szCs w:val="19"/>
               </w:rPr>
-              <w:t xml:space="preserve">Textos del sitio en español e inglés</w:t>
-            </w:r>
-          </w:p>
-        </w:tc>
-        <w:tc>
-          <w:tcPr>
-            <w:tcW w:type="dxa" w:w="3280"/>
+              <w:t xml:space="preserve">Mismo proveedor que el asistente de la web</w:t>
+            </w:r>
+          </w:p>
+        </w:tc>
+        <w:tc>
+          <w:tcPr>
+            <w:tcW w:type="dxa" w:w="2220"/>
             <w:shd w:fill="FFFFFF" w:color="auto" w:val="clear"/>
             <w:tcMar>
               <w:top w:type="dxa" w:w="70"/>
@@ -8417,7 +10014,7 @@
         </w:tc>
         <w:tc>
           <w:tcPr>
-            <w:tcW w:type="dxa" w:w="3280"/>
+            <w:tcW w:type="dxa" w:w="2220"/>
             <w:shd w:fill="FFFFFF" w:color="auto" w:val="clear"/>
             <w:tcMar>
               <w:top w:type="dxa" w:w="70"/>
@@ -8443,92 +10040,31 @@
             </w:r>
           </w:p>
         </w:tc>
-      </w:tr>
-      <w:tr>
-        <w:trPr>
-          <w:tblHeader w:val="false"/>
-        </w:trPr>
-        <w:tc>
-          <w:tcPr>
-            <w:tcW w:type="dxa" w:w="2800"/>
-            <w:shd w:fill="F6F9FA" w:color="auto" w:val="clear"/>
-            <w:tcMar>
-              <w:top w:type="dxa" w:w="70"/>
-              <w:left w:type="dxa" w:w="100"/>
-              <w:bottom w:type="dxa" w:w="70"/>
-              <w:right w:type="dxa" w:w="100"/>
-            </w:tcMar>
-          </w:tcPr>
-          <w:p>
-            <w:pPr>
-              <w:jc w:val="left"/>
-            </w:pPr>
-            <w:r>
-              <w:rPr>
-                <w:rFonts w:ascii="Arial" w:cs="Arial" w:eastAsia="Arial" w:hAnsi="Arial"/>
-                <w:b w:val="false"/>
-                <w:bCs w:val="false"/>
-                <w:color w:val="0E3A4E"/>
-                <w:sz w:val="19"/>
-                <w:szCs w:val="19"/>
-              </w:rPr>
-              <w:t xml:space="preserve">Planes personales</w:t>
-            </w:r>
-          </w:p>
-        </w:tc>
-        <w:tc>
-          <w:tcPr>
-            <w:tcW w:type="dxa" w:w="3280"/>
-            <w:shd w:fill="F6F9FA" w:color="auto" w:val="clear"/>
-            <w:tcMar>
-              <w:top w:type="dxa" w:w="70"/>
-              <w:left w:type="dxa" w:w="100"/>
-              <w:bottom w:type="dxa" w:w="70"/>
-              <w:right w:type="dxa" w:w="100"/>
-            </w:tcMar>
-          </w:tcPr>
-          <w:p>
-            <w:pPr>
-              <w:jc w:val="left"/>
-            </w:pPr>
-            <w:r>
-              <w:rPr>
-                <w:rFonts w:ascii="Arial" w:cs="Arial" w:eastAsia="Arial" w:hAnsi="Arial"/>
-                <w:b w:val="false"/>
-                <w:bCs w:val="false"/>
-                <w:color w:val="0E3A4E"/>
-                <w:sz w:val="19"/>
-                <w:szCs w:val="19"/>
-              </w:rPr>
-              <w:t xml:space="preserve">Plus entrena con tus chats salvo que lo apagues</w:t>
-            </w:r>
-          </w:p>
-        </w:tc>
-        <w:tc>
-          <w:tcPr>
-            <w:tcW w:type="dxa" w:w="3280"/>
-            <w:shd w:fill="F6F9FA" w:color="auto" w:val="clear"/>
-            <w:tcMar>
-              <w:top w:type="dxa" w:w="70"/>
-              <w:left w:type="dxa" w:w="100"/>
-              <w:bottom w:type="dxa" w:w="70"/>
-              <w:right w:type="dxa" w:w="100"/>
-            </w:tcMar>
-          </w:tcPr>
-          <w:p>
-            <w:pPr>
-              <w:jc w:val="left"/>
-            </w:pPr>
-            <w:r>
-              <w:rPr>
-                <w:rFonts w:ascii="Arial" w:cs="Arial" w:eastAsia="Arial" w:hAnsi="Arial"/>
-                <w:b w:val="false"/>
-                <w:bCs w:val="false"/>
-                <w:color w:val="0E3A4E"/>
-                <w:sz w:val="19"/>
-                <w:szCs w:val="19"/>
-              </w:rPr>
-              <w:t xml:space="preserve">Pro entrena salvo que lo apagues; guarda hasta 5 años</w:t>
+        <w:tc>
+          <w:tcPr>
+            <w:tcW w:type="dxa" w:w="2220"/>
+            <w:shd w:fill="FFFFFF" w:color="auto" w:val="clear"/>
+            <w:tcMar>
+              <w:top w:type="dxa" w:w="70"/>
+              <w:left w:type="dxa" w:w="100"/>
+              <w:bottom w:type="dxa" w:w="70"/>
+              <w:right w:type="dxa" w:w="100"/>
+            </w:tcMar>
+          </w:tcPr>
+          <w:p>
+            <w:pPr>
+              <w:jc w:val="left"/>
+            </w:pPr>
+            <w:r>
+              <w:rPr>
+                <w:rFonts w:ascii="Arial" w:cs="Arial" w:eastAsia="Arial" w:hAnsi="Arial"/>
+                <w:b w:val="false"/>
+                <w:bCs w:val="false"/>
+                <w:color w:val="0E3A4E"/>
+                <w:sz w:val="19"/>
+                <w:szCs w:val="19"/>
+              </w:rPr>
+              <w:t xml:space="preserve">No</w:t>
             </w:r>
           </w:p>
         </w:tc>
@@ -8547,7 +10083,7 @@
           <w:sz w:val="22"/>
           <w:szCs w:val="22"/>
         </w:rPr>
-        <w:t xml:space="preserve">¿Cuál es privado? </w:t>
+        <w:t xml:space="preserve">Por qué Claude Team: </w:t>
       </w:r>
       <w:r>
         <w:rPr>
@@ -8556,7 +10092,7 @@
           <w:sz w:val="22"/>
           <w:szCs w:val="22"/>
         </w:rPr>
-        <w:t xml:space="preserve">Los dos, en su plan de empresa; ninguno en su plan personal. ChatGPT Business sale más barato en México y además hace imágenes.</w:t>
+        <w:t xml:space="preserve">cuesta $1,763 más que dos cuentas Pro, pero garantiza que la información del recinto no entrena la IA y se administra desde un solo lugar. Si hay que recortar, Claude Pro sirve igual apagando el entrenamiento en cada cuenta.</w:t>
       </w:r>
     </w:p>
     <w:p>
@@ -9340,7 +10876,7 @@
         </w:numPr>
         <w:spacing w:after="60"/>
       </w:pPr>
-      <w:hyperlink w:history="1" r:id="rIdb-oxf9sppezv8bhb_hvxh">
+      <w:hyperlink w:history="1" r:id="rIdrpq_wfmk1pse4ciko9q_h">
         <w:r>
           <w:rPr>
             <w:rFonts w:ascii="Arial" w:cs="Arial" w:eastAsia="Arial" w:hAnsi="Arial"/>
@@ -9349,7 +10885,7 @@
             <w:szCs w:val="20"/>
             <w:u w:val="single"/>
           </w:rPr>
-          <w:t xml:space="preserve">ChatGPT Business</w:t>
+          <w:t xml:space="preserve">Claude Team</w:t>
         </w:r>
       </w:hyperlink>
     </w:p>
@@ -9362,7 +10898,7 @@
         </w:numPr>
         <w:spacing w:after="60"/>
       </w:pPr>
-      <w:hyperlink w:history="1" r:id="rId-qlck5ufktbz6drhiw1dm">
+      <w:hyperlink w:history="1" r:id="rIdvywhv3fnnuxxovvqkcdli">
         <w:r>
           <w:rPr>
             <w:rFonts w:ascii="Arial" w:cs="Arial" w:eastAsia="Arial" w:hAnsi="Arial"/>
@@ -9384,7 +10920,7 @@
         </w:numPr>
         <w:spacing w:after="60"/>
       </w:pPr>
-      <w:hyperlink w:history="1" r:id="rIdueoqxurvzjnikqr8-uw7i">
+      <w:hyperlink w:history="1" r:id="rIdzwbj7snv37-jslardt8-c">
         <w:r>
           <w:rPr>
             <w:rFonts w:ascii="Arial" w:cs="Arial" w:eastAsia="Arial" w:hAnsi="Arial"/>
@@ -9393,7 +10929,7 @@
             <w:szCs w:val="20"/>
             <w:u w:val="single"/>
           </w:rPr>
-          <w:t xml:space="preserve">Adobe Illustrator</w:t>
+          <w:t xml:space="preserve">Affinity by Canva (gratis)</w:t>
         </w:r>
       </w:hyperlink>
     </w:p>
@@ -9406,7 +10942,7 @@
         </w:numPr>
         <w:spacing w:after="60"/>
       </w:pPr>
-      <w:hyperlink w:history="1" r:id="rIdpb3rpeum4ticpeewmr2at">
+      <w:hyperlink w:history="1" r:id="rIdmypr70eecsskcdkh5naxr">
         <w:r>
           <w:rPr>
             <w:rFonts w:ascii="Arial" w:cs="Arial" w:eastAsia="Arial" w:hAnsi="Arial"/>
@@ -9428,7 +10964,7 @@
         </w:numPr>
         <w:spacing w:after="60"/>
       </w:pPr>
-      <w:hyperlink w:history="1" r:id="rIdcuavdspxhh_1ci9df0crc">
+      <w:hyperlink w:history="1" r:id="rId0by3xycntpha43wxw6eof">
         <w:r>
           <w:rPr>
             <w:rFonts w:ascii="Arial" w:cs="Arial" w:eastAsia="Arial" w:hAnsi="Arial"/>
@@ -9450,7 +10986,7 @@
         </w:numPr>
         <w:spacing w:after="60"/>
       </w:pPr>
-      <w:hyperlink w:history="1" r:id="rIdl53gdzgcudbahmkpt_oa4">
+      <w:hyperlink w:history="1" r:id="rIdbraqqjbmgiec7q9z098kx">
         <w:r>
           <w:rPr>
             <w:rFonts w:ascii="Arial" w:cs="Arial" w:eastAsia="Arial" w:hAnsi="Arial"/>
@@ -9472,7 +11008,7 @@
         </w:numPr>
         <w:spacing w:after="60"/>
       </w:pPr>
-      <w:hyperlink w:history="1" r:id="rIdmlx8p-cstyefoamreljdg">
+      <w:hyperlink w:history="1" r:id="rIdnc_amsgd8zgn-bahnx0qo">
         <w:r>
           <w:rPr>
             <w:rFonts w:ascii="Arial" w:cs="Arial" w:eastAsia="Arial" w:hAnsi="Arial"/>
@@ -9494,7 +11030,7 @@
         </w:numPr>
         <w:spacing w:after="60"/>
       </w:pPr>
-      <w:hyperlink w:history="1" r:id="rIddmy8bv8odl2hw30a8587l">
+      <w:hyperlink w:history="1" r:id="rIdmqlobcctjkmqy-un-u9m4">
         <w:r>
           <w:rPr>
             <w:rFonts w:ascii="Arial" w:cs="Arial" w:eastAsia="Arial" w:hAnsi="Arial"/>
@@ -9516,7 +11052,7 @@
         </w:numPr>
         <w:spacing w:after="60"/>
       </w:pPr>
-      <w:hyperlink w:history="1" r:id="rId2tnkmnsfaulgy1rifofxu">
+      <w:hyperlink w:history="1" r:id="rIdc4hxcrqrnzktskoq__qeq">
         <w:r>
           <w:rPr>
             <w:rFonts w:ascii="Arial" w:cs="Arial" w:eastAsia="Arial" w:hAnsi="Arial"/>
@@ -9584,7 +11120,7 @@
           <w:sz w:val="22"/>
           <w:szCs w:val="22"/>
         </w:rPr>
-        <w:t xml:space="preserve">CapCut, Canva, ChatGPT, Magnific y X: precios mostrados en sus páginas de México.</w:t>
+        <w:t xml:space="preserve">CapCut, Canva, Magnific y X: precios mostrados en sus páginas de México.</w:t>
       </w:r>
     </w:p>
     <w:p>
@@ -9603,7 +11139,7 @@
           <w:sz w:val="22"/>
           <w:szCs w:val="22"/>
         </w:rPr>
-        <w:t xml:space="preserve">ManyChat, Metricool e Illustrator: precio en dólares convertido a $19.00 por dólar + 16% de IVA (Illustrator: 5,988 pesos + IVA).</w:t>
+        <w:t xml:space="preserve">Claude, ManyChat y Metricool: precio en dólares convertido a $19.00 por dólar + 16% de IVA.</w:t>
       </w:r>
     </w:p>
     <w:p>

</xml_diff>